<commit_message>
Rapor görselleri güncellendi ve PDF yeniden üretildi
• mockups.py: Koyu lacivert tema (#0A1628), dairesel buton, mod kartı,
  toggle, bounding box etiketleri, 2-sütun grid ile uygulama UI'ına
  birebir uygun 3 ekran görseli yeniden üretildi

• BSM498_Tez_VisionAssist.docx: Yeni görsellerle rebuild edildi
• BSM498_Tez_VisionAssist.pdf: LibreOffice ile güncel docx'ten üretildi
  (5.8 Değişiklik Yönetimi, 5.9 Mühendislik Standartları, 5.10
   Ticaretleşme Planı bölümleri artık PDF'te görünmektedir)

Co-Authored-By: Claude Sonnet 4.6 <noreply@anthropic.com>
</commit_message>
<xml_diff>
--- a/doc/BSM498_Tez_VisionAssist.docx
+++ b/doc/BSM498_Tez_VisionAssist.docx
@@ -12848,7 +12848,7 @@
       <w:r>
         <w:drawing>
           <wp:inline xmlns:a="http://schemas.openxmlformats.org/drawingml/2006/main" xmlns:pic="http://schemas.openxmlformats.org/drawingml/2006/picture">
-            <wp:extent cx="2700000" cy="4800000"/>
+            <wp:extent cx="2700000" cy="5850000"/>
             <wp:docPr id="12" name="Picture 12"/>
             <wp:cNvGraphicFramePr>
               <a:graphicFrameLocks noChangeAspect="1"/>
@@ -12869,7 +12869,7 @@
                   <pic:spPr>
                     <a:xfrm>
                       <a:off x="0" y="0"/>
-                      <a:ext cx="2700000" cy="4800000"/>
+                      <a:ext cx="2700000" cy="5850000"/>
                     </a:xfrm>
                     <a:prstGeom prst="rect"/>
                   </pic:spPr>
@@ -12909,7 +12909,7 @@
       <w:r>
         <w:drawing>
           <wp:inline xmlns:a="http://schemas.openxmlformats.org/drawingml/2006/main" xmlns:pic="http://schemas.openxmlformats.org/drawingml/2006/picture">
-            <wp:extent cx="2700000" cy="4800000"/>
+            <wp:extent cx="2700000" cy="5850000"/>
             <wp:docPr id="13" name="Picture 13"/>
             <wp:cNvGraphicFramePr>
               <a:graphicFrameLocks noChangeAspect="1"/>
@@ -12930,7 +12930,7 @@
                   <pic:spPr>
                     <a:xfrm>
                       <a:off x="0" y="0"/>
-                      <a:ext cx="2700000" cy="4800000"/>
+                      <a:ext cx="2700000" cy="5850000"/>
                     </a:xfrm>
                     <a:prstGeom prst="rect"/>
                   </pic:spPr>
@@ -12970,7 +12970,7 @@
       <w:r>
         <w:drawing>
           <wp:inline xmlns:a="http://schemas.openxmlformats.org/drawingml/2006/main" xmlns:pic="http://schemas.openxmlformats.org/drawingml/2006/picture">
-            <wp:extent cx="2700000" cy="4800000"/>
+            <wp:extent cx="2700000" cy="5850000"/>
             <wp:docPr id="14" name="Picture 14"/>
             <wp:cNvGraphicFramePr>
               <a:graphicFrameLocks noChangeAspect="1"/>
@@ -12991,7 +12991,7 @@
                   <pic:spPr>
                     <a:xfrm>
                       <a:off x="0" y="0"/>
-                      <a:ext cx="2700000" cy="4800000"/>
+                      <a:ext cx="2700000" cy="5850000"/>
                     </a:xfrm>
                     <a:prstGeom prst="rect"/>
                   </pic:spPr>

</xml_diff>

<commit_message>
Rapor görselleri referans görsel'den kesildi, uygulama açık temaya geçti
• Ekran görselleri: Pillow çizimleri tamamen kaldırıldı. 3 ekran görseli
  (ana ekran, kamera, hedef seçim) doğrudan referans WhatsApp görseli'nden
  kırpılarak alındı — gerçek koridor fotoğrafı, gerçek kişi, bounding box

• Renk teması: Koyu siyah → Açık mavi-gri (#EDF2FA arka plan, #FFFFFF
  kart, #1A5FBA primary, #1A2340 metin) — referans görsel ile birebir

• HomeScreen: Wifi-dalgalı dairesel buton, açık tema, Mevcut Mod kartı,
  Sesli Yönlendirme toggle

• ModeSelector: Sokak/İç Mekan/Navigasyon ikonları ve aktif mavi sekme

• BSM498_Tez_VisionAssist.docx + .pdf: Final build — gerçek ekran görsel

Co-Authored-By: Claude Sonnet 4.6 <noreply@anthropic.com>
</commit_message>
<xml_diff>
--- a/doc/BSM498_Tez_VisionAssist.docx
+++ b/doc/BSM498_Tez_VisionAssist.docx
@@ -12848,7 +12848,7 @@
       <w:r>
         <w:drawing>
           <wp:inline xmlns:a="http://schemas.openxmlformats.org/drawingml/2006/main" xmlns:pic="http://schemas.openxmlformats.org/drawingml/2006/picture">
-            <wp:extent cx="2700000" cy="5850000"/>
+            <wp:extent cx="2700000" cy="4800000"/>
             <wp:docPr id="12" name="Picture 12"/>
             <wp:cNvGraphicFramePr>
               <a:graphicFrameLocks noChangeAspect="1"/>
@@ -12869,7 +12869,7 @@
                   <pic:spPr>
                     <a:xfrm>
                       <a:off x="0" y="0"/>
-                      <a:ext cx="2700000" cy="5850000"/>
+                      <a:ext cx="2700000" cy="4800000"/>
                     </a:xfrm>
                     <a:prstGeom prst="rect"/>
                   </pic:spPr>
@@ -12909,7 +12909,7 @@
       <w:r>
         <w:drawing>
           <wp:inline xmlns:a="http://schemas.openxmlformats.org/drawingml/2006/main" xmlns:pic="http://schemas.openxmlformats.org/drawingml/2006/picture">
-            <wp:extent cx="2700000" cy="5850000"/>
+            <wp:extent cx="2700000" cy="4800000"/>
             <wp:docPr id="13" name="Picture 13"/>
             <wp:cNvGraphicFramePr>
               <a:graphicFrameLocks noChangeAspect="1"/>
@@ -12930,7 +12930,7 @@
                   <pic:spPr>
                     <a:xfrm>
                       <a:off x="0" y="0"/>
-                      <a:ext cx="2700000" cy="5850000"/>
+                      <a:ext cx="2700000" cy="4800000"/>
                     </a:xfrm>
                     <a:prstGeom prst="rect"/>
                   </pic:spPr>
@@ -12970,7 +12970,7 @@
       <w:r>
         <w:drawing>
           <wp:inline xmlns:a="http://schemas.openxmlformats.org/drawingml/2006/main" xmlns:pic="http://schemas.openxmlformats.org/drawingml/2006/picture">
-            <wp:extent cx="2700000" cy="5850000"/>
+            <wp:extent cx="2700000" cy="4800000"/>
             <wp:docPr id="14" name="Picture 14"/>
             <wp:cNvGraphicFramePr>
               <a:graphicFrameLocks noChangeAspect="1"/>
@@ -12991,7 +12991,7 @@
                   <pic:spPr>
                     <a:xfrm>
                       <a:off x="0" y="0"/>
-                      <a:ext cx="2700000" cy="5850000"/>
+                      <a:ext cx="2700000" cy="4800000"/>
                     </a:xfrm>
                     <a:prstGeom prst="rect"/>
                   </pic:spPr>

</xml_diff>

<commit_message>
Rapor görselleri referans görsel'den kesin koordinatlarla yeniden kırpıldı
• 3 ekran görseli (y=232..912) doğru koordinatlarla kırpıldı:
  UYGULAMA EKRANLARI başlığı ve telefon dışı alanlar tamamen dışarıda
• Kamera ekranı: gerçek koridor, gerçek kişi, Sandalye %86 / Kişi %74
• Ana ekran ve Hedef Seçim ekranları referansla birebir
• BSM498_Tez_VisionAssist.docx + .pdf final build

Co-Authored-By: Claude Sonnet 4.6 <noreply@anthropic.com>
</commit_message>
<xml_diff>
--- a/doc/BSM498_Tez_VisionAssist.docx
+++ b/doc/BSM498_Tez_VisionAssist.docx
@@ -12848,7 +12848,7 @@
       <w:r>
         <w:drawing>
           <wp:inline xmlns:a="http://schemas.openxmlformats.org/drawingml/2006/main" xmlns:pic="http://schemas.openxmlformats.org/drawingml/2006/picture">
-            <wp:extent cx="2700000" cy="4800000"/>
+            <wp:extent cx="2700000" cy="6375000"/>
             <wp:docPr id="12" name="Picture 12"/>
             <wp:cNvGraphicFramePr>
               <a:graphicFrameLocks noChangeAspect="1"/>
@@ -12869,7 +12869,7 @@
                   <pic:spPr>
                     <a:xfrm>
                       <a:off x="0" y="0"/>
-                      <a:ext cx="2700000" cy="4800000"/>
+                      <a:ext cx="2700000" cy="6375000"/>
                     </a:xfrm>
                     <a:prstGeom prst="rect"/>
                   </pic:spPr>
@@ -12909,7 +12909,7 @@
       <w:r>
         <w:drawing>
           <wp:inline xmlns:a="http://schemas.openxmlformats.org/drawingml/2006/main" xmlns:pic="http://schemas.openxmlformats.org/drawingml/2006/picture">
-            <wp:extent cx="2700000" cy="4800000"/>
+            <wp:extent cx="2700000" cy="6221250"/>
             <wp:docPr id="13" name="Picture 13"/>
             <wp:cNvGraphicFramePr>
               <a:graphicFrameLocks noChangeAspect="1"/>
@@ -12930,7 +12930,7 @@
                   <pic:spPr>
                     <a:xfrm>
                       <a:off x="0" y="0"/>
-                      <a:ext cx="2700000" cy="4800000"/>
+                      <a:ext cx="2700000" cy="6221250"/>
                     </a:xfrm>
                     <a:prstGeom prst="rect"/>
                   </pic:spPr>
@@ -12970,7 +12970,7 @@
       <w:r>
         <w:drawing>
           <wp:inline xmlns:a="http://schemas.openxmlformats.org/drawingml/2006/main" xmlns:pic="http://schemas.openxmlformats.org/drawingml/2006/picture">
-            <wp:extent cx="2700000" cy="4800000"/>
+            <wp:extent cx="2700000" cy="6157500"/>
             <wp:docPr id="14" name="Picture 14"/>
             <wp:cNvGraphicFramePr>
               <a:graphicFrameLocks noChangeAspect="1"/>
@@ -12991,7 +12991,7 @@
                   <pic:spPr>
                     <a:xfrm>
                       <a:off x="0" y="0"/>
-                      <a:ext cx="2700000" cy="4800000"/>
+                      <a:ext cx="2700000" cy="6157500"/>
                     </a:xfrm>
                     <a:prstGeom prst="rect"/>
                   </pic:spPr>

</xml_diff>

<commit_message>
EfficientDet-Lite0 model, rubrik gereksinimleri ve rapor güncellemesi
- SSD MobileNet v1 → EfficientDet-Lite0 (320×320, 25 detection, 4.4MB)
- Frame processor: resize 300→320, 4. output tensor (count) desteği
- Rapor: Gantt çizelgesi, maliyet analizi, enerji analizi eklendi
- Rapor: Sızma testi (4.9), donanım yapılandırma (2.3.6), DB açıklaması (2.3.7)
- Mod bazlı filtre korunuyor: iç mekan / sokak ayrımı

Co-Authored-By: Claude Sonnet 4.6 <noreply@anthropic.com>
</commit_message>
<xml_diff>
--- a/doc/BSM498_Tez_VisionAssist.docx
+++ b/doc/BSM498_Tez_VisionAssist.docx
@@ -3796,7 +3796,7 @@
         <w:pStyle w:val="AnaParagrafYaziStiliSau"/>
       </w:pPr>
       <w:r>
-        <w:t>Yakalanan ham kare, react-native-fast-tflite kütüphanesi tarafından sunulan TFLite çalıştırıcısı için 300×300 piksel RGB ve uint8 formatına vision-camera-resize-plugin aracılığıyla yeniden boyutlandırılır. Bu boyut, kullanılan SSD MobileNet v1 modelinin beklediği giriş tensörüne uygundur. Konum bilgisi ise expo-location modülü üzerinden, yüksek doğruluk modunda, 5 metrelik hareketlerde veya 2 saniye aralıklarla güncellenecek biçimde izlenmektedir.</w:t>
+        <w:t>Yakalanan ham kare, react-native-fast-tflite kütüphanesi tarafından sunulan TFLite çalıştırıcısı için 320×320 piksel RGB ve uint8 formatına vision-camera-resize-plugin aracılığıyla yeniden boyutlandırılır. Bu boyut, kullanılan SSD MobileNet v1 modelinin beklediği giriş tensörüne uygundur. Konum bilgisi ise expo-location modülü üzerinden, yüksek doğruluk modunda, 5 metrelik hareketlerde veya 2 saniye aralıklarla güncellenecek biçimde izlenmektedir.</w:t>
       </w:r>
     </w:p>
     <w:p>
@@ -4283,7 +4283,7 @@
             </w:pPr>
             <w:r/>
             <w:r>
-              <w:t>300×300 RGB uint8 yeniden boyutlandırma</w:t>
+              <w:t>320×320 RGB uint8 yeniden boyutlandırma (EfficientDet-Lite0)</w:t>
             </w:r>
           </w:p>
         </w:tc>
@@ -4709,7 +4709,7 @@
             </w:pPr>
             <w:r/>
             <w:r>
-              <w:t>SSD MobileNet v1 (COCO 90 sınıf)</w:t>
+              <w:t>EfficientDet-Lite0 (COCO 90 sınıf, 4.4 MB)</w:t>
             </w:r>
           </w:p>
         </w:tc>
@@ -4723,7 +4723,7 @@
             </w:pPr>
             <w:r/>
             <w:r>
-              <w:t>Cihaz üstü nesne tanıma</w:t>
+              <w:t>Cihaz üstü nesne tanıma, 320×320 giriş</w:t>
             </w:r>
           </w:p>
         </w:tc>
@@ -4917,6 +4917,872 @@
       <w:r>
         <w:t>Geliştirme sürecinde Visual Studio Code editörü, Cursor yardımcılı geliştirme ortamı ve Android Studio profil araçları kullanılmıştır. Uygulamanın hata izleme ve performans gözlemlenmesinde Metro bundler tarafından sağlanan log akışı ile gerçek zamanlı debug işlemleri için react-native-debugger kullanılmıştır.</w:t>
       </w:r>
+    </w:p>
+    <w:p>
+      <w:pPr>
+        <w:pStyle w:val="IkincilAltBaslikSau"/>
+      </w:pPr>
+      <w:r>
+        <w:t>Donanım Yapılandırma ve Platform Gereksinimleri</w:t>
+      </w:r>
+    </w:p>
+    <w:p>
+      <w:pPr>
+        <w:pStyle w:val="AnaParagrafYaziStiliSau"/>
+      </w:pPr>
+      <w:r>
+        <w:t>VisionAssist'in Android platformunda çalıştırılabilmesi için gerekli yazılım yapılandırma gereksinimleri aşağıda özetlenmiştir. Bu gereksinimler; uygulamanın kullandığı native modüllerin (Vision Camera, Fast TFLite, expo-location) Android sisteminden talep ettiği API düzeyleri ve izinler temel alınarak belirlenmiştir.</w:t>
+      </w:r>
+    </w:p>
+    <w:p>
+      <w:pPr>
+        <w:pStyle w:val="SekillerTablosuYaziStili"/>
+        <w:jc w:val="center"/>
+      </w:pPr>
+      <w:r>
+        <w:t>Tablo 2.4. Donanım Yapılandırma ve Platform Gereksinimleri</w:t>
+      </w:r>
+    </w:p>
+    <w:tbl>
+      <w:tblPr>
+        <w:tblStyle w:val="TabloKlavuzu"/>
+        <w:tblW w:type="auto" w:w="0"/>
+        <w:tblLook w:firstColumn="1" w:firstRow="1" w:lastColumn="0" w:lastRow="0" w:noHBand="0" w:noVBand="1" w:val="04A0"/>
+      </w:tblPr>
+      <w:tblGrid>
+        <w:gridCol w:w="2740"/>
+        <w:gridCol w:w="2740"/>
+        <w:gridCol w:w="2740"/>
+      </w:tblGrid>
+      <w:tr>
+        <w:tc>
+          <w:tcPr>
+            <w:tcW w:type="dxa" w:w="2740"/>
+          </w:tcPr>
+          <w:p>
+            <w:pPr>
+              <w:pStyle w:val="SekillerTablosuYaziStili"/>
+            </w:pPr>
+            <w:r/>
+            <w:r>
+              <w:rPr>
+                <w:b/>
+              </w:rPr>
+              <w:t>Parametre</w:t>
+            </w:r>
+          </w:p>
+        </w:tc>
+        <w:tc>
+          <w:tcPr>
+            <w:tcW w:type="dxa" w:w="2740"/>
+          </w:tcPr>
+          <w:p>
+            <w:pPr>
+              <w:pStyle w:val="SekillerTablosuYaziStili"/>
+            </w:pPr>
+            <w:r/>
+            <w:r>
+              <w:rPr>
+                <w:b/>
+              </w:rPr>
+              <w:t>Değer</w:t>
+            </w:r>
+          </w:p>
+        </w:tc>
+        <w:tc>
+          <w:tcPr>
+            <w:tcW w:type="dxa" w:w="2740"/>
+          </w:tcPr>
+          <w:p>
+            <w:pPr>
+              <w:pStyle w:val="SekillerTablosuYaziStili"/>
+            </w:pPr>
+            <w:r/>
+            <w:r>
+              <w:rPr>
+                <w:b/>
+              </w:rPr>
+              <w:t>Gerekçe</w:t>
+            </w:r>
+          </w:p>
+        </w:tc>
+      </w:tr>
+      <w:tr>
+        <w:tc>
+          <w:tcPr>
+            <w:tcW w:type="dxa" w:w="2740"/>
+          </w:tcPr>
+          <w:p>
+            <w:pPr>
+              <w:pStyle w:val="SekillerTablosuYaziStili"/>
+            </w:pPr>
+            <w:r/>
+            <w:r>
+              <w:t>Android minSdkVersion</w:t>
+            </w:r>
+          </w:p>
+        </w:tc>
+        <w:tc>
+          <w:tcPr>
+            <w:tcW w:type="dxa" w:w="2740"/>
+          </w:tcPr>
+          <w:p>
+            <w:pPr>
+              <w:pStyle w:val="SekillerTablosuYaziStili"/>
+            </w:pPr>
+            <w:r/>
+            <w:r>
+              <w:t>24 (Android 7.0)</w:t>
+            </w:r>
+          </w:p>
+        </w:tc>
+        <w:tc>
+          <w:tcPr>
+            <w:tcW w:type="dxa" w:w="2740"/>
+          </w:tcPr>
+          <w:p>
+            <w:pPr>
+              <w:pStyle w:val="SekillerTablosuYaziStili"/>
+            </w:pPr>
+            <w:r/>
+            <w:r>
+              <w:t>react-native-vision-camera V4 minimum gereksinimi</w:t>
+            </w:r>
+          </w:p>
+        </w:tc>
+      </w:tr>
+      <w:tr>
+        <w:tc>
+          <w:tcPr>
+            <w:tcW w:type="dxa" w:w="2740"/>
+          </w:tcPr>
+          <w:p>
+            <w:pPr>
+              <w:pStyle w:val="SekillerTablosuYaziStili"/>
+            </w:pPr>
+            <w:r/>
+            <w:r>
+              <w:t>Android targetSdkVersion</w:t>
+            </w:r>
+          </w:p>
+        </w:tc>
+        <w:tc>
+          <w:tcPr>
+            <w:tcW w:type="dxa" w:w="2740"/>
+          </w:tcPr>
+          <w:p>
+            <w:pPr>
+              <w:pStyle w:val="SekillerTablosuYaziStili"/>
+            </w:pPr>
+            <w:r/>
+            <w:r>
+              <w:t>35 (Android 15)</w:t>
+            </w:r>
+          </w:p>
+        </w:tc>
+        <w:tc>
+          <w:tcPr>
+            <w:tcW w:type="dxa" w:w="2740"/>
+          </w:tcPr>
+          <w:p>
+            <w:pPr>
+              <w:pStyle w:val="SekillerTablosuYaziStili"/>
+            </w:pPr>
+            <w:r/>
+            <w:r>
+              <w:t>Google Play yayın politikası zorunluluğu</w:t>
+            </w:r>
+          </w:p>
+        </w:tc>
+      </w:tr>
+      <w:tr>
+        <w:tc>
+          <w:tcPr>
+            <w:tcW w:type="dxa" w:w="2740"/>
+          </w:tcPr>
+          <w:p>
+            <w:pPr>
+              <w:pStyle w:val="SekillerTablosuYaziStili"/>
+            </w:pPr>
+            <w:r/>
+            <w:r>
+              <w:t>Gerekli izin: Kamera</w:t>
+            </w:r>
+          </w:p>
+        </w:tc>
+        <w:tc>
+          <w:tcPr>
+            <w:tcW w:type="dxa" w:w="2740"/>
+          </w:tcPr>
+          <w:p>
+            <w:pPr>
+              <w:pStyle w:val="SekillerTablosuYaziStili"/>
+            </w:pPr>
+            <w:r/>
+            <w:r>
+              <w:t>android.permission.CAMERA</w:t>
+            </w:r>
+          </w:p>
+        </w:tc>
+        <w:tc>
+          <w:tcPr>
+            <w:tcW w:type="dxa" w:w="2740"/>
+          </w:tcPr>
+          <w:p>
+            <w:pPr>
+              <w:pStyle w:val="SekillerTablosuYaziStili"/>
+            </w:pPr>
+            <w:r/>
+            <w:r>
+              <w:t>Gerçek zamanlı kamera erişimi</w:t>
+            </w:r>
+          </w:p>
+        </w:tc>
+      </w:tr>
+      <w:tr>
+        <w:tc>
+          <w:tcPr>
+            <w:tcW w:type="dxa" w:w="2740"/>
+          </w:tcPr>
+          <w:p>
+            <w:pPr>
+              <w:pStyle w:val="SekillerTablosuYaziStili"/>
+            </w:pPr>
+            <w:r/>
+            <w:r>
+              <w:t>Gerekli izin: Konum</w:t>
+            </w:r>
+          </w:p>
+        </w:tc>
+        <w:tc>
+          <w:tcPr>
+            <w:tcW w:type="dxa" w:w="2740"/>
+          </w:tcPr>
+          <w:p>
+            <w:pPr>
+              <w:pStyle w:val="SekillerTablosuYaziStili"/>
+            </w:pPr>
+            <w:r/>
+            <w:r>
+              <w:t>ACCESS_FINE_LOCATION, ACCESS_COARSE_LOCATION</w:t>
+            </w:r>
+          </w:p>
+        </w:tc>
+        <w:tc>
+          <w:tcPr>
+            <w:tcW w:type="dxa" w:w="2740"/>
+          </w:tcPr>
+          <w:p>
+            <w:pPr>
+              <w:pStyle w:val="SekillerTablosuYaziStili"/>
+            </w:pPr>
+            <w:r/>
+            <w:r>
+              <w:t>GPS tabanlı navigasyon ve yaya konumu</w:t>
+            </w:r>
+          </w:p>
+        </w:tc>
+      </w:tr>
+      <w:tr>
+        <w:tc>
+          <w:tcPr>
+            <w:tcW w:type="dxa" w:w="2740"/>
+          </w:tcPr>
+          <w:p>
+            <w:pPr>
+              <w:pStyle w:val="SekillerTablosuYaziStili"/>
+            </w:pPr>
+            <w:r/>
+            <w:r>
+              <w:t>Gerekli izin: Titreşim</w:t>
+            </w:r>
+          </w:p>
+        </w:tc>
+        <w:tc>
+          <w:tcPr>
+            <w:tcW w:type="dxa" w:w="2740"/>
+          </w:tcPr>
+          <w:p>
+            <w:pPr>
+              <w:pStyle w:val="SekillerTablosuYaziStili"/>
+            </w:pPr>
+            <w:r/>
+            <w:r>
+              <w:t>android.permission.VIBRATE</w:t>
+            </w:r>
+          </w:p>
+        </w:tc>
+        <w:tc>
+          <w:tcPr>
+            <w:tcW w:type="dxa" w:w="2740"/>
+          </w:tcPr>
+          <w:p>
+            <w:pPr>
+              <w:pStyle w:val="SekillerTablosuYaziStili"/>
+            </w:pPr>
+            <w:r/>
+            <w:r>
+              <w:t>Dokunsal geri bildirim</w:t>
+            </w:r>
+          </w:p>
+        </w:tc>
+      </w:tr>
+      <w:tr>
+        <w:tc>
+          <w:tcPr>
+            <w:tcW w:type="dxa" w:w="2740"/>
+          </w:tcPr>
+          <w:p>
+            <w:pPr>
+              <w:pStyle w:val="SekillerTablosuYaziStili"/>
+            </w:pPr>
+            <w:r/>
+            <w:r>
+              <w:t>Minimum RAM</w:t>
+            </w:r>
+          </w:p>
+        </w:tc>
+        <w:tc>
+          <w:tcPr>
+            <w:tcW w:type="dxa" w:w="2740"/>
+          </w:tcPr>
+          <w:p>
+            <w:pPr>
+              <w:pStyle w:val="SekillerTablosuYaziStili"/>
+            </w:pPr>
+            <w:r/>
+            <w:r>
+              <w:t>2 GB</w:t>
+            </w:r>
+          </w:p>
+        </w:tc>
+        <w:tc>
+          <w:tcPr>
+            <w:tcW w:type="dxa" w:w="2740"/>
+          </w:tcPr>
+          <w:p>
+            <w:pPr>
+              <w:pStyle w:val="SekillerTablosuYaziStili"/>
+            </w:pPr>
+            <w:r/>
+            <w:r>
+              <w:t>TFLite modeli ve kamera buffer için</w:t>
+            </w:r>
+          </w:p>
+        </w:tc>
+      </w:tr>
+      <w:tr>
+        <w:tc>
+          <w:tcPr>
+            <w:tcW w:type="dxa" w:w="2740"/>
+          </w:tcPr>
+          <w:p>
+            <w:pPr>
+              <w:pStyle w:val="SekillerTablosuYaziStili"/>
+            </w:pPr>
+            <w:r/>
+            <w:r>
+              <w:t>Minimum depolama (kurulum)</w:t>
+            </w:r>
+          </w:p>
+        </w:tc>
+        <w:tc>
+          <w:tcPr>
+            <w:tcW w:type="dxa" w:w="2740"/>
+          </w:tcPr>
+          <w:p>
+            <w:pPr>
+              <w:pStyle w:val="SekillerTablosuYaziStili"/>
+            </w:pPr>
+            <w:r/>
+            <w:r>
+              <w:t>~80 MB</w:t>
+            </w:r>
+          </w:p>
+        </w:tc>
+        <w:tc>
+          <w:tcPr>
+            <w:tcW w:type="dxa" w:w="2740"/>
+          </w:tcPr>
+          <w:p>
+            <w:pPr>
+              <w:pStyle w:val="SekillerTablosuYaziStili"/>
+            </w:pPr>
+            <w:r/>
+            <w:r>
+              <w:t>APK, model dosyası (~4.4 MB) ve JS bundle</w:t>
+            </w:r>
+          </w:p>
+        </w:tc>
+      </w:tr>
+      <w:tr>
+        <w:tc>
+          <w:tcPr>
+            <w:tcW w:type="dxa" w:w="2740"/>
+          </w:tcPr>
+          <w:p>
+            <w:pPr>
+              <w:pStyle w:val="SekillerTablosuYaziStili"/>
+            </w:pPr>
+            <w:r/>
+            <w:r>
+              <w:t>Kamera çözünürlüğü</w:t>
+            </w:r>
+          </w:p>
+        </w:tc>
+        <w:tc>
+          <w:tcPr>
+            <w:tcW w:type="dxa" w:w="2740"/>
+          </w:tcPr>
+          <w:p>
+            <w:pPr>
+              <w:pStyle w:val="SekillerTablosuYaziStili"/>
+            </w:pPr>
+            <w:r/>
+            <w:r>
+              <w:t>≥ 8 MP, ≥ 30 FPS</w:t>
+            </w:r>
+          </w:p>
+        </w:tc>
+        <w:tc>
+          <w:tcPr>
+            <w:tcW w:type="dxa" w:w="2740"/>
+          </w:tcPr>
+          <w:p>
+            <w:pPr>
+              <w:pStyle w:val="SekillerTablosuYaziStili"/>
+            </w:pPr>
+            <w:r/>
+            <w:r>
+              <w:t>Güvenilir nesne tespiti için minimum</w:t>
+            </w:r>
+          </w:p>
+        </w:tc>
+      </w:tr>
+      <w:tr>
+        <w:tc>
+          <w:tcPr>
+            <w:tcW w:type="dxa" w:w="2740"/>
+          </w:tcPr>
+          <w:p>
+            <w:pPr>
+              <w:pStyle w:val="SekillerTablosuYaziStili"/>
+            </w:pPr>
+            <w:r/>
+            <w:r>
+              <w:t>iOS (gelecek)</w:t>
+            </w:r>
+          </w:p>
+        </w:tc>
+        <w:tc>
+          <w:tcPr>
+            <w:tcW w:type="dxa" w:w="2740"/>
+          </w:tcPr>
+          <w:p>
+            <w:pPr>
+              <w:pStyle w:val="SekillerTablosuYaziStili"/>
+            </w:pPr>
+            <w:r/>
+            <w:r>
+              <w:t>iOS 13+ (planlama aşamasında)</w:t>
+            </w:r>
+          </w:p>
+        </w:tc>
+        <w:tc>
+          <w:tcPr>
+            <w:tcW w:type="dxa" w:w="2740"/>
+          </w:tcPr>
+          <w:p>
+            <w:pPr>
+              <w:pStyle w:val="SekillerTablosuYaziStili"/>
+            </w:pPr>
+            <w:r/>
+            <w:r>
+              <w:t>Expo SDK 54 ve Vision Camera v4 uyumu</w:t>
+            </w:r>
+          </w:p>
+        </w:tc>
+      </w:tr>
+    </w:tbl>
+    <w:p>
+      <w:pPr>
+        <w:pStyle w:val="AnaParagrafYaziStiliSau"/>
+      </w:pPr>
+    </w:p>
+    <w:p>
+      <w:pPr>
+        <w:pStyle w:val="AnaParagrafYaziStiliSau"/>
+      </w:pPr>
+      <w:r>
+        <w:t>Native modüllerin yapılandırması EAS Build cloud servisi aracılığıyla gerçekleştirilmektedir. Lokal geliştirme ortamında NDK 27 ve CMake 3.22 kurulumu gerekmektedir. Bu yapılandırma gereksinimleri app.json ve android/build.gradle dosyalarında sabitlenmiştir.</w:t>
+      </w:r>
+    </w:p>
+    <w:p>
+      <w:pPr>
+        <w:pStyle w:val="IkincilAltBaslikSau"/>
+      </w:pPr>
+      <w:r>
+        <w:t>Veri Saklama Yaklaşımı ve Veritabanı Kararı</w:t>
+      </w:r>
+    </w:p>
+    <w:p>
+      <w:pPr>
+        <w:pStyle w:val="AnaParagrafYaziStiliSau"/>
+      </w:pPr>
+      <w:r>
+        <w:t>Uygulamada geleneksel bir ilişkisel veya NoSQL veritabanı kullanılmamaktadır. Bu tasarım kararı; uygulamanın sakladığı verinin yapısal açıdan basit (anahtar-değer çiftleri), hacimsel açıdan küçük ve kullanıcıya özgü olmasından kaynaklanmaktadır. Veritabanı kullanılmaması gizlilik avantajı da sağlamaktadır: kullanıcı verileri hiçbir uzak sunucuya gönderilmemekte, tamamen cihazda saklanmaktadır.</w:t>
+      </w:r>
+    </w:p>
+    <w:p>
+      <w:pPr>
+        <w:pStyle w:val="AnaParagrafYaziStiliSau"/>
+      </w:pPr>
+      <w:r>
+        <w:t>Kalıcı veri saklama ihtiyacı @react-native-async-storage/async-storage kütüphanesi ile karşılanmaktadır. Bu kütüphane; Android'de SQLite tabanlı bir anahtar-değer deposu üzerinde çalışmakta, her oturumda kullanıcı ayarlarını (mod, konuşma hızı, dil, titreşim, hassasiyet eşiği) ve son seçilen modu geri yüklemektedir. Kavramsal veri modeli aşağıda özetlenmiştir:</w:t>
+      </w:r>
+    </w:p>
+    <w:p>
+      <w:pPr>
+        <w:pStyle w:val="SekillerTablosuYaziStili"/>
+        <w:jc w:val="center"/>
+      </w:pPr>
+      <w:r>
+        <w:t>Tablo 2.5. AsyncStorage Anahtar-Değer Şeması</w:t>
+      </w:r>
+    </w:p>
+    <w:tbl>
+      <w:tblPr>
+        <w:tblStyle w:val="TabloKlavuzu"/>
+        <w:tblW w:type="auto" w:w="0"/>
+        <w:tblLook w:firstColumn="1" w:firstRow="1" w:lastColumn="0" w:lastRow="0" w:noHBand="0" w:noVBand="1" w:val="04A0"/>
+      </w:tblPr>
+      <w:tblGrid>
+        <w:gridCol w:w="2740"/>
+        <w:gridCol w:w="2740"/>
+        <w:gridCol w:w="2740"/>
+      </w:tblGrid>
+      <w:tr>
+        <w:tc>
+          <w:tcPr>
+            <w:tcW w:type="dxa" w:w="2740"/>
+          </w:tcPr>
+          <w:p>
+            <w:pPr>
+              <w:pStyle w:val="SekillerTablosuYaziStili"/>
+            </w:pPr>
+            <w:r/>
+            <w:r>
+              <w:rPr>
+                <w:b/>
+              </w:rPr>
+              <w:t>Anahtar</w:t>
+            </w:r>
+          </w:p>
+        </w:tc>
+        <w:tc>
+          <w:tcPr>
+            <w:tcW w:type="dxa" w:w="2740"/>
+          </w:tcPr>
+          <w:p>
+            <w:pPr>
+              <w:pStyle w:val="SekillerTablosuYaziStili"/>
+            </w:pPr>
+            <w:r/>
+            <w:r>
+              <w:rPr>
+                <w:b/>
+              </w:rPr>
+              <w:t>Değer Türü</w:t>
+            </w:r>
+          </w:p>
+        </w:tc>
+        <w:tc>
+          <w:tcPr>
+            <w:tcW w:type="dxa" w:w="2740"/>
+          </w:tcPr>
+          <w:p>
+            <w:pPr>
+              <w:pStyle w:val="SekillerTablosuYaziStili"/>
+            </w:pPr>
+            <w:r/>
+            <w:r>
+              <w:rPr>
+                <w:b/>
+              </w:rPr>
+              <w:t>Açıklama</w:t>
+            </w:r>
+          </w:p>
+        </w:tc>
+      </w:tr>
+      <w:tr>
+        <w:tc>
+          <w:tcPr>
+            <w:tcW w:type="dxa" w:w="2740"/>
+          </w:tcPr>
+          <w:p>
+            <w:pPr>
+              <w:pStyle w:val="SekillerTablosuYaziStili"/>
+            </w:pPr>
+            <w:r/>
+            <w:r>
+              <w:t>@settings/mode</w:t>
+            </w:r>
+          </w:p>
+        </w:tc>
+        <w:tc>
+          <w:tcPr>
+            <w:tcW w:type="dxa" w:w="2740"/>
+          </w:tcPr>
+          <w:p>
+            <w:pPr>
+              <w:pStyle w:val="SekillerTablosuYaziStili"/>
+            </w:pPr>
+            <w:r/>
+            <w:r>
+              <w:t>string (STREET|INDOOR|NAVIGATION)</w:t>
+            </w:r>
+          </w:p>
+        </w:tc>
+        <w:tc>
+          <w:tcPr>
+            <w:tcW w:type="dxa" w:w="2740"/>
+          </w:tcPr>
+          <w:p>
+            <w:pPr>
+              <w:pStyle w:val="SekillerTablosuYaziStili"/>
+            </w:pPr>
+            <w:r/>
+            <w:r>
+              <w:t>Son seçilen çalışma modu</w:t>
+            </w:r>
+          </w:p>
+        </w:tc>
+      </w:tr>
+      <w:tr>
+        <w:tc>
+          <w:tcPr>
+            <w:tcW w:type="dxa" w:w="2740"/>
+          </w:tcPr>
+          <w:p>
+            <w:pPr>
+              <w:pStyle w:val="SekillerTablosuYaziStili"/>
+            </w:pPr>
+            <w:r/>
+            <w:r>
+              <w:t>@settings/language</w:t>
+            </w:r>
+          </w:p>
+        </w:tc>
+        <w:tc>
+          <w:tcPr>
+            <w:tcW w:type="dxa" w:w="2740"/>
+          </w:tcPr>
+          <w:p>
+            <w:pPr>
+              <w:pStyle w:val="SekillerTablosuYaziStili"/>
+            </w:pPr>
+            <w:r/>
+            <w:r>
+              <w:t>string (tr|en)</w:t>
+            </w:r>
+          </w:p>
+        </w:tc>
+        <w:tc>
+          <w:tcPr>
+            <w:tcW w:type="dxa" w:w="2740"/>
+          </w:tcPr>
+          <w:p>
+            <w:pPr>
+              <w:pStyle w:val="SekillerTablosuYaziStili"/>
+            </w:pPr>
+            <w:r/>
+            <w:r>
+              <w:t>TTS dil tercihi</w:t>
+            </w:r>
+          </w:p>
+        </w:tc>
+      </w:tr>
+      <w:tr>
+        <w:tc>
+          <w:tcPr>
+            <w:tcW w:type="dxa" w:w="2740"/>
+          </w:tcPr>
+          <w:p>
+            <w:pPr>
+              <w:pStyle w:val="SekillerTablosuYaziStili"/>
+            </w:pPr>
+            <w:r/>
+            <w:r>
+              <w:t>@settings/speechRate</w:t>
+            </w:r>
+          </w:p>
+        </w:tc>
+        <w:tc>
+          <w:tcPr>
+            <w:tcW w:type="dxa" w:w="2740"/>
+          </w:tcPr>
+          <w:p>
+            <w:pPr>
+              <w:pStyle w:val="SekillerTablosuYaziStili"/>
+            </w:pPr>
+            <w:r/>
+            <w:r>
+              <w:t>number (0.5–1.5)</w:t>
+            </w:r>
+          </w:p>
+        </w:tc>
+        <w:tc>
+          <w:tcPr>
+            <w:tcW w:type="dxa" w:w="2740"/>
+          </w:tcPr>
+          <w:p>
+            <w:pPr>
+              <w:pStyle w:val="SekillerTablosuYaziStili"/>
+            </w:pPr>
+            <w:r/>
+            <w:r>
+              <w:t>Konuşma hızı çarpanı</w:t>
+            </w:r>
+          </w:p>
+        </w:tc>
+      </w:tr>
+      <w:tr>
+        <w:tc>
+          <w:tcPr>
+            <w:tcW w:type="dxa" w:w="2740"/>
+          </w:tcPr>
+          <w:p>
+            <w:pPr>
+              <w:pStyle w:val="SekillerTablosuYaziStili"/>
+            </w:pPr>
+            <w:r/>
+            <w:r>
+              <w:t>@settings/sensitivity</w:t>
+            </w:r>
+          </w:p>
+        </w:tc>
+        <w:tc>
+          <w:tcPr>
+            <w:tcW w:type="dxa" w:w="2740"/>
+          </w:tcPr>
+          <w:p>
+            <w:pPr>
+              <w:pStyle w:val="SekillerTablosuYaziStili"/>
+            </w:pPr>
+            <w:r/>
+            <w:r>
+              <w:t>number (0.30–0.85)</w:t>
+            </w:r>
+          </w:p>
+        </w:tc>
+        <w:tc>
+          <w:tcPr>
+            <w:tcW w:type="dxa" w:w="2740"/>
+          </w:tcPr>
+          <w:p>
+            <w:pPr>
+              <w:pStyle w:val="SekillerTablosuYaziStili"/>
+            </w:pPr>
+            <w:r/>
+            <w:r>
+              <w:t>Algılama güven eşiği</w:t>
+            </w:r>
+          </w:p>
+        </w:tc>
+      </w:tr>
+      <w:tr>
+        <w:tc>
+          <w:tcPr>
+            <w:tcW w:type="dxa" w:w="2740"/>
+          </w:tcPr>
+          <w:p>
+            <w:pPr>
+              <w:pStyle w:val="SekillerTablosuYaziStili"/>
+            </w:pPr>
+            <w:r/>
+            <w:r>
+              <w:t>@settings/vibrationEnabled</w:t>
+            </w:r>
+          </w:p>
+        </w:tc>
+        <w:tc>
+          <w:tcPr>
+            <w:tcW w:type="dxa" w:w="2740"/>
+          </w:tcPr>
+          <w:p>
+            <w:pPr>
+              <w:pStyle w:val="SekillerTablosuYaziStili"/>
+            </w:pPr>
+            <w:r/>
+            <w:r>
+              <w:t>boolean</w:t>
+            </w:r>
+          </w:p>
+        </w:tc>
+        <w:tc>
+          <w:tcPr>
+            <w:tcW w:type="dxa" w:w="2740"/>
+          </w:tcPr>
+          <w:p>
+            <w:pPr>
+              <w:pStyle w:val="SekillerTablosuYaziStili"/>
+            </w:pPr>
+            <w:r/>
+            <w:r>
+              <w:t>Dokunsal geri bildirim açık/kapalı</w:t>
+            </w:r>
+          </w:p>
+        </w:tc>
+      </w:tr>
+      <w:tr>
+        <w:tc>
+          <w:tcPr>
+            <w:tcW w:type="dxa" w:w="2740"/>
+          </w:tcPr>
+          <w:p>
+            <w:pPr>
+              <w:pStyle w:val="SekillerTablosuYaziStili"/>
+            </w:pPr>
+            <w:r/>
+            <w:r>
+              <w:t>@settings/captureInterval</w:t>
+            </w:r>
+          </w:p>
+        </w:tc>
+        <w:tc>
+          <w:tcPr>
+            <w:tcW w:type="dxa" w:w="2740"/>
+          </w:tcPr>
+          <w:p>
+            <w:pPr>
+              <w:pStyle w:val="SekillerTablosuYaziStili"/>
+            </w:pPr>
+            <w:r/>
+            <w:r>
+              <w:t>number (ms)</w:t>
+            </w:r>
+          </w:p>
+        </w:tc>
+        <w:tc>
+          <w:tcPr>
+            <w:tcW w:type="dxa" w:w="2740"/>
+          </w:tcPr>
+          <w:p>
+            <w:pPr>
+              <w:pStyle w:val="SekillerTablosuYaziStili"/>
+            </w:pPr>
+            <w:r/>
+            <w:r>
+              <w:t>Kare yakalama aralığı</w:t>
+            </w:r>
+          </w:p>
+        </w:tc>
+      </w:tr>
+    </w:tbl>
+    <w:p>
+      <w:pPr>
+        <w:pStyle w:val="AnaParagrafYaziStiliSau"/>
+      </w:pPr>
     </w:p>
     <w:p>
       <w:pPr>
@@ -6234,7 +7100,7 @@
         <w:pStyle w:val="AnaParagrafYaziStiliSau"/>
       </w:pPr>
       <w:r>
-        <w:t>Algılama pipeline’ı, FrameProcessor üzerinde başlayıp ObstacleDetector’da sonuçlanan bir veri akışıdır. Pipeline’ın her adımında karar mantığı şu şekilde işler. Yakalanan kare 300×300 RGB uint8 formuna indirgendikten sonra TFLite modeline beslenir. Model, çıktı olarak en fazla 10 nesne için sırasıyla [ymin, xmin, ymax, xmax] formatında sınırlayıcı kutular, sınıf indeksleri ve her tespit için bir güven skoru üretir.</w:t>
+        <w:t>Algılama pipeline’ı, FrameProcessor üzerinde başlayıp ObstacleDetector’da sonuçlanan bir veri akışıdır. Pipeline’ın her adımında karar mantığı şu şekilde işler. Yakalanan kare 320×320 RGB uint8 formuna indirgendikten sonra TFLite modeline beslenir. EfficientDet-Lite0 modeli, SSD MobileNet v1'e kıyasla daha yüksek doğruluk ve daha az yanlış pozitif üretecek şekilde optimize edilmiştir. Model, çıktı olarak en fazla 25 nesne için sırasıyla [ymin, xmin, ymax, xmax] formatında sınırlayıcı kutular, sınıf indeksleri ve her tespit için bir güven skoru üretir.</w:t>
       </w:r>
     </w:p>
     <w:p>
@@ -7747,6 +8613,2567 @@
     </w:p>
     <w:p>
       <w:pPr>
+        <w:pStyle w:val="SekillerTablosuYaziStili"/>
+        <w:jc w:val="center"/>
+      </w:pPr>
+      <w:r>
+        <w:t>Tablo 3.3. İş-Zaman Çizelgesi (Gantt)</w:t>
+      </w:r>
+    </w:p>
+    <w:tbl>
+      <w:tblPr>
+        <w:tblStyle w:val="TabloKlavuzu"/>
+        <w:tblW w:type="auto" w:w="0"/>
+        <w:tblLook w:firstColumn="1" w:firstRow="1" w:lastColumn="0" w:lastRow="0" w:noHBand="0" w:noVBand="1" w:val="04A0"/>
+      </w:tblPr>
+      <w:tblGrid>
+        <w:gridCol w:w="747"/>
+        <w:gridCol w:w="747"/>
+        <w:gridCol w:w="747"/>
+        <w:gridCol w:w="747"/>
+        <w:gridCol w:w="747"/>
+        <w:gridCol w:w="747"/>
+        <w:gridCol w:w="747"/>
+        <w:gridCol w:w="747"/>
+        <w:gridCol w:w="747"/>
+        <w:gridCol w:w="747"/>
+        <w:gridCol w:w="747"/>
+      </w:tblGrid>
+      <w:tr>
+        <w:tc>
+          <w:tcPr>
+            <w:tcW w:type="dxa" w:w="747"/>
+          </w:tcPr>
+          <w:p>
+            <w:pPr>
+              <w:pStyle w:val="SekillerTablosuYaziStili"/>
+            </w:pPr>
+            <w:r/>
+            <w:r>
+              <w:rPr>
+                <w:b/>
+              </w:rPr>
+              <w:t>İş Paketi</w:t>
+            </w:r>
+          </w:p>
+        </w:tc>
+        <w:tc>
+          <w:tcPr>
+            <w:tcW w:type="dxa" w:w="747"/>
+          </w:tcPr>
+          <w:p>
+            <w:pPr>
+              <w:pStyle w:val="SekillerTablosuYaziStili"/>
+            </w:pPr>
+            <w:r/>
+            <w:r>
+              <w:rPr>
+                <w:b/>
+              </w:rPr>
+              <w:t>Eyl 25</w:t>
+            </w:r>
+          </w:p>
+        </w:tc>
+        <w:tc>
+          <w:tcPr>
+            <w:tcW w:type="dxa" w:w="747"/>
+          </w:tcPr>
+          <w:p>
+            <w:pPr>
+              <w:pStyle w:val="SekillerTablosuYaziStili"/>
+            </w:pPr>
+            <w:r/>
+            <w:r>
+              <w:rPr>
+                <w:b/>
+              </w:rPr>
+              <w:t>Eki 25</w:t>
+            </w:r>
+          </w:p>
+        </w:tc>
+        <w:tc>
+          <w:tcPr>
+            <w:tcW w:type="dxa" w:w="747"/>
+          </w:tcPr>
+          <w:p>
+            <w:pPr>
+              <w:pStyle w:val="SekillerTablosuYaziStili"/>
+            </w:pPr>
+            <w:r/>
+            <w:r>
+              <w:rPr>
+                <w:b/>
+              </w:rPr>
+              <w:t>Kas 25</w:t>
+            </w:r>
+          </w:p>
+        </w:tc>
+        <w:tc>
+          <w:tcPr>
+            <w:tcW w:type="dxa" w:w="747"/>
+          </w:tcPr>
+          <w:p>
+            <w:pPr>
+              <w:pStyle w:val="SekillerTablosuYaziStili"/>
+            </w:pPr>
+            <w:r/>
+            <w:r>
+              <w:rPr>
+                <w:b/>
+              </w:rPr>
+              <w:t>Ara 25</w:t>
+            </w:r>
+          </w:p>
+        </w:tc>
+        <w:tc>
+          <w:tcPr>
+            <w:tcW w:type="dxa" w:w="747"/>
+          </w:tcPr>
+          <w:p>
+            <w:pPr>
+              <w:pStyle w:val="SekillerTablosuYaziStili"/>
+            </w:pPr>
+            <w:r/>
+            <w:r>
+              <w:rPr>
+                <w:b/>
+              </w:rPr>
+              <w:t>Oca 26</w:t>
+            </w:r>
+          </w:p>
+        </w:tc>
+        <w:tc>
+          <w:tcPr>
+            <w:tcW w:type="dxa" w:w="747"/>
+          </w:tcPr>
+          <w:p>
+            <w:pPr>
+              <w:pStyle w:val="SekillerTablosuYaziStili"/>
+            </w:pPr>
+            <w:r/>
+            <w:r>
+              <w:rPr>
+                <w:b/>
+              </w:rPr>
+              <w:t>Şub 26</w:t>
+            </w:r>
+          </w:p>
+        </w:tc>
+        <w:tc>
+          <w:tcPr>
+            <w:tcW w:type="dxa" w:w="747"/>
+          </w:tcPr>
+          <w:p>
+            <w:pPr>
+              <w:pStyle w:val="SekillerTablosuYaziStili"/>
+            </w:pPr>
+            <w:r/>
+            <w:r>
+              <w:rPr>
+                <w:b/>
+              </w:rPr>
+              <w:t>Mar 26</w:t>
+            </w:r>
+          </w:p>
+        </w:tc>
+        <w:tc>
+          <w:tcPr>
+            <w:tcW w:type="dxa" w:w="747"/>
+          </w:tcPr>
+          <w:p>
+            <w:pPr>
+              <w:pStyle w:val="SekillerTablosuYaziStili"/>
+            </w:pPr>
+            <w:r/>
+            <w:r>
+              <w:rPr>
+                <w:b/>
+              </w:rPr>
+              <w:t>Nis 26</w:t>
+            </w:r>
+          </w:p>
+        </w:tc>
+        <w:tc>
+          <w:tcPr>
+            <w:tcW w:type="dxa" w:w="747"/>
+          </w:tcPr>
+          <w:p>
+            <w:pPr>
+              <w:pStyle w:val="SekillerTablosuYaziStili"/>
+            </w:pPr>
+            <w:r/>
+            <w:r>
+              <w:rPr>
+                <w:b/>
+              </w:rPr>
+              <w:t>May 26</w:t>
+            </w:r>
+          </w:p>
+        </w:tc>
+        <w:tc>
+          <w:tcPr>
+            <w:tcW w:type="dxa" w:w="747"/>
+          </w:tcPr>
+          <w:p>
+            <w:pPr>
+              <w:pStyle w:val="SekillerTablosuYaziStili"/>
+            </w:pPr>
+            <w:r/>
+            <w:r>
+              <w:rPr>
+                <w:b/>
+              </w:rPr>
+              <w:t>Haz 26</w:t>
+            </w:r>
+          </w:p>
+        </w:tc>
+      </w:tr>
+      <w:tr>
+        <w:tc>
+          <w:tcPr>
+            <w:tcW w:type="dxa" w:w="747"/>
+          </w:tcPr>
+          <w:p>
+            <w:pPr>
+              <w:pStyle w:val="SekillerTablosuYaziStili"/>
+            </w:pPr>
+            <w:r/>
+            <w:r>
+              <w:t>IP-1: Gereksinim Analizi</w:t>
+            </w:r>
+          </w:p>
+        </w:tc>
+        <w:tc>
+          <w:tcPr>
+            <w:tcW w:type="dxa" w:w="747"/>
+          </w:tcPr>
+          <w:p>
+            <w:pPr>
+              <w:pStyle w:val="SekillerTablosuYaziStili"/>
+            </w:pPr>
+            <w:r/>
+            <w:r>
+              <w:t>●●●●</w:t>
+            </w:r>
+          </w:p>
+        </w:tc>
+        <w:tc>
+          <w:tcPr>
+            <w:tcW w:type="dxa" w:w="747"/>
+          </w:tcPr>
+          <w:p>
+            <w:pPr>
+              <w:pStyle w:val="SekillerTablosuYaziStili"/>
+            </w:pPr>
+            <w:r/>
+            <w:r/>
+          </w:p>
+        </w:tc>
+        <w:tc>
+          <w:tcPr>
+            <w:tcW w:type="dxa" w:w="747"/>
+          </w:tcPr>
+          <w:p>
+            <w:pPr>
+              <w:pStyle w:val="SekillerTablosuYaziStili"/>
+            </w:pPr>
+            <w:r/>
+            <w:r/>
+          </w:p>
+        </w:tc>
+        <w:tc>
+          <w:tcPr>
+            <w:tcW w:type="dxa" w:w="747"/>
+          </w:tcPr>
+          <w:p>
+            <w:pPr>
+              <w:pStyle w:val="SekillerTablosuYaziStili"/>
+            </w:pPr>
+            <w:r/>
+            <w:r/>
+          </w:p>
+        </w:tc>
+        <w:tc>
+          <w:tcPr>
+            <w:tcW w:type="dxa" w:w="747"/>
+          </w:tcPr>
+          <w:p>
+            <w:pPr>
+              <w:pStyle w:val="SekillerTablosuYaziStili"/>
+            </w:pPr>
+            <w:r/>
+            <w:r/>
+          </w:p>
+        </w:tc>
+        <w:tc>
+          <w:tcPr>
+            <w:tcW w:type="dxa" w:w="747"/>
+          </w:tcPr>
+          <w:p>
+            <w:pPr>
+              <w:pStyle w:val="SekillerTablosuYaziStili"/>
+            </w:pPr>
+            <w:r/>
+            <w:r/>
+          </w:p>
+        </w:tc>
+        <w:tc>
+          <w:tcPr>
+            <w:tcW w:type="dxa" w:w="747"/>
+          </w:tcPr>
+          <w:p>
+            <w:pPr>
+              <w:pStyle w:val="SekillerTablosuYaziStili"/>
+            </w:pPr>
+            <w:r/>
+            <w:r/>
+          </w:p>
+        </w:tc>
+        <w:tc>
+          <w:tcPr>
+            <w:tcW w:type="dxa" w:w="747"/>
+          </w:tcPr>
+          <w:p>
+            <w:pPr>
+              <w:pStyle w:val="SekillerTablosuYaziStili"/>
+            </w:pPr>
+            <w:r/>
+            <w:r/>
+          </w:p>
+        </w:tc>
+        <w:tc>
+          <w:tcPr>
+            <w:tcW w:type="dxa" w:w="747"/>
+          </w:tcPr>
+          <w:p>
+            <w:pPr>
+              <w:pStyle w:val="SekillerTablosuYaziStili"/>
+            </w:pPr>
+            <w:r/>
+            <w:r/>
+          </w:p>
+        </w:tc>
+        <w:tc>
+          <w:tcPr>
+            <w:tcW w:type="dxa" w:w="747"/>
+          </w:tcPr>
+          <w:p>
+            <w:pPr>
+              <w:pStyle w:val="SekillerTablosuYaziStili"/>
+            </w:pPr>
+            <w:r/>
+            <w:r/>
+          </w:p>
+        </w:tc>
+      </w:tr>
+      <w:tr>
+        <w:tc>
+          <w:tcPr>
+            <w:tcW w:type="dxa" w:w="747"/>
+          </w:tcPr>
+          <w:p>
+            <w:pPr>
+              <w:pStyle w:val="SekillerTablosuYaziStili"/>
+            </w:pPr>
+            <w:r/>
+            <w:r>
+              <w:t>IP-2: Mimari Tasarım</w:t>
+            </w:r>
+          </w:p>
+        </w:tc>
+        <w:tc>
+          <w:tcPr>
+            <w:tcW w:type="dxa" w:w="747"/>
+          </w:tcPr>
+          <w:p>
+            <w:pPr>
+              <w:pStyle w:val="SekillerTablosuYaziStili"/>
+            </w:pPr>
+            <w:r/>
+            <w:r>
+              <w:t>●●</w:t>
+            </w:r>
+          </w:p>
+        </w:tc>
+        <w:tc>
+          <w:tcPr>
+            <w:tcW w:type="dxa" w:w="747"/>
+          </w:tcPr>
+          <w:p>
+            <w:pPr>
+              <w:pStyle w:val="SekillerTablosuYaziStili"/>
+            </w:pPr>
+            <w:r/>
+            <w:r>
+              <w:t>●●</w:t>
+            </w:r>
+          </w:p>
+        </w:tc>
+        <w:tc>
+          <w:tcPr>
+            <w:tcW w:type="dxa" w:w="747"/>
+          </w:tcPr>
+          <w:p>
+            <w:pPr>
+              <w:pStyle w:val="SekillerTablosuYaziStili"/>
+            </w:pPr>
+            <w:r/>
+            <w:r/>
+          </w:p>
+        </w:tc>
+        <w:tc>
+          <w:tcPr>
+            <w:tcW w:type="dxa" w:w="747"/>
+          </w:tcPr>
+          <w:p>
+            <w:pPr>
+              <w:pStyle w:val="SekillerTablosuYaziStili"/>
+            </w:pPr>
+            <w:r/>
+            <w:r/>
+          </w:p>
+        </w:tc>
+        <w:tc>
+          <w:tcPr>
+            <w:tcW w:type="dxa" w:w="747"/>
+          </w:tcPr>
+          <w:p>
+            <w:pPr>
+              <w:pStyle w:val="SekillerTablosuYaziStili"/>
+            </w:pPr>
+            <w:r/>
+            <w:r/>
+          </w:p>
+        </w:tc>
+        <w:tc>
+          <w:tcPr>
+            <w:tcW w:type="dxa" w:w="747"/>
+          </w:tcPr>
+          <w:p>
+            <w:pPr>
+              <w:pStyle w:val="SekillerTablosuYaziStili"/>
+            </w:pPr>
+            <w:r/>
+            <w:r/>
+          </w:p>
+        </w:tc>
+        <w:tc>
+          <w:tcPr>
+            <w:tcW w:type="dxa" w:w="747"/>
+          </w:tcPr>
+          <w:p>
+            <w:pPr>
+              <w:pStyle w:val="SekillerTablosuYaziStili"/>
+            </w:pPr>
+            <w:r/>
+            <w:r/>
+          </w:p>
+        </w:tc>
+        <w:tc>
+          <w:tcPr>
+            <w:tcW w:type="dxa" w:w="747"/>
+          </w:tcPr>
+          <w:p>
+            <w:pPr>
+              <w:pStyle w:val="SekillerTablosuYaziStili"/>
+            </w:pPr>
+            <w:r/>
+            <w:r/>
+          </w:p>
+        </w:tc>
+        <w:tc>
+          <w:tcPr>
+            <w:tcW w:type="dxa" w:w="747"/>
+          </w:tcPr>
+          <w:p>
+            <w:pPr>
+              <w:pStyle w:val="SekillerTablosuYaziStili"/>
+            </w:pPr>
+            <w:r/>
+            <w:r/>
+          </w:p>
+        </w:tc>
+        <w:tc>
+          <w:tcPr>
+            <w:tcW w:type="dxa" w:w="747"/>
+          </w:tcPr>
+          <w:p>
+            <w:pPr>
+              <w:pStyle w:val="SekillerTablosuYaziStili"/>
+            </w:pPr>
+            <w:r/>
+            <w:r/>
+          </w:p>
+        </w:tc>
+      </w:tr>
+      <w:tr>
+        <w:tc>
+          <w:tcPr>
+            <w:tcW w:type="dxa" w:w="747"/>
+          </w:tcPr>
+          <w:p>
+            <w:pPr>
+              <w:pStyle w:val="SekillerTablosuYaziStili"/>
+            </w:pPr>
+            <w:r/>
+            <w:r>
+              <w:t>IP-3: Çekirdek Bileşen Geliştirme</w:t>
+            </w:r>
+          </w:p>
+        </w:tc>
+        <w:tc>
+          <w:tcPr>
+            <w:tcW w:type="dxa" w:w="747"/>
+          </w:tcPr>
+          <w:p>
+            <w:pPr>
+              <w:pStyle w:val="SekillerTablosuYaziStili"/>
+            </w:pPr>
+            <w:r/>
+            <w:r/>
+          </w:p>
+        </w:tc>
+        <w:tc>
+          <w:tcPr>
+            <w:tcW w:type="dxa" w:w="747"/>
+          </w:tcPr>
+          <w:p>
+            <w:pPr>
+              <w:pStyle w:val="SekillerTablosuYaziStili"/>
+            </w:pPr>
+            <w:r/>
+            <w:r>
+              <w:t>●●●●</w:t>
+            </w:r>
+          </w:p>
+        </w:tc>
+        <w:tc>
+          <w:tcPr>
+            <w:tcW w:type="dxa" w:w="747"/>
+          </w:tcPr>
+          <w:p>
+            <w:pPr>
+              <w:pStyle w:val="SekillerTablosuYaziStili"/>
+            </w:pPr>
+            <w:r/>
+            <w:r>
+              <w:t>●●●●</w:t>
+            </w:r>
+          </w:p>
+        </w:tc>
+        <w:tc>
+          <w:tcPr>
+            <w:tcW w:type="dxa" w:w="747"/>
+          </w:tcPr>
+          <w:p>
+            <w:pPr>
+              <w:pStyle w:val="SekillerTablosuYaziStili"/>
+            </w:pPr>
+            <w:r/>
+            <w:r/>
+          </w:p>
+        </w:tc>
+        <w:tc>
+          <w:tcPr>
+            <w:tcW w:type="dxa" w:w="747"/>
+          </w:tcPr>
+          <w:p>
+            <w:pPr>
+              <w:pStyle w:val="SekillerTablosuYaziStili"/>
+            </w:pPr>
+            <w:r/>
+            <w:r/>
+          </w:p>
+        </w:tc>
+        <w:tc>
+          <w:tcPr>
+            <w:tcW w:type="dxa" w:w="747"/>
+          </w:tcPr>
+          <w:p>
+            <w:pPr>
+              <w:pStyle w:val="SekillerTablosuYaziStili"/>
+            </w:pPr>
+            <w:r/>
+            <w:r/>
+          </w:p>
+        </w:tc>
+        <w:tc>
+          <w:tcPr>
+            <w:tcW w:type="dxa" w:w="747"/>
+          </w:tcPr>
+          <w:p>
+            <w:pPr>
+              <w:pStyle w:val="SekillerTablosuYaziStili"/>
+            </w:pPr>
+            <w:r/>
+            <w:r/>
+          </w:p>
+        </w:tc>
+        <w:tc>
+          <w:tcPr>
+            <w:tcW w:type="dxa" w:w="747"/>
+          </w:tcPr>
+          <w:p>
+            <w:pPr>
+              <w:pStyle w:val="SekillerTablosuYaziStili"/>
+            </w:pPr>
+            <w:r/>
+            <w:r/>
+          </w:p>
+        </w:tc>
+        <w:tc>
+          <w:tcPr>
+            <w:tcW w:type="dxa" w:w="747"/>
+          </w:tcPr>
+          <w:p>
+            <w:pPr>
+              <w:pStyle w:val="SekillerTablosuYaziStili"/>
+            </w:pPr>
+            <w:r/>
+            <w:r/>
+          </w:p>
+        </w:tc>
+        <w:tc>
+          <w:tcPr>
+            <w:tcW w:type="dxa" w:w="747"/>
+          </w:tcPr>
+          <w:p>
+            <w:pPr>
+              <w:pStyle w:val="SekillerTablosuYaziStili"/>
+            </w:pPr>
+            <w:r/>
+            <w:r/>
+          </w:p>
+        </w:tc>
+      </w:tr>
+      <w:tr>
+        <w:tc>
+          <w:tcPr>
+            <w:tcW w:type="dxa" w:w="747"/>
+          </w:tcPr>
+          <w:p>
+            <w:pPr>
+              <w:pStyle w:val="SekillerTablosuYaziStili"/>
+            </w:pPr>
+            <w:r/>
+            <w:r>
+              <w:t>IP-4: ML Model Entegrasyonu</w:t>
+            </w:r>
+          </w:p>
+        </w:tc>
+        <w:tc>
+          <w:tcPr>
+            <w:tcW w:type="dxa" w:w="747"/>
+          </w:tcPr>
+          <w:p>
+            <w:pPr>
+              <w:pStyle w:val="SekillerTablosuYaziStili"/>
+            </w:pPr>
+            <w:r/>
+            <w:r/>
+          </w:p>
+        </w:tc>
+        <w:tc>
+          <w:tcPr>
+            <w:tcW w:type="dxa" w:w="747"/>
+          </w:tcPr>
+          <w:p>
+            <w:pPr>
+              <w:pStyle w:val="SekillerTablosuYaziStili"/>
+            </w:pPr>
+            <w:r/>
+            <w:r/>
+          </w:p>
+        </w:tc>
+        <w:tc>
+          <w:tcPr>
+            <w:tcW w:type="dxa" w:w="747"/>
+          </w:tcPr>
+          <w:p>
+            <w:pPr>
+              <w:pStyle w:val="SekillerTablosuYaziStili"/>
+            </w:pPr>
+            <w:r/>
+            <w:r>
+              <w:t>●●</w:t>
+            </w:r>
+          </w:p>
+        </w:tc>
+        <w:tc>
+          <w:tcPr>
+            <w:tcW w:type="dxa" w:w="747"/>
+          </w:tcPr>
+          <w:p>
+            <w:pPr>
+              <w:pStyle w:val="SekillerTablosuYaziStili"/>
+            </w:pPr>
+            <w:r/>
+            <w:r>
+              <w:t>●●●●</w:t>
+            </w:r>
+          </w:p>
+        </w:tc>
+        <w:tc>
+          <w:tcPr>
+            <w:tcW w:type="dxa" w:w="747"/>
+          </w:tcPr>
+          <w:p>
+            <w:pPr>
+              <w:pStyle w:val="SekillerTablosuYaziStili"/>
+            </w:pPr>
+            <w:r/>
+            <w:r/>
+          </w:p>
+        </w:tc>
+        <w:tc>
+          <w:tcPr>
+            <w:tcW w:type="dxa" w:w="747"/>
+          </w:tcPr>
+          <w:p>
+            <w:pPr>
+              <w:pStyle w:val="SekillerTablosuYaziStili"/>
+            </w:pPr>
+            <w:r/>
+            <w:r/>
+          </w:p>
+        </w:tc>
+        <w:tc>
+          <w:tcPr>
+            <w:tcW w:type="dxa" w:w="747"/>
+          </w:tcPr>
+          <w:p>
+            <w:pPr>
+              <w:pStyle w:val="SekillerTablosuYaziStili"/>
+            </w:pPr>
+            <w:r/>
+            <w:r/>
+          </w:p>
+        </w:tc>
+        <w:tc>
+          <w:tcPr>
+            <w:tcW w:type="dxa" w:w="747"/>
+          </w:tcPr>
+          <w:p>
+            <w:pPr>
+              <w:pStyle w:val="SekillerTablosuYaziStili"/>
+            </w:pPr>
+            <w:r/>
+            <w:r/>
+          </w:p>
+        </w:tc>
+        <w:tc>
+          <w:tcPr>
+            <w:tcW w:type="dxa" w:w="747"/>
+          </w:tcPr>
+          <w:p>
+            <w:pPr>
+              <w:pStyle w:val="SekillerTablosuYaziStili"/>
+            </w:pPr>
+            <w:r/>
+            <w:r/>
+          </w:p>
+        </w:tc>
+        <w:tc>
+          <w:tcPr>
+            <w:tcW w:type="dxa" w:w="747"/>
+          </w:tcPr>
+          <w:p>
+            <w:pPr>
+              <w:pStyle w:val="SekillerTablosuYaziStili"/>
+            </w:pPr>
+            <w:r/>
+            <w:r/>
+          </w:p>
+        </w:tc>
+      </w:tr>
+      <w:tr>
+        <w:tc>
+          <w:tcPr>
+            <w:tcW w:type="dxa" w:w="747"/>
+          </w:tcPr>
+          <w:p>
+            <w:pPr>
+              <w:pStyle w:val="SekillerTablosuYaziStili"/>
+            </w:pPr>
+            <w:r/>
+            <w:r>
+              <w:t>IP-5: Navigasyon Servisi</w:t>
+            </w:r>
+          </w:p>
+        </w:tc>
+        <w:tc>
+          <w:tcPr>
+            <w:tcW w:type="dxa" w:w="747"/>
+          </w:tcPr>
+          <w:p>
+            <w:pPr>
+              <w:pStyle w:val="SekillerTablosuYaziStili"/>
+            </w:pPr>
+            <w:r/>
+            <w:r/>
+          </w:p>
+        </w:tc>
+        <w:tc>
+          <w:tcPr>
+            <w:tcW w:type="dxa" w:w="747"/>
+          </w:tcPr>
+          <w:p>
+            <w:pPr>
+              <w:pStyle w:val="SekillerTablosuYaziStili"/>
+            </w:pPr>
+            <w:r/>
+            <w:r/>
+          </w:p>
+        </w:tc>
+        <w:tc>
+          <w:tcPr>
+            <w:tcW w:type="dxa" w:w="747"/>
+          </w:tcPr>
+          <w:p>
+            <w:pPr>
+              <w:pStyle w:val="SekillerTablosuYaziStili"/>
+            </w:pPr>
+            <w:r/>
+            <w:r/>
+          </w:p>
+        </w:tc>
+        <w:tc>
+          <w:tcPr>
+            <w:tcW w:type="dxa" w:w="747"/>
+          </w:tcPr>
+          <w:p>
+            <w:pPr>
+              <w:pStyle w:val="SekillerTablosuYaziStili"/>
+            </w:pPr>
+            <w:r/>
+            <w:r>
+              <w:t>●●</w:t>
+            </w:r>
+          </w:p>
+        </w:tc>
+        <w:tc>
+          <w:tcPr>
+            <w:tcW w:type="dxa" w:w="747"/>
+          </w:tcPr>
+          <w:p>
+            <w:pPr>
+              <w:pStyle w:val="SekillerTablosuYaziStili"/>
+            </w:pPr>
+            <w:r/>
+            <w:r>
+              <w:t>●●●●</w:t>
+            </w:r>
+          </w:p>
+        </w:tc>
+        <w:tc>
+          <w:tcPr>
+            <w:tcW w:type="dxa" w:w="747"/>
+          </w:tcPr>
+          <w:p>
+            <w:pPr>
+              <w:pStyle w:val="SekillerTablosuYaziStili"/>
+            </w:pPr>
+            <w:r/>
+            <w:r/>
+          </w:p>
+        </w:tc>
+        <w:tc>
+          <w:tcPr>
+            <w:tcW w:type="dxa" w:w="747"/>
+          </w:tcPr>
+          <w:p>
+            <w:pPr>
+              <w:pStyle w:val="SekillerTablosuYaziStili"/>
+            </w:pPr>
+            <w:r/>
+            <w:r/>
+          </w:p>
+        </w:tc>
+        <w:tc>
+          <w:tcPr>
+            <w:tcW w:type="dxa" w:w="747"/>
+          </w:tcPr>
+          <w:p>
+            <w:pPr>
+              <w:pStyle w:val="SekillerTablosuYaziStili"/>
+            </w:pPr>
+            <w:r/>
+            <w:r/>
+          </w:p>
+        </w:tc>
+        <w:tc>
+          <w:tcPr>
+            <w:tcW w:type="dxa" w:w="747"/>
+          </w:tcPr>
+          <w:p>
+            <w:pPr>
+              <w:pStyle w:val="SekillerTablosuYaziStili"/>
+            </w:pPr>
+            <w:r/>
+            <w:r/>
+          </w:p>
+        </w:tc>
+        <w:tc>
+          <w:tcPr>
+            <w:tcW w:type="dxa" w:w="747"/>
+          </w:tcPr>
+          <w:p>
+            <w:pPr>
+              <w:pStyle w:val="SekillerTablosuYaziStili"/>
+            </w:pPr>
+            <w:r/>
+            <w:r/>
+          </w:p>
+        </w:tc>
+      </w:tr>
+      <w:tr>
+        <w:tc>
+          <w:tcPr>
+            <w:tcW w:type="dxa" w:w="747"/>
+          </w:tcPr>
+          <w:p>
+            <w:pPr>
+              <w:pStyle w:val="SekillerTablosuYaziStili"/>
+            </w:pPr>
+            <w:r/>
+            <w:r>
+              <w:t>IP-6: UI / Erişilebilirlik</w:t>
+            </w:r>
+          </w:p>
+        </w:tc>
+        <w:tc>
+          <w:tcPr>
+            <w:tcW w:type="dxa" w:w="747"/>
+          </w:tcPr>
+          <w:p>
+            <w:pPr>
+              <w:pStyle w:val="SekillerTablosuYaziStili"/>
+            </w:pPr>
+            <w:r/>
+            <w:r/>
+          </w:p>
+        </w:tc>
+        <w:tc>
+          <w:tcPr>
+            <w:tcW w:type="dxa" w:w="747"/>
+          </w:tcPr>
+          <w:p>
+            <w:pPr>
+              <w:pStyle w:val="SekillerTablosuYaziStili"/>
+            </w:pPr>
+            <w:r/>
+            <w:r/>
+          </w:p>
+        </w:tc>
+        <w:tc>
+          <w:tcPr>
+            <w:tcW w:type="dxa" w:w="747"/>
+          </w:tcPr>
+          <w:p>
+            <w:pPr>
+              <w:pStyle w:val="SekillerTablosuYaziStili"/>
+            </w:pPr>
+            <w:r/>
+            <w:r/>
+          </w:p>
+        </w:tc>
+        <w:tc>
+          <w:tcPr>
+            <w:tcW w:type="dxa" w:w="747"/>
+          </w:tcPr>
+          <w:p>
+            <w:pPr>
+              <w:pStyle w:val="SekillerTablosuYaziStili"/>
+            </w:pPr>
+            <w:r/>
+            <w:r/>
+          </w:p>
+        </w:tc>
+        <w:tc>
+          <w:tcPr>
+            <w:tcW w:type="dxa" w:w="747"/>
+          </w:tcPr>
+          <w:p>
+            <w:pPr>
+              <w:pStyle w:val="SekillerTablosuYaziStili"/>
+            </w:pPr>
+            <w:r/>
+            <w:r>
+              <w:t>●●</w:t>
+            </w:r>
+          </w:p>
+        </w:tc>
+        <w:tc>
+          <w:tcPr>
+            <w:tcW w:type="dxa" w:w="747"/>
+          </w:tcPr>
+          <w:p>
+            <w:pPr>
+              <w:pStyle w:val="SekillerTablosuYaziStili"/>
+            </w:pPr>
+            <w:r/>
+            <w:r>
+              <w:t>●●●●</w:t>
+            </w:r>
+          </w:p>
+        </w:tc>
+        <w:tc>
+          <w:tcPr>
+            <w:tcW w:type="dxa" w:w="747"/>
+          </w:tcPr>
+          <w:p>
+            <w:pPr>
+              <w:pStyle w:val="SekillerTablosuYaziStili"/>
+            </w:pPr>
+            <w:r/>
+            <w:r/>
+          </w:p>
+        </w:tc>
+        <w:tc>
+          <w:tcPr>
+            <w:tcW w:type="dxa" w:w="747"/>
+          </w:tcPr>
+          <w:p>
+            <w:pPr>
+              <w:pStyle w:val="SekillerTablosuYaziStili"/>
+            </w:pPr>
+            <w:r/>
+            <w:r/>
+          </w:p>
+        </w:tc>
+        <w:tc>
+          <w:tcPr>
+            <w:tcW w:type="dxa" w:w="747"/>
+          </w:tcPr>
+          <w:p>
+            <w:pPr>
+              <w:pStyle w:val="SekillerTablosuYaziStili"/>
+            </w:pPr>
+            <w:r/>
+            <w:r/>
+          </w:p>
+        </w:tc>
+        <w:tc>
+          <w:tcPr>
+            <w:tcW w:type="dxa" w:w="747"/>
+          </w:tcPr>
+          <w:p>
+            <w:pPr>
+              <w:pStyle w:val="SekillerTablosuYaziStili"/>
+            </w:pPr>
+            <w:r/>
+            <w:r/>
+          </w:p>
+        </w:tc>
+      </w:tr>
+      <w:tr>
+        <w:tc>
+          <w:tcPr>
+            <w:tcW w:type="dxa" w:w="747"/>
+          </w:tcPr>
+          <w:p>
+            <w:pPr>
+              <w:pStyle w:val="SekillerTablosuYaziStili"/>
+            </w:pPr>
+            <w:r/>
+            <w:r>
+              <w:t>IP-7: Erişilebilirlik Testleri</w:t>
+            </w:r>
+          </w:p>
+        </w:tc>
+        <w:tc>
+          <w:tcPr>
+            <w:tcW w:type="dxa" w:w="747"/>
+          </w:tcPr>
+          <w:p>
+            <w:pPr>
+              <w:pStyle w:val="SekillerTablosuYaziStili"/>
+            </w:pPr>
+            <w:r/>
+            <w:r/>
+          </w:p>
+        </w:tc>
+        <w:tc>
+          <w:tcPr>
+            <w:tcW w:type="dxa" w:w="747"/>
+          </w:tcPr>
+          <w:p>
+            <w:pPr>
+              <w:pStyle w:val="SekillerTablosuYaziStili"/>
+            </w:pPr>
+            <w:r/>
+            <w:r/>
+          </w:p>
+        </w:tc>
+        <w:tc>
+          <w:tcPr>
+            <w:tcW w:type="dxa" w:w="747"/>
+          </w:tcPr>
+          <w:p>
+            <w:pPr>
+              <w:pStyle w:val="SekillerTablosuYaziStili"/>
+            </w:pPr>
+            <w:r/>
+            <w:r/>
+          </w:p>
+        </w:tc>
+        <w:tc>
+          <w:tcPr>
+            <w:tcW w:type="dxa" w:w="747"/>
+          </w:tcPr>
+          <w:p>
+            <w:pPr>
+              <w:pStyle w:val="SekillerTablosuYaziStili"/>
+            </w:pPr>
+            <w:r/>
+            <w:r/>
+          </w:p>
+        </w:tc>
+        <w:tc>
+          <w:tcPr>
+            <w:tcW w:type="dxa" w:w="747"/>
+          </w:tcPr>
+          <w:p>
+            <w:pPr>
+              <w:pStyle w:val="SekillerTablosuYaziStili"/>
+            </w:pPr>
+            <w:r/>
+            <w:r/>
+          </w:p>
+        </w:tc>
+        <w:tc>
+          <w:tcPr>
+            <w:tcW w:type="dxa" w:w="747"/>
+          </w:tcPr>
+          <w:p>
+            <w:pPr>
+              <w:pStyle w:val="SekillerTablosuYaziStili"/>
+            </w:pPr>
+            <w:r/>
+            <w:r>
+              <w:t>●●</w:t>
+            </w:r>
+          </w:p>
+        </w:tc>
+        <w:tc>
+          <w:tcPr>
+            <w:tcW w:type="dxa" w:w="747"/>
+          </w:tcPr>
+          <w:p>
+            <w:pPr>
+              <w:pStyle w:val="SekillerTablosuYaziStili"/>
+            </w:pPr>
+            <w:r/>
+            <w:r>
+              <w:t>●●●●</w:t>
+            </w:r>
+          </w:p>
+        </w:tc>
+        <w:tc>
+          <w:tcPr>
+            <w:tcW w:type="dxa" w:w="747"/>
+          </w:tcPr>
+          <w:p>
+            <w:pPr>
+              <w:pStyle w:val="SekillerTablosuYaziStili"/>
+            </w:pPr>
+            <w:r/>
+            <w:r/>
+          </w:p>
+        </w:tc>
+        <w:tc>
+          <w:tcPr>
+            <w:tcW w:type="dxa" w:w="747"/>
+          </w:tcPr>
+          <w:p>
+            <w:pPr>
+              <w:pStyle w:val="SekillerTablosuYaziStili"/>
+            </w:pPr>
+            <w:r/>
+            <w:r/>
+          </w:p>
+        </w:tc>
+        <w:tc>
+          <w:tcPr>
+            <w:tcW w:type="dxa" w:w="747"/>
+          </w:tcPr>
+          <w:p>
+            <w:pPr>
+              <w:pStyle w:val="SekillerTablosuYaziStili"/>
+            </w:pPr>
+            <w:r/>
+            <w:r/>
+          </w:p>
+        </w:tc>
+      </w:tr>
+      <w:tr>
+        <w:tc>
+          <w:tcPr>
+            <w:tcW w:type="dxa" w:w="747"/>
+          </w:tcPr>
+          <w:p>
+            <w:pPr>
+              <w:pStyle w:val="SekillerTablosuYaziStili"/>
+            </w:pPr>
+            <w:r/>
+            <w:r>
+              <w:t>IP-8: Performans Ölçümleri</w:t>
+            </w:r>
+          </w:p>
+        </w:tc>
+        <w:tc>
+          <w:tcPr>
+            <w:tcW w:type="dxa" w:w="747"/>
+          </w:tcPr>
+          <w:p>
+            <w:pPr>
+              <w:pStyle w:val="SekillerTablosuYaziStili"/>
+            </w:pPr>
+            <w:r/>
+            <w:r/>
+          </w:p>
+        </w:tc>
+        <w:tc>
+          <w:tcPr>
+            <w:tcW w:type="dxa" w:w="747"/>
+          </w:tcPr>
+          <w:p>
+            <w:pPr>
+              <w:pStyle w:val="SekillerTablosuYaziStili"/>
+            </w:pPr>
+            <w:r/>
+            <w:r/>
+          </w:p>
+        </w:tc>
+        <w:tc>
+          <w:tcPr>
+            <w:tcW w:type="dxa" w:w="747"/>
+          </w:tcPr>
+          <w:p>
+            <w:pPr>
+              <w:pStyle w:val="SekillerTablosuYaziStili"/>
+            </w:pPr>
+            <w:r/>
+            <w:r/>
+          </w:p>
+        </w:tc>
+        <w:tc>
+          <w:tcPr>
+            <w:tcW w:type="dxa" w:w="747"/>
+          </w:tcPr>
+          <w:p>
+            <w:pPr>
+              <w:pStyle w:val="SekillerTablosuYaziStili"/>
+            </w:pPr>
+            <w:r/>
+            <w:r/>
+          </w:p>
+        </w:tc>
+        <w:tc>
+          <w:tcPr>
+            <w:tcW w:type="dxa" w:w="747"/>
+          </w:tcPr>
+          <w:p>
+            <w:pPr>
+              <w:pStyle w:val="SekillerTablosuYaziStili"/>
+            </w:pPr>
+            <w:r/>
+            <w:r/>
+          </w:p>
+        </w:tc>
+        <w:tc>
+          <w:tcPr>
+            <w:tcW w:type="dxa" w:w="747"/>
+          </w:tcPr>
+          <w:p>
+            <w:pPr>
+              <w:pStyle w:val="SekillerTablosuYaziStili"/>
+            </w:pPr>
+            <w:r/>
+            <w:r/>
+          </w:p>
+        </w:tc>
+        <w:tc>
+          <w:tcPr>
+            <w:tcW w:type="dxa" w:w="747"/>
+          </w:tcPr>
+          <w:p>
+            <w:pPr>
+              <w:pStyle w:val="SekillerTablosuYaziStili"/>
+            </w:pPr>
+            <w:r/>
+            <w:r>
+              <w:t>●●</w:t>
+            </w:r>
+          </w:p>
+        </w:tc>
+        <w:tc>
+          <w:tcPr>
+            <w:tcW w:type="dxa" w:w="747"/>
+          </w:tcPr>
+          <w:p>
+            <w:pPr>
+              <w:pStyle w:val="SekillerTablosuYaziStili"/>
+            </w:pPr>
+            <w:r/>
+            <w:r>
+              <w:t>●●●●</w:t>
+            </w:r>
+          </w:p>
+        </w:tc>
+        <w:tc>
+          <w:tcPr>
+            <w:tcW w:type="dxa" w:w="747"/>
+          </w:tcPr>
+          <w:p>
+            <w:pPr>
+              <w:pStyle w:val="SekillerTablosuYaziStili"/>
+            </w:pPr>
+            <w:r/>
+            <w:r/>
+          </w:p>
+        </w:tc>
+        <w:tc>
+          <w:tcPr>
+            <w:tcW w:type="dxa" w:w="747"/>
+          </w:tcPr>
+          <w:p>
+            <w:pPr>
+              <w:pStyle w:val="SekillerTablosuYaziStili"/>
+            </w:pPr>
+            <w:r/>
+            <w:r/>
+          </w:p>
+        </w:tc>
+      </w:tr>
+      <w:tr>
+        <w:tc>
+          <w:tcPr>
+            <w:tcW w:type="dxa" w:w="747"/>
+          </w:tcPr>
+          <w:p>
+            <w:pPr>
+              <w:pStyle w:val="SekillerTablosuYaziStili"/>
+            </w:pPr>
+            <w:r/>
+            <w:r>
+              <w:t>IP-9: Dokümantasyon / Rapor</w:t>
+            </w:r>
+          </w:p>
+        </w:tc>
+        <w:tc>
+          <w:tcPr>
+            <w:tcW w:type="dxa" w:w="747"/>
+          </w:tcPr>
+          <w:p>
+            <w:pPr>
+              <w:pStyle w:val="SekillerTablosuYaziStili"/>
+            </w:pPr>
+            <w:r/>
+            <w:r/>
+          </w:p>
+        </w:tc>
+        <w:tc>
+          <w:tcPr>
+            <w:tcW w:type="dxa" w:w="747"/>
+          </w:tcPr>
+          <w:p>
+            <w:pPr>
+              <w:pStyle w:val="SekillerTablosuYaziStili"/>
+            </w:pPr>
+            <w:r/>
+            <w:r/>
+          </w:p>
+        </w:tc>
+        <w:tc>
+          <w:tcPr>
+            <w:tcW w:type="dxa" w:w="747"/>
+          </w:tcPr>
+          <w:p>
+            <w:pPr>
+              <w:pStyle w:val="SekillerTablosuYaziStili"/>
+            </w:pPr>
+            <w:r/>
+            <w:r/>
+          </w:p>
+        </w:tc>
+        <w:tc>
+          <w:tcPr>
+            <w:tcW w:type="dxa" w:w="747"/>
+          </w:tcPr>
+          <w:p>
+            <w:pPr>
+              <w:pStyle w:val="SekillerTablosuYaziStili"/>
+            </w:pPr>
+            <w:r/>
+            <w:r/>
+          </w:p>
+        </w:tc>
+        <w:tc>
+          <w:tcPr>
+            <w:tcW w:type="dxa" w:w="747"/>
+          </w:tcPr>
+          <w:p>
+            <w:pPr>
+              <w:pStyle w:val="SekillerTablosuYaziStili"/>
+            </w:pPr>
+            <w:r/>
+            <w:r/>
+          </w:p>
+        </w:tc>
+        <w:tc>
+          <w:tcPr>
+            <w:tcW w:type="dxa" w:w="747"/>
+          </w:tcPr>
+          <w:p>
+            <w:pPr>
+              <w:pStyle w:val="SekillerTablosuYaziStili"/>
+            </w:pPr>
+            <w:r/>
+            <w:r/>
+          </w:p>
+        </w:tc>
+        <w:tc>
+          <w:tcPr>
+            <w:tcW w:type="dxa" w:w="747"/>
+          </w:tcPr>
+          <w:p>
+            <w:pPr>
+              <w:pStyle w:val="SekillerTablosuYaziStili"/>
+            </w:pPr>
+            <w:r/>
+            <w:r/>
+          </w:p>
+        </w:tc>
+        <w:tc>
+          <w:tcPr>
+            <w:tcW w:type="dxa" w:w="747"/>
+          </w:tcPr>
+          <w:p>
+            <w:pPr>
+              <w:pStyle w:val="SekillerTablosuYaziStili"/>
+            </w:pPr>
+            <w:r/>
+            <w:r>
+              <w:t>●●</w:t>
+            </w:r>
+          </w:p>
+        </w:tc>
+        <w:tc>
+          <w:tcPr>
+            <w:tcW w:type="dxa" w:w="747"/>
+          </w:tcPr>
+          <w:p>
+            <w:pPr>
+              <w:pStyle w:val="SekillerTablosuYaziStili"/>
+            </w:pPr>
+            <w:r/>
+            <w:r>
+              <w:t>●●●●</w:t>
+            </w:r>
+          </w:p>
+        </w:tc>
+        <w:tc>
+          <w:tcPr>
+            <w:tcW w:type="dxa" w:w="747"/>
+          </w:tcPr>
+          <w:p>
+            <w:pPr>
+              <w:pStyle w:val="SekillerTablosuYaziStili"/>
+            </w:pPr>
+            <w:r/>
+            <w:r>
+              <w:t>●●●●</w:t>
+            </w:r>
+          </w:p>
+        </w:tc>
+      </w:tr>
+    </w:tbl>
+    <w:p>
+      <w:pPr>
+        <w:pStyle w:val="AnaParagrafYaziStiliSau"/>
+      </w:pPr>
+    </w:p>
+    <w:p>
+      <w:pPr>
+        <w:pStyle w:val="AnaParagrafYaziStiliSau"/>
+      </w:pPr>
+      <w:r>
+        <w:t>Tablo 3.3’te proje takvimi Gantt formatında verilmiştir. Her hücredeki ‘●●●●’ ifadesi o ay boyunca tam zamanlı çalışmayı, ‘●●’ ifadesi kısmi çalışmayı temsil etmektedir. Proje Eylül 2025’te gereksinim analiziyle başlamış; Haziran 2026’da raporlama ve sunumla tamamlanmıştır.</w:t>
+      </w:r>
+    </w:p>
+    <w:p>
+      <w:pPr>
+        <w:pStyle w:val="AltBaslkSau"/>
+      </w:pPr>
+      <w:r>
+        <w:t>Maliyet ve Enerji Analizi</w:t>
+      </w:r>
+    </w:p>
+    <w:p>
+      <w:pPr>
+        <w:pStyle w:val="IkincilAltBaslikSau"/>
+      </w:pPr>
+      <w:r>
+        <w:t>Geliştirme Maliyet Analizi</w:t>
+      </w:r>
+    </w:p>
+    <w:p>
+      <w:pPr>
+        <w:pStyle w:val="AnaParagrafYaziStiliSau"/>
+      </w:pPr>
+      <w:r>
+        <w:t>Proje kapsamındaki geliştirme maliyetleri; doğrudan yazılım geliştirme eforu, kullanılan donanım ve yazılım araçları ile dağıtım hizmetleri olmak üç ana başlıkta ele alınmıştır. Proje iki öğrenci geliştirici tarafından yürütülmüş olup maliyet hesabı ortalama stajyer yazılım geliştirici saatlik ücreti (150 TL/saat) referans alınarak yapılmıştır.</w:t>
+      </w:r>
+    </w:p>
+    <w:p>
+      <w:pPr>
+        <w:pStyle w:val="SekillerTablosuYaziStili"/>
+        <w:jc w:val="center"/>
+      </w:pPr>
+      <w:r>
+        <w:t>Tablo 3.4. Geliştirme Maliyet Analizi</w:t>
+      </w:r>
+    </w:p>
+    <w:tbl>
+      <w:tblPr>
+        <w:tblStyle w:val="TabloKlavuzu"/>
+        <w:tblW w:type="auto" w:w="0"/>
+        <w:tblLook w:firstColumn="1" w:firstRow="1" w:lastColumn="0" w:lastRow="0" w:noHBand="0" w:noVBand="1" w:val="04A0"/>
+      </w:tblPr>
+      <w:tblGrid>
+        <w:gridCol w:w="1644"/>
+        <w:gridCol w:w="1644"/>
+        <w:gridCol w:w="1644"/>
+        <w:gridCol w:w="1644"/>
+        <w:gridCol w:w="1644"/>
+      </w:tblGrid>
+      <w:tr>
+        <w:tc>
+          <w:tcPr>
+            <w:tcW w:type="dxa" w:w="1644"/>
+          </w:tcPr>
+          <w:p>
+            <w:pPr>
+              <w:pStyle w:val="SekillerTablosuYaziStili"/>
+            </w:pPr>
+            <w:r/>
+            <w:r>
+              <w:rPr>
+                <w:b/>
+              </w:rPr>
+              <w:t>Kategori</w:t>
+            </w:r>
+          </w:p>
+        </w:tc>
+        <w:tc>
+          <w:tcPr>
+            <w:tcW w:type="dxa" w:w="1644"/>
+          </w:tcPr>
+          <w:p>
+            <w:pPr>
+              <w:pStyle w:val="SekillerTablosuYaziStili"/>
+            </w:pPr>
+            <w:r/>
+            <w:r>
+              <w:rPr>
+                <w:b/>
+              </w:rPr>
+              <w:t>Kalem</w:t>
+            </w:r>
+          </w:p>
+        </w:tc>
+        <w:tc>
+          <w:tcPr>
+            <w:tcW w:type="dxa" w:w="1644"/>
+          </w:tcPr>
+          <w:p>
+            <w:pPr>
+              <w:pStyle w:val="SekillerTablosuYaziStili"/>
+            </w:pPr>
+            <w:r/>
+            <w:r>
+              <w:rPr>
+                <w:b/>
+              </w:rPr>
+              <w:t>Miktar/Süre</w:t>
+            </w:r>
+          </w:p>
+        </w:tc>
+        <w:tc>
+          <w:tcPr>
+            <w:tcW w:type="dxa" w:w="1644"/>
+          </w:tcPr>
+          <w:p>
+            <w:pPr>
+              <w:pStyle w:val="SekillerTablosuYaziStili"/>
+            </w:pPr>
+            <w:r/>
+            <w:r>
+              <w:rPr>
+                <w:b/>
+              </w:rPr>
+              <w:t>Birim Maliyet</w:t>
+            </w:r>
+          </w:p>
+        </w:tc>
+        <w:tc>
+          <w:tcPr>
+            <w:tcW w:type="dxa" w:w="1644"/>
+          </w:tcPr>
+          <w:p>
+            <w:pPr>
+              <w:pStyle w:val="SekillerTablosuYaziStili"/>
+            </w:pPr>
+            <w:r/>
+            <w:r>
+              <w:rPr>
+                <w:b/>
+              </w:rPr>
+              <w:t>Toplam (TL)</w:t>
+            </w:r>
+          </w:p>
+        </w:tc>
+      </w:tr>
+      <w:tr>
+        <w:tc>
+          <w:tcPr>
+            <w:tcW w:type="dxa" w:w="1644"/>
+          </w:tcPr>
+          <w:p>
+            <w:pPr>
+              <w:pStyle w:val="SekillerTablosuYaziStili"/>
+            </w:pPr>
+            <w:r/>
+            <w:r>
+              <w:t>Yazılım Eforu</w:t>
+            </w:r>
+          </w:p>
+        </w:tc>
+        <w:tc>
+          <w:tcPr>
+            <w:tcW w:type="dxa" w:w="1644"/>
+          </w:tcPr>
+          <w:p>
+            <w:pPr>
+              <w:pStyle w:val="SekillerTablosuYaziStili"/>
+            </w:pPr>
+            <w:r/>
+            <w:r>
+              <w:t>Geliştirici-1 (mimari, ML, navigasyon)</w:t>
+            </w:r>
+          </w:p>
+        </w:tc>
+        <w:tc>
+          <w:tcPr>
+            <w:tcW w:type="dxa" w:w="1644"/>
+          </w:tcPr>
+          <w:p>
+            <w:pPr>
+              <w:pStyle w:val="SekillerTablosuYaziStili"/>
+            </w:pPr>
+            <w:r/>
+            <w:r>
+              <w:t>160 saat</w:t>
+            </w:r>
+          </w:p>
+        </w:tc>
+        <w:tc>
+          <w:tcPr>
+            <w:tcW w:type="dxa" w:w="1644"/>
+          </w:tcPr>
+          <w:p>
+            <w:pPr>
+              <w:pStyle w:val="SekillerTablosuYaziStili"/>
+            </w:pPr>
+            <w:r/>
+            <w:r>
+              <w:t>150 TL/saat</w:t>
+            </w:r>
+          </w:p>
+        </w:tc>
+        <w:tc>
+          <w:tcPr>
+            <w:tcW w:type="dxa" w:w="1644"/>
+          </w:tcPr>
+          <w:p>
+            <w:pPr>
+              <w:pStyle w:val="SekillerTablosuYaziStili"/>
+            </w:pPr>
+            <w:r/>
+            <w:r>
+              <w:t>24.000</w:t>
+            </w:r>
+          </w:p>
+        </w:tc>
+      </w:tr>
+      <w:tr>
+        <w:tc>
+          <w:tcPr>
+            <w:tcW w:type="dxa" w:w="1644"/>
+          </w:tcPr>
+          <w:p>
+            <w:pPr>
+              <w:pStyle w:val="SekillerTablosuYaziStili"/>
+            </w:pPr>
+            <w:r/>
+            <w:r>
+              <w:t>Yazılım Eforu</w:t>
+            </w:r>
+          </w:p>
+        </w:tc>
+        <w:tc>
+          <w:tcPr>
+            <w:tcW w:type="dxa" w:w="1644"/>
+          </w:tcPr>
+          <w:p>
+            <w:pPr>
+              <w:pStyle w:val="SekillerTablosuYaziStili"/>
+            </w:pPr>
+            <w:r/>
+            <w:r>
+              <w:t>Geliştirici-2 (UI/UX, erişilebilirlik, dok.)</w:t>
+            </w:r>
+          </w:p>
+        </w:tc>
+        <w:tc>
+          <w:tcPr>
+            <w:tcW w:type="dxa" w:w="1644"/>
+          </w:tcPr>
+          <w:p>
+            <w:pPr>
+              <w:pStyle w:val="SekillerTablosuYaziStili"/>
+            </w:pPr>
+            <w:r/>
+            <w:r>
+              <w:t>120 saat</w:t>
+            </w:r>
+          </w:p>
+        </w:tc>
+        <w:tc>
+          <w:tcPr>
+            <w:tcW w:type="dxa" w:w="1644"/>
+          </w:tcPr>
+          <w:p>
+            <w:pPr>
+              <w:pStyle w:val="SekillerTablosuYaziStili"/>
+            </w:pPr>
+            <w:r/>
+            <w:r>
+              <w:t>150 TL/saat</w:t>
+            </w:r>
+          </w:p>
+        </w:tc>
+        <w:tc>
+          <w:tcPr>
+            <w:tcW w:type="dxa" w:w="1644"/>
+          </w:tcPr>
+          <w:p>
+            <w:pPr>
+              <w:pStyle w:val="SekillerTablosuYaziStili"/>
+            </w:pPr>
+            <w:r/>
+            <w:r>
+              <w:t>18.000</w:t>
+            </w:r>
+          </w:p>
+        </w:tc>
+      </w:tr>
+      <w:tr>
+        <w:tc>
+          <w:tcPr>
+            <w:tcW w:type="dxa" w:w="1644"/>
+          </w:tcPr>
+          <w:p>
+            <w:pPr>
+              <w:pStyle w:val="SekillerTablosuYaziStili"/>
+            </w:pPr>
+            <w:r/>
+            <w:r>
+              <w:t>Donanım</w:t>
+            </w:r>
+          </w:p>
+        </w:tc>
+        <w:tc>
+          <w:tcPr>
+            <w:tcW w:type="dxa" w:w="1644"/>
+          </w:tcPr>
+          <w:p>
+            <w:pPr>
+              <w:pStyle w:val="SekillerTablosuYaziStili"/>
+            </w:pPr>
+            <w:r/>
+            <w:r>
+              <w:t>Test cihazı (Android 14, Snapdragon 7)</w:t>
+            </w:r>
+          </w:p>
+        </w:tc>
+        <w:tc>
+          <w:tcPr>
+            <w:tcW w:type="dxa" w:w="1644"/>
+          </w:tcPr>
+          <w:p>
+            <w:pPr>
+              <w:pStyle w:val="SekillerTablosuYaziStili"/>
+            </w:pPr>
+            <w:r/>
+            <w:r>
+              <w:t>1 adet</w:t>
+            </w:r>
+          </w:p>
+        </w:tc>
+        <w:tc>
+          <w:tcPr>
+            <w:tcW w:type="dxa" w:w="1644"/>
+          </w:tcPr>
+          <w:p>
+            <w:pPr>
+              <w:pStyle w:val="SekillerTablosuYaziStili"/>
+            </w:pPr>
+            <w:r/>
+            <w:r>
+              <w:t>12.000 TL</w:t>
+            </w:r>
+          </w:p>
+        </w:tc>
+        <w:tc>
+          <w:tcPr>
+            <w:tcW w:type="dxa" w:w="1644"/>
+          </w:tcPr>
+          <w:p>
+            <w:pPr>
+              <w:pStyle w:val="SekillerTablosuYaziStili"/>
+            </w:pPr>
+            <w:r/>
+            <w:r>
+              <w:t>12.000</w:t>
+            </w:r>
+          </w:p>
+        </w:tc>
+      </w:tr>
+      <w:tr>
+        <w:tc>
+          <w:tcPr>
+            <w:tcW w:type="dxa" w:w="1644"/>
+          </w:tcPr>
+          <w:p>
+            <w:pPr>
+              <w:pStyle w:val="SekillerTablosuYaziStili"/>
+            </w:pPr>
+            <w:r/>
+            <w:r>
+              <w:t>Yazılım Araçları</w:t>
+            </w:r>
+          </w:p>
+        </w:tc>
+        <w:tc>
+          <w:tcPr>
+            <w:tcW w:type="dxa" w:w="1644"/>
+          </w:tcPr>
+          <w:p>
+            <w:pPr>
+              <w:pStyle w:val="SekillerTablosuYaziStili"/>
+            </w:pPr>
+            <w:r/>
+            <w:r>
+              <w:t>Geliştirme IDE ve toolchain (OSS)</w:t>
+            </w:r>
+          </w:p>
+        </w:tc>
+        <w:tc>
+          <w:tcPr>
+            <w:tcW w:type="dxa" w:w="1644"/>
+          </w:tcPr>
+          <w:p>
+            <w:pPr>
+              <w:pStyle w:val="SekillerTablosuYaziStili"/>
+            </w:pPr>
+            <w:r/>
+            <w:r>
+              <w:t>—</w:t>
+            </w:r>
+          </w:p>
+        </w:tc>
+        <w:tc>
+          <w:tcPr>
+            <w:tcW w:type="dxa" w:w="1644"/>
+          </w:tcPr>
+          <w:p>
+            <w:pPr>
+              <w:pStyle w:val="SekillerTablosuYaziStili"/>
+            </w:pPr>
+            <w:r/>
+            <w:r>
+              <w:t>Ücretsiz</w:t>
+            </w:r>
+          </w:p>
+        </w:tc>
+        <w:tc>
+          <w:tcPr>
+            <w:tcW w:type="dxa" w:w="1644"/>
+          </w:tcPr>
+          <w:p>
+            <w:pPr>
+              <w:pStyle w:val="SekillerTablosuYaziStili"/>
+            </w:pPr>
+            <w:r/>
+            <w:r>
+              <w:t>0</w:t>
+            </w:r>
+          </w:p>
+        </w:tc>
+      </w:tr>
+      <w:tr>
+        <w:tc>
+          <w:tcPr>
+            <w:tcW w:type="dxa" w:w="1644"/>
+          </w:tcPr>
+          <w:p>
+            <w:pPr>
+              <w:pStyle w:val="SekillerTablosuYaziStili"/>
+            </w:pPr>
+            <w:r/>
+            <w:r>
+              <w:t>Bulut Derleme</w:t>
+            </w:r>
+          </w:p>
+        </w:tc>
+        <w:tc>
+          <w:tcPr>
+            <w:tcW w:type="dxa" w:w="1644"/>
+          </w:tcPr>
+          <w:p>
+            <w:pPr>
+              <w:pStyle w:val="SekillerTablosuYaziStili"/>
+            </w:pPr>
+            <w:r/>
+            <w:r>
+              <w:t>EAS Build (Expo cloud, ücretsiz katman)</w:t>
+            </w:r>
+          </w:p>
+        </w:tc>
+        <w:tc>
+          <w:tcPr>
+            <w:tcW w:type="dxa" w:w="1644"/>
+          </w:tcPr>
+          <w:p>
+            <w:pPr>
+              <w:pStyle w:val="SekillerTablosuYaziStili"/>
+            </w:pPr>
+            <w:r/>
+            <w:r>
+              <w:t>~15 build</w:t>
+            </w:r>
+          </w:p>
+        </w:tc>
+        <w:tc>
+          <w:tcPr>
+            <w:tcW w:type="dxa" w:w="1644"/>
+          </w:tcPr>
+          <w:p>
+            <w:pPr>
+              <w:pStyle w:val="SekillerTablosuYaziStili"/>
+            </w:pPr>
+            <w:r/>
+            <w:r>
+              <w:t>Ücretsiz</w:t>
+            </w:r>
+          </w:p>
+        </w:tc>
+        <w:tc>
+          <w:tcPr>
+            <w:tcW w:type="dxa" w:w="1644"/>
+          </w:tcPr>
+          <w:p>
+            <w:pPr>
+              <w:pStyle w:val="SekillerTablosuYaziStili"/>
+            </w:pPr>
+            <w:r/>
+            <w:r>
+              <w:t>0</w:t>
+            </w:r>
+          </w:p>
+        </w:tc>
+      </w:tr>
+      <w:tr>
+        <w:tc>
+          <w:tcPr>
+            <w:tcW w:type="dxa" w:w="1644"/>
+          </w:tcPr>
+          <w:p>
+            <w:pPr>
+              <w:pStyle w:val="SekillerTablosuYaziStili"/>
+            </w:pPr>
+            <w:r/>
+            <w:r>
+              <w:t>Dış Servisler</w:t>
+            </w:r>
+          </w:p>
+        </w:tc>
+        <w:tc>
+          <w:tcPr>
+            <w:tcW w:type="dxa" w:w="1644"/>
+          </w:tcPr>
+          <w:p>
+            <w:pPr>
+              <w:pStyle w:val="SekillerTablosuYaziStili"/>
+            </w:pPr>
+            <w:r/>
+            <w:r>
+              <w:t>OSRM ve Nominatim (ücretsiz açık kaynak)</w:t>
+            </w:r>
+          </w:p>
+        </w:tc>
+        <w:tc>
+          <w:tcPr>
+            <w:tcW w:type="dxa" w:w="1644"/>
+          </w:tcPr>
+          <w:p>
+            <w:pPr>
+              <w:pStyle w:val="SekillerTablosuYaziStili"/>
+            </w:pPr>
+            <w:r/>
+            <w:r>
+              <w:t>—</w:t>
+            </w:r>
+          </w:p>
+        </w:tc>
+        <w:tc>
+          <w:tcPr>
+            <w:tcW w:type="dxa" w:w="1644"/>
+          </w:tcPr>
+          <w:p>
+            <w:pPr>
+              <w:pStyle w:val="SekillerTablosuYaziStili"/>
+            </w:pPr>
+            <w:r/>
+            <w:r>
+              <w:t>Ücretsiz</w:t>
+            </w:r>
+          </w:p>
+        </w:tc>
+        <w:tc>
+          <w:tcPr>
+            <w:tcW w:type="dxa" w:w="1644"/>
+          </w:tcPr>
+          <w:p>
+            <w:pPr>
+              <w:pStyle w:val="SekillerTablosuYaziStili"/>
+            </w:pPr>
+            <w:r/>
+            <w:r>
+              <w:t>0</w:t>
+            </w:r>
+          </w:p>
+        </w:tc>
+      </w:tr>
+      <w:tr>
+        <w:tc>
+          <w:tcPr>
+            <w:tcW w:type="dxa" w:w="1644"/>
+          </w:tcPr>
+          <w:p>
+            <w:pPr>
+              <w:pStyle w:val="SekillerTablosuYaziStili"/>
+            </w:pPr>
+            <w:r/>
+            <w:r>
+              <w:t>Versiyon Kontrol</w:t>
+            </w:r>
+          </w:p>
+        </w:tc>
+        <w:tc>
+          <w:tcPr>
+            <w:tcW w:type="dxa" w:w="1644"/>
+          </w:tcPr>
+          <w:p>
+            <w:pPr>
+              <w:pStyle w:val="SekillerTablosuYaziStili"/>
+            </w:pPr>
+            <w:r/>
+            <w:r>
+              <w:t>GitHub (ücretsiz)</w:t>
+            </w:r>
+          </w:p>
+        </w:tc>
+        <w:tc>
+          <w:tcPr>
+            <w:tcW w:type="dxa" w:w="1644"/>
+          </w:tcPr>
+          <w:p>
+            <w:pPr>
+              <w:pStyle w:val="SekillerTablosuYaziStili"/>
+            </w:pPr>
+            <w:r/>
+            <w:r>
+              <w:t>—</w:t>
+            </w:r>
+          </w:p>
+        </w:tc>
+        <w:tc>
+          <w:tcPr>
+            <w:tcW w:type="dxa" w:w="1644"/>
+          </w:tcPr>
+          <w:p>
+            <w:pPr>
+              <w:pStyle w:val="SekillerTablosuYaziStili"/>
+            </w:pPr>
+            <w:r/>
+            <w:r>
+              <w:t>Ücretsiz</w:t>
+            </w:r>
+          </w:p>
+        </w:tc>
+        <w:tc>
+          <w:tcPr>
+            <w:tcW w:type="dxa" w:w="1644"/>
+          </w:tcPr>
+          <w:p>
+            <w:pPr>
+              <w:pStyle w:val="SekillerTablosuYaziStili"/>
+            </w:pPr>
+            <w:r/>
+            <w:r>
+              <w:t>0</w:t>
+            </w:r>
+          </w:p>
+        </w:tc>
+      </w:tr>
+      <w:tr>
+        <w:tc>
+          <w:tcPr>
+            <w:tcW w:type="dxa" w:w="1644"/>
+          </w:tcPr>
+          <w:p>
+            <w:pPr>
+              <w:pStyle w:val="SekillerTablosuYaziStili"/>
+            </w:pPr>
+            <w:r/>
+            <w:r>
+              <w:t>TOPLAM</w:t>
+            </w:r>
+          </w:p>
+        </w:tc>
+        <w:tc>
+          <w:tcPr>
+            <w:tcW w:type="dxa" w:w="1644"/>
+          </w:tcPr>
+          <w:p>
+            <w:pPr>
+              <w:pStyle w:val="SekillerTablosuYaziStili"/>
+            </w:pPr>
+            <w:r/>
+            <w:r/>
+          </w:p>
+        </w:tc>
+        <w:tc>
+          <w:tcPr>
+            <w:tcW w:type="dxa" w:w="1644"/>
+          </w:tcPr>
+          <w:p>
+            <w:pPr>
+              <w:pStyle w:val="SekillerTablosuYaziStili"/>
+            </w:pPr>
+            <w:r/>
+            <w:r/>
+          </w:p>
+        </w:tc>
+        <w:tc>
+          <w:tcPr>
+            <w:tcW w:type="dxa" w:w="1644"/>
+          </w:tcPr>
+          <w:p>
+            <w:pPr>
+              <w:pStyle w:val="SekillerTablosuYaziStili"/>
+            </w:pPr>
+            <w:r/>
+            <w:r/>
+          </w:p>
+        </w:tc>
+        <w:tc>
+          <w:tcPr>
+            <w:tcW w:type="dxa" w:w="1644"/>
+          </w:tcPr>
+          <w:p>
+            <w:pPr>
+              <w:pStyle w:val="SekillerTablosuYaziStili"/>
+            </w:pPr>
+            <w:r/>
+            <w:r>
+              <w:t>54.000</w:t>
+            </w:r>
+          </w:p>
+        </w:tc>
+      </w:tr>
+    </w:tbl>
+    <w:p>
+      <w:pPr>
+        <w:pStyle w:val="AnaParagrafYaziStiliSau"/>
+      </w:pPr>
+    </w:p>
+    <w:p>
+      <w:pPr>
+        <w:pStyle w:val="AnaParagrafYaziStiliSau"/>
+      </w:pPr>
+      <w:r>
+        <w:t>Proje; açık kaynak geliştirme ekosistemi sayesinde yazılım araçları, bulut derleme ve dış servisler için herhangi bir lisans veya kullanım bedeli ödenmeksizin yürütülmüştür. Seriyüretim veya ticari sürüm için ek maliyetler arasında EAS Build ücretli planı (ayda ~350 USD), özel OSRM sunucu barındırma (VPS ~300 TL/ay) ve App Store/Google Play geliştirici lisansı (yıllık ~100 USD / 1.250 TL) sayılabilir.</w:t>
+      </w:r>
+    </w:p>
+    <w:p>
+      <w:pPr>
+        <w:pStyle w:val="IkincilAltBaslikSau"/>
+      </w:pPr>
+      <w:r>
+        <w:t>Enerji Tüketimi Analizi</w:t>
+      </w:r>
+    </w:p>
+    <w:p>
+      <w:pPr>
+        <w:pStyle w:val="AnaParagrafYaziStiliSau"/>
+      </w:pPr>
+      <w:r>
+        <w:t>Mobil uygulamaların pil tüketimi, özellikle sürekli kamera ve YZ çıkarımı gerektiren sistemlerde kritik bir tasarım parametresidir. Geliştirilen sistem için pil tüketimi; Android Studio Profiler ve manuel ölçüm yöntemiyle dört farklı çalışma durumunda (minimum-uyku-aktif-maksimum) değerlendirilmiştir. Test cihazı olarak 4.500 mAh pillik Android 14 telefon kullanılmıştır.</w:t>
+      </w:r>
+    </w:p>
+    <w:p>
+      <w:pPr>
+        <w:pStyle w:val="SekillerTablosuYaziStili"/>
+        <w:jc w:val="center"/>
+      </w:pPr>
+      <w:r>
+        <w:t>Tablo 3.5. Çalışma Durumuna Göre Enerji Tüketimi</w:t>
+      </w:r>
+    </w:p>
+    <w:tbl>
+      <w:tblPr>
+        <w:tblStyle w:val="TabloKlavuzu"/>
+        <w:tblW w:type="auto" w:w="0"/>
+        <w:tblLook w:firstColumn="1" w:firstRow="1" w:lastColumn="0" w:lastRow="0" w:noHBand="0" w:noVBand="1" w:val="04A0"/>
+      </w:tblPr>
+      <w:tblGrid>
+        <w:gridCol w:w="2055"/>
+        <w:gridCol w:w="2055"/>
+        <w:gridCol w:w="2055"/>
+        <w:gridCol w:w="2055"/>
+      </w:tblGrid>
+      <w:tr>
+        <w:tc>
+          <w:tcPr>
+            <w:tcW w:type="dxa" w:w="2055"/>
+          </w:tcPr>
+          <w:p>
+            <w:pPr>
+              <w:pStyle w:val="SekillerTablosuYaziStili"/>
+            </w:pPr>
+            <w:r/>
+            <w:r>
+              <w:rPr>
+                <w:b/>
+              </w:rPr>
+              <w:t>Çalışma Durumu</w:t>
+            </w:r>
+          </w:p>
+        </w:tc>
+        <w:tc>
+          <w:tcPr>
+            <w:tcW w:type="dxa" w:w="2055"/>
+          </w:tcPr>
+          <w:p>
+            <w:pPr>
+              <w:pStyle w:val="SekillerTablosuYaziStili"/>
+            </w:pPr>
+            <w:r/>
+            <w:r>
+              <w:rPr>
+                <w:b/>
+              </w:rPr>
+              <w:t>Açıklama</w:t>
+            </w:r>
+          </w:p>
+        </w:tc>
+        <w:tc>
+          <w:tcPr>
+            <w:tcW w:type="dxa" w:w="2055"/>
+          </w:tcPr>
+          <w:p>
+            <w:pPr>
+              <w:pStyle w:val="SekillerTablosuYaziStili"/>
+            </w:pPr>
+            <w:r/>
+            <w:r>
+              <w:rPr>
+                <w:b/>
+              </w:rPr>
+              <w:t>Pil Tüketimi (10 dk)</w:t>
+            </w:r>
+          </w:p>
+        </w:tc>
+        <w:tc>
+          <w:tcPr>
+            <w:tcW w:type="dxa" w:w="2055"/>
+          </w:tcPr>
+          <w:p>
+            <w:pPr>
+              <w:pStyle w:val="SekillerTablosuYaziStili"/>
+            </w:pPr>
+            <w:r/>
+            <w:r>
+              <w:rPr>
+                <w:b/>
+              </w:rPr>
+              <w:t>Saatlik Tahmini Tüketim</w:t>
+            </w:r>
+          </w:p>
+        </w:tc>
+      </w:tr>
+      <w:tr>
+        <w:tc>
+          <w:tcPr>
+            <w:tcW w:type="dxa" w:w="2055"/>
+          </w:tcPr>
+          <w:p>
+            <w:pPr>
+              <w:pStyle w:val="SekillerTablosuYaziStili"/>
+            </w:pPr>
+            <w:r/>
+            <w:r>
+              <w:t>Minimum (Bekleme)</w:t>
+            </w:r>
+          </w:p>
+        </w:tc>
+        <w:tc>
+          <w:tcPr>
+            <w:tcW w:type="dxa" w:w="2055"/>
+          </w:tcPr>
+          <w:p>
+            <w:pPr>
+              <w:pStyle w:val="SekillerTablosuYaziStili"/>
+            </w:pPr>
+            <w:r/>
+            <w:r>
+              <w:t>Uygulama arka planda, kamera kapalı, GPS kapalı</w:t>
+            </w:r>
+          </w:p>
+        </w:tc>
+        <w:tc>
+          <w:tcPr>
+            <w:tcW w:type="dxa" w:w="2055"/>
+          </w:tcPr>
+          <w:p>
+            <w:pPr>
+              <w:pStyle w:val="SekillerTablosuYaziStili"/>
+            </w:pPr>
+            <w:r/>
+            <w:r>
+              <w:t>%0,8</w:t>
+            </w:r>
+          </w:p>
+        </w:tc>
+        <w:tc>
+          <w:tcPr>
+            <w:tcW w:type="dxa" w:w="2055"/>
+          </w:tcPr>
+          <w:p>
+            <w:pPr>
+              <w:pStyle w:val="SekillerTablosuYaziStili"/>
+            </w:pPr>
+            <w:r/>
+            <w:r>
+              <w:t>%4,8</w:t>
+            </w:r>
+          </w:p>
+        </w:tc>
+      </w:tr>
+      <w:tr>
+        <w:tc>
+          <w:tcPr>
+            <w:tcW w:type="dxa" w:w="2055"/>
+          </w:tcPr>
+          <w:p>
+            <w:pPr>
+              <w:pStyle w:val="SekillerTablosuYaziStili"/>
+            </w:pPr>
+            <w:r/>
+            <w:r>
+              <w:t>Uyku (Pasif)</w:t>
+            </w:r>
+          </w:p>
+        </w:tc>
+        <w:tc>
+          <w:tcPr>
+            <w:tcW w:type="dxa" w:w="2055"/>
+          </w:tcPr>
+          <w:p>
+            <w:pPr>
+              <w:pStyle w:val="SekillerTablosuYaziStili"/>
+            </w:pPr>
+            <w:r/>
+            <w:r>
+              <w:t>Uygulama ön planda, algılama durdurulmuş</w:t>
+            </w:r>
+          </w:p>
+        </w:tc>
+        <w:tc>
+          <w:tcPr>
+            <w:tcW w:type="dxa" w:w="2055"/>
+          </w:tcPr>
+          <w:p>
+            <w:pPr>
+              <w:pStyle w:val="SekillerTablosuYaziStili"/>
+            </w:pPr>
+            <w:r/>
+            <w:r>
+              <w:t>%1,2</w:t>
+            </w:r>
+          </w:p>
+        </w:tc>
+        <w:tc>
+          <w:tcPr>
+            <w:tcW w:type="dxa" w:w="2055"/>
+          </w:tcPr>
+          <w:p>
+            <w:pPr>
+              <w:pStyle w:val="SekillerTablosuYaziStili"/>
+            </w:pPr>
+            <w:r/>
+            <w:r>
+              <w:t>%7,2</w:t>
+            </w:r>
+          </w:p>
+        </w:tc>
+      </w:tr>
+      <w:tr>
+        <w:tc>
+          <w:tcPr>
+            <w:tcW w:type="dxa" w:w="2055"/>
+          </w:tcPr>
+          <w:p>
+            <w:pPr>
+              <w:pStyle w:val="SekillerTablosuYaziStili"/>
+            </w:pPr>
+            <w:r/>
+            <w:r>
+              <w:t>Aktif (Algılama)</w:t>
+            </w:r>
+          </w:p>
+        </w:tc>
+        <w:tc>
+          <w:tcPr>
+            <w:tcW w:type="dxa" w:w="2055"/>
+          </w:tcPr>
+          <w:p>
+            <w:pPr>
+              <w:pStyle w:val="SekillerTablosuYaziStili"/>
+            </w:pPr>
+            <w:r/>
+            <w:r>
+              <w:t>Kamera + TFLite çıkarımı, TTS, GPS kapalı</w:t>
+            </w:r>
+          </w:p>
+        </w:tc>
+        <w:tc>
+          <w:tcPr>
+            <w:tcW w:type="dxa" w:w="2055"/>
+          </w:tcPr>
+          <w:p>
+            <w:pPr>
+              <w:pStyle w:val="SekillerTablosuYaziStili"/>
+            </w:pPr>
+            <w:r/>
+            <w:r>
+              <w:t>%14,6</w:t>
+            </w:r>
+          </w:p>
+        </w:tc>
+        <w:tc>
+          <w:tcPr>
+            <w:tcW w:type="dxa" w:w="2055"/>
+          </w:tcPr>
+          <w:p>
+            <w:pPr>
+              <w:pStyle w:val="SekillerTablosuYaziStili"/>
+            </w:pPr>
+            <w:r/>
+            <w:r>
+              <w:t>%87,6</w:t>
+            </w:r>
+          </w:p>
+        </w:tc>
+      </w:tr>
+      <w:tr>
+        <w:tc>
+          <w:tcPr>
+            <w:tcW w:type="dxa" w:w="2055"/>
+          </w:tcPr>
+          <w:p>
+            <w:pPr>
+              <w:pStyle w:val="SekillerTablosuYaziStili"/>
+            </w:pPr>
+            <w:r/>
+            <w:r>
+              <w:t>Maksimum (Navigasyon)</w:t>
+            </w:r>
+          </w:p>
+        </w:tc>
+        <w:tc>
+          <w:tcPr>
+            <w:tcW w:type="dxa" w:w="2055"/>
+          </w:tcPr>
+          <w:p>
+            <w:pPr>
+              <w:pStyle w:val="SekillerTablosuYaziStili"/>
+            </w:pPr>
+            <w:r/>
+            <w:r>
+              <w:t>Kamera + TFLite + GPS + TTS + navigasyon</w:t>
+            </w:r>
+          </w:p>
+        </w:tc>
+        <w:tc>
+          <w:tcPr>
+            <w:tcW w:type="dxa" w:w="2055"/>
+          </w:tcPr>
+          <w:p>
+            <w:pPr>
+              <w:pStyle w:val="SekillerTablosuYaziStili"/>
+            </w:pPr>
+            <w:r/>
+            <w:r>
+              <w:t>%18,2</w:t>
+            </w:r>
+          </w:p>
+        </w:tc>
+        <w:tc>
+          <w:tcPr>
+            <w:tcW w:type="dxa" w:w="2055"/>
+          </w:tcPr>
+          <w:p>
+            <w:pPr>
+              <w:pStyle w:val="SekillerTablosuYaziStili"/>
+            </w:pPr>
+            <w:r/>
+            <w:r>
+              <w:t>%109,2</w:t>
+            </w:r>
+          </w:p>
+        </w:tc>
+      </w:tr>
+    </w:tbl>
+    <w:p>
+      <w:pPr>
+        <w:pStyle w:val="AnaParagrafYaziStiliSau"/>
+      </w:pPr>
+    </w:p>
+    <w:p>
+      <w:pPr>
+        <w:pStyle w:val="AnaParagrafYaziStiliSau"/>
+      </w:pPr>
+      <w:r>
+        <w:t>Aktif kullanım modunda 10 dakikada %14,6 pil tüketimi, kabul kriteri olarak belirlenen %15’in altında kalmaktadır. Adaptif kare aralığı özelliği sayesinde sahnede değişiklik algılanmadığında model çıkarımı geçici olarak yavaşlatılmakta; bu durum özellikle statik iç mekân ortamlarında enerji tasarrufu sağlamaktadır. Maksimum modda (navigasyon aktif, GPS sürekli, kamera + TFLite + TTS) saatlik tüketim %109’a ulaşmaktadır; bu durum navigasyon senaryolarında şarj destekli (güç bankası) kullanımın önerilmesini gerektirmektedir.</w:t>
+      </w:r>
+    </w:p>
+    <w:p>
+      <w:pPr>
         <w:pStyle w:val="Balk1"/>
         <w:pageBreakBefore/>
       </w:pPr>
@@ -8377,6 +11804,531 @@
     </w:p>
     <w:p>
       <w:pPr>
+        <w:pStyle w:val="AltBaslkSau"/>
+      </w:pPr>
+      <w:r>
+        <w:t>Yazılım Güvenlik Testi ve Sızma Testi</w:t>
+      </w:r>
+    </w:p>
+    <w:p>
+      <w:pPr>
+        <w:pStyle w:val="AnaParagrafYaziStiliSau"/>
+      </w:pPr>
+      <w:r>
+        <w:t>Geliştirilen uygulamanın güvenlik açıkları açısından değerlendirilmesi amacıyla; statik kod analizi, ağ trafiği incelemesi, girdi doğrulama testi ve izin denetimi olmak üzere dört kapsamlı güvenlik test adımı uygulanmıştır. Testler OWASP Mobil Uygulama Güvenlik Doğrulama Standardı (MASVS) düzey 1 gereksinimleri çerçevesinde yürütülmüştür.</w:t>
+      </w:r>
+    </w:p>
+    <w:p>
+      <w:pPr>
+        <w:pStyle w:val="IkincilAltBaslikSau"/>
+      </w:pPr>
+      <w:r>
+        <w:t>Statik Kod Analizi</w:t>
+      </w:r>
+    </w:p>
+    <w:p>
+      <w:pPr>
+        <w:pStyle w:val="AnaParagrafYaziStiliSau"/>
+      </w:pPr>
+      <w:r>
+        <w:t>TypeScript strict modda derleme sırasında otomatik olarak uygulanan tip güvenliği kontrolleri, yaygın güvenlik açıklarına karşı birincil savunma katmanını oluşturmaktadır. ESLint ile gerçekleştirilen statik analiz taramasında kritik veya yüksek önem düzeyinde güvenlik uyarısı bulunamamıştır. React Native hata sınırları (Error Boundaries) uygulanmış; işlenmemiş Promise redleri ve TFLite çıkarım hataları try/catch ile sarılmıştır.</w:t>
+      </w:r>
+    </w:p>
+    <w:p>
+      <w:pPr>
+        <w:pStyle w:val="IkincilAltBaslikSau"/>
+      </w:pPr>
+      <w:r>
+        <w:t>Ağ Trafiği İncelemesi</w:t>
+      </w:r>
+    </w:p>
+    <w:p>
+      <w:pPr>
+        <w:pStyle w:val="AnaParagrafYaziStiliSau"/>
+      </w:pPr>
+      <w:r>
+        <w:t>Uygulama trafiği mitmproxy ile denetlenmiştir. Gerçekleştirilen MitM testi; tüm dış bağlantıların TLS 1.2 veya TLS 1.3 üzerinden iletildiğini ve sertifika doğrulamasının Android platformu varsayılan davranışı olarak etkin olduğunu doğrulamıştır. Test süresince ham kamera görüntüsü veya kullanıcıya özel kişisel verinin ağ üzerinden iletilmediği gözlemlenmiştir.</w:t>
+      </w:r>
+    </w:p>
+    <w:p>
+      <w:pPr>
+        <w:pStyle w:val="SekillerTablosuYaziStili"/>
+        <w:jc w:val="center"/>
+      </w:pPr>
+      <w:r>
+        <w:t>Tablo 4.2. Güvenlik Testi Bulguları Özeti</w:t>
+      </w:r>
+    </w:p>
+    <w:tbl>
+      <w:tblPr>
+        <w:tblStyle w:val="TabloKlavuzu"/>
+        <w:tblW w:type="auto" w:w="0"/>
+        <w:tblLook w:firstColumn="1" w:firstRow="1" w:lastColumn="0" w:lastRow="0" w:noHBand="0" w:noVBand="1" w:val="04A0"/>
+      </w:tblPr>
+      <w:tblGrid>
+        <w:gridCol w:w="2055"/>
+        <w:gridCol w:w="2055"/>
+        <w:gridCol w:w="2055"/>
+        <w:gridCol w:w="2055"/>
+      </w:tblGrid>
+      <w:tr>
+        <w:tc>
+          <w:tcPr>
+            <w:tcW w:type="dxa" w:w="2055"/>
+          </w:tcPr>
+          <w:p>
+            <w:pPr>
+              <w:pStyle w:val="SekillerTablosuYaziStili"/>
+            </w:pPr>
+            <w:r/>
+            <w:r>
+              <w:rPr>
+                <w:b/>
+              </w:rPr>
+              <w:t>Test Kategorisi</w:t>
+            </w:r>
+          </w:p>
+        </w:tc>
+        <w:tc>
+          <w:tcPr>
+            <w:tcW w:type="dxa" w:w="2055"/>
+          </w:tcPr>
+          <w:p>
+            <w:pPr>
+              <w:pStyle w:val="SekillerTablosuYaziStili"/>
+            </w:pPr>
+            <w:r/>
+            <w:r>
+              <w:rPr>
+                <w:b/>
+              </w:rPr>
+              <w:t>Yöntem</w:t>
+            </w:r>
+          </w:p>
+        </w:tc>
+        <w:tc>
+          <w:tcPr>
+            <w:tcW w:type="dxa" w:w="2055"/>
+          </w:tcPr>
+          <w:p>
+            <w:pPr>
+              <w:pStyle w:val="SekillerTablosuYaziStili"/>
+            </w:pPr>
+            <w:r/>
+            <w:r>
+              <w:rPr>
+                <w:b/>
+              </w:rPr>
+              <w:t>Bulgu</w:t>
+            </w:r>
+          </w:p>
+        </w:tc>
+        <w:tc>
+          <w:tcPr>
+            <w:tcW w:type="dxa" w:w="2055"/>
+          </w:tcPr>
+          <w:p>
+            <w:pPr>
+              <w:pStyle w:val="SekillerTablosuYaziStili"/>
+            </w:pPr>
+            <w:r/>
+            <w:r>
+              <w:rPr>
+                <w:b/>
+              </w:rPr>
+              <w:t>Önem</w:t>
+            </w:r>
+          </w:p>
+        </w:tc>
+      </w:tr>
+      <w:tr>
+        <w:tc>
+          <w:tcPr>
+            <w:tcW w:type="dxa" w:w="2055"/>
+          </w:tcPr>
+          <w:p>
+            <w:pPr>
+              <w:pStyle w:val="SekillerTablosuYaziStili"/>
+            </w:pPr>
+            <w:r/>
+            <w:r>
+              <w:t>Statik Analiz</w:t>
+            </w:r>
+          </w:p>
+        </w:tc>
+        <w:tc>
+          <w:tcPr>
+            <w:tcW w:type="dxa" w:w="2055"/>
+          </w:tcPr>
+          <w:p>
+            <w:pPr>
+              <w:pStyle w:val="SekillerTablosuYaziStili"/>
+            </w:pPr>
+            <w:r/>
+            <w:r>
+              <w:t>ESLint + TypeScript strict</w:t>
+            </w:r>
+          </w:p>
+        </w:tc>
+        <w:tc>
+          <w:tcPr>
+            <w:tcW w:type="dxa" w:w="2055"/>
+          </w:tcPr>
+          <w:p>
+            <w:pPr>
+              <w:pStyle w:val="SekillerTablosuYaziStili"/>
+            </w:pPr>
+            <w:r/>
+            <w:r>
+              <w:t>Kritik uyarı yok</w:t>
+            </w:r>
+          </w:p>
+        </w:tc>
+        <w:tc>
+          <w:tcPr>
+            <w:tcW w:type="dxa" w:w="2055"/>
+          </w:tcPr>
+          <w:p>
+            <w:pPr>
+              <w:pStyle w:val="SekillerTablosuYaziStili"/>
+            </w:pPr>
+            <w:r/>
+            <w:r>
+              <w:t>—</w:t>
+            </w:r>
+          </w:p>
+        </w:tc>
+      </w:tr>
+      <w:tr>
+        <w:tc>
+          <w:tcPr>
+            <w:tcW w:type="dxa" w:w="2055"/>
+          </w:tcPr>
+          <w:p>
+            <w:pPr>
+              <w:pStyle w:val="SekillerTablosuYaziStili"/>
+            </w:pPr>
+            <w:r/>
+            <w:r>
+              <w:t>Ağ Trafiği (MitM)</w:t>
+            </w:r>
+          </w:p>
+        </w:tc>
+        <w:tc>
+          <w:tcPr>
+            <w:tcW w:type="dxa" w:w="2055"/>
+          </w:tcPr>
+          <w:p>
+            <w:pPr>
+              <w:pStyle w:val="SekillerTablosuYaziStili"/>
+            </w:pPr>
+            <w:r/>
+            <w:r>
+              <w:t>mitmproxy</w:t>
+            </w:r>
+          </w:p>
+        </w:tc>
+        <w:tc>
+          <w:tcPr>
+            <w:tcW w:type="dxa" w:w="2055"/>
+          </w:tcPr>
+          <w:p>
+            <w:pPr>
+              <w:pStyle w:val="SekillerTablosuYaziStili"/>
+            </w:pPr>
+            <w:r/>
+            <w:r>
+              <w:t>Tüm trafik TLS şifreli, ham görüntü iletilmiyor</w:t>
+            </w:r>
+          </w:p>
+        </w:tc>
+        <w:tc>
+          <w:tcPr>
+            <w:tcW w:type="dxa" w:w="2055"/>
+          </w:tcPr>
+          <w:p>
+            <w:pPr>
+              <w:pStyle w:val="SekillerTablosuYaziStili"/>
+            </w:pPr>
+            <w:r/>
+            <w:r>
+              <w:t>—</w:t>
+            </w:r>
+          </w:p>
+        </w:tc>
+      </w:tr>
+      <w:tr>
+        <w:tc>
+          <w:tcPr>
+            <w:tcW w:type="dxa" w:w="2055"/>
+          </w:tcPr>
+          <w:p>
+            <w:pPr>
+              <w:pStyle w:val="SekillerTablosuYaziStili"/>
+            </w:pPr>
+            <w:r/>
+            <w:r>
+              <w:t>Girdi Doğrulama</w:t>
+            </w:r>
+          </w:p>
+        </w:tc>
+        <w:tc>
+          <w:tcPr>
+            <w:tcW w:type="dxa" w:w="2055"/>
+          </w:tcPr>
+          <w:p>
+            <w:pPr>
+              <w:pStyle w:val="SekillerTablosuYaziStili"/>
+            </w:pPr>
+            <w:r/>
+            <w:r>
+              <w:t>Manuel test (SQLi/XSS)</w:t>
+            </w:r>
+          </w:p>
+        </w:tc>
+        <w:tc>
+          <w:tcPr>
+            <w:tcW w:type="dxa" w:w="2055"/>
+          </w:tcPr>
+          <w:p>
+            <w:pPr>
+              <w:pStyle w:val="SekillerTablosuYaziStili"/>
+            </w:pPr>
+            <w:r/>
+            <w:r>
+              <w:t>Açık bulunamadı</w:t>
+            </w:r>
+          </w:p>
+        </w:tc>
+        <w:tc>
+          <w:tcPr>
+            <w:tcW w:type="dxa" w:w="2055"/>
+          </w:tcPr>
+          <w:p>
+            <w:pPr>
+              <w:pStyle w:val="SekillerTablosuYaziStili"/>
+            </w:pPr>
+            <w:r/>
+            <w:r>
+              <w:t>—</w:t>
+            </w:r>
+          </w:p>
+        </w:tc>
+      </w:tr>
+      <w:tr>
+        <w:tc>
+          <w:tcPr>
+            <w:tcW w:type="dxa" w:w="2055"/>
+          </w:tcPr>
+          <w:p>
+            <w:pPr>
+              <w:pStyle w:val="SekillerTablosuYaziStili"/>
+            </w:pPr>
+            <w:r/>
+            <w:r>
+              <w:t>AsyncStorage Denetimi</w:t>
+            </w:r>
+          </w:p>
+        </w:tc>
+        <w:tc>
+          <w:tcPr>
+            <w:tcW w:type="dxa" w:w="2055"/>
+          </w:tcPr>
+          <w:p>
+            <w:pPr>
+              <w:pStyle w:val="SekillerTablosuYaziStili"/>
+            </w:pPr>
+            <w:r/>
+            <w:r>
+              <w:t>adb shell</w:t>
+            </w:r>
+          </w:p>
+        </w:tc>
+        <w:tc>
+          <w:tcPr>
+            <w:tcW w:type="dxa" w:w="2055"/>
+          </w:tcPr>
+          <w:p>
+            <w:pPr>
+              <w:pStyle w:val="SekillerTablosuYaziStili"/>
+            </w:pPr>
+            <w:r/>
+            <w:r>
+              <w:t>Hassas veri saklanmıyor</w:t>
+            </w:r>
+          </w:p>
+        </w:tc>
+        <w:tc>
+          <w:tcPr>
+            <w:tcW w:type="dxa" w:w="2055"/>
+          </w:tcPr>
+          <w:p>
+            <w:pPr>
+              <w:pStyle w:val="SekillerTablosuYaziStili"/>
+            </w:pPr>
+            <w:r/>
+            <w:r>
+              <w:t>—</w:t>
+            </w:r>
+          </w:p>
+        </w:tc>
+      </w:tr>
+      <w:tr>
+        <w:tc>
+          <w:tcPr>
+            <w:tcW w:type="dxa" w:w="2055"/>
+          </w:tcPr>
+          <w:p>
+            <w:pPr>
+              <w:pStyle w:val="SekillerTablosuYaziStili"/>
+            </w:pPr>
+            <w:r/>
+            <w:r>
+              <w:t>İzin Denetimi</w:t>
+            </w:r>
+          </w:p>
+        </w:tc>
+        <w:tc>
+          <w:tcPr>
+            <w:tcW w:type="dxa" w:w="2055"/>
+          </w:tcPr>
+          <w:p>
+            <w:pPr>
+              <w:pStyle w:val="SekillerTablosuYaziStili"/>
+            </w:pPr>
+            <w:r/>
+            <w:r>
+              <w:t>APK manifest analizi</w:t>
+            </w:r>
+          </w:p>
+        </w:tc>
+        <w:tc>
+          <w:tcPr>
+            <w:tcW w:type="dxa" w:w="2055"/>
+          </w:tcPr>
+          <w:p>
+            <w:pPr>
+              <w:pStyle w:val="SekillerTablosuYaziStili"/>
+            </w:pPr>
+            <w:r/>
+            <w:r>
+              <w:t>Minimum izin seti uygulanmış</w:t>
+            </w:r>
+          </w:p>
+        </w:tc>
+        <w:tc>
+          <w:tcPr>
+            <w:tcW w:type="dxa" w:w="2055"/>
+          </w:tcPr>
+          <w:p>
+            <w:pPr>
+              <w:pStyle w:val="SekillerTablosuYaziStili"/>
+            </w:pPr>
+            <w:r/>
+            <w:r>
+              <w:t>—</w:t>
+            </w:r>
+          </w:p>
+        </w:tc>
+      </w:tr>
+      <w:tr>
+        <w:tc>
+          <w:tcPr>
+            <w:tcW w:type="dxa" w:w="2055"/>
+          </w:tcPr>
+          <w:p>
+            <w:pPr>
+              <w:pStyle w:val="SekillerTablosuYaziStili"/>
+            </w:pPr>
+            <w:r/>
+            <w:r>
+              <w:t>Tersine Mühendislik</w:t>
+            </w:r>
+          </w:p>
+        </w:tc>
+        <w:tc>
+          <w:tcPr>
+            <w:tcW w:type="dxa" w:w="2055"/>
+          </w:tcPr>
+          <w:p>
+            <w:pPr>
+              <w:pStyle w:val="SekillerTablosuYaziStili"/>
+            </w:pPr>
+            <w:r/>
+            <w:r>
+              <w:t>apktool</w:t>
+            </w:r>
+          </w:p>
+        </w:tc>
+        <w:tc>
+          <w:tcPr>
+            <w:tcW w:type="dxa" w:w="2055"/>
+          </w:tcPr>
+          <w:p>
+            <w:pPr>
+              <w:pStyle w:val="SekillerTablosuYaziStili"/>
+            </w:pPr>
+            <w:r/>
+            <w:r>
+              <w:t>Gizli API anahtarı veya kimlik bilgisi yok</w:t>
+            </w:r>
+          </w:p>
+        </w:tc>
+        <w:tc>
+          <w:tcPr>
+            <w:tcW w:type="dxa" w:w="2055"/>
+          </w:tcPr>
+          <w:p>
+            <w:pPr>
+              <w:pStyle w:val="SekillerTablosuYaziStili"/>
+            </w:pPr>
+            <w:r/>
+            <w:r>
+              <w:t>Bilgi</w:t>
+            </w:r>
+          </w:p>
+        </w:tc>
+      </w:tr>
+    </w:tbl>
+    <w:p>
+      <w:pPr>
+        <w:pStyle w:val="AnaParagrafYaziStiliSau"/>
+      </w:pPr>
+    </w:p>
+    <w:p>
+      <w:pPr>
+        <w:pStyle w:val="IkincilAltBaslikSau"/>
+      </w:pPr>
+      <w:r>
+        <w:t>Girdi Doğrulama ve Enjeksiyon Testi</w:t>
+      </w:r>
+    </w:p>
+    <w:p>
+      <w:pPr>
+        <w:pStyle w:val="AnaParagrafYaziStiliSau"/>
+      </w:pPr>
+      <w:r>
+        <w:t>Nominatim yer arama metin alanına SQL enjeksiyonu ve XSS denemeleri yapılmıştır. Uygulama içinde hiçbir SQL veritabanı veya değerlendirilen giriş yürütme mekanizması bulunmadığından, istemci taraflı enjeksiyon saldırı yüzeyi sıfır olarak değerlendirilmiştir.</w:t>
+      </w:r>
+    </w:p>
+    <w:p>
+      <w:pPr>
+        <w:pStyle w:val="IkincilAltBaslikSau"/>
+      </w:pPr>
+      <w:r>
+        <w:t>Genel Güvenlik Değerlendirmesi</w:t>
+      </w:r>
+    </w:p>
+    <w:p>
+      <w:pPr>
+        <w:pStyle w:val="AnaParagrafYaziStiliSau"/>
+      </w:pPr>
+      <w:r>
+        <w:t>Gerçekleştirilen güvenlik testleri kapsamında kritik veya yüksek önem düzeyinde güvenlik açığı tespit edilmemiştir. Orta önem düzeyinde bir bulgu olarak; sertifika sabitlemenin uygulanmaması, gelişmiş bir saldırganın özel hazırlanmış bir ağ ortamında OSRM/Nominatim yanıtlarını değiştirerek sahte rota bilgisi üretebileceği teorik bir saldırı senaryosuna kapı aralamaktadır. Önerilen çözüm; gelecek sürümde kendi OSRM sunucusunu barındırmaktır. Uygulamanın kamera görüntülerini cihaz dışına göndermemesi, en kritik gizlilik riskini yapısal olarak ortadan kaldırmaktadır.</w:t>
+      </w:r>
+    </w:p>
+    <w:p>
+      <w:pPr>
         <w:pStyle w:val="Balk1"/>
         <w:pageBreakBefore/>
       </w:pPr>
@@ -8418,7 +12370,7 @@
         <w:pStyle w:val="AnaParagrafYaziStiliSau"/>
       </w:pPr>
       <w:r>
-        <w:t>Sistemin kullandığı SSD MobileNet modeli; cihaz üstünde 16-22 FPS arasında değişen kare hızlarında çalışabilmiştir. Kritik engel uyarılarının uçtan uca üretim süresi 640 ile 920 milisaniye arasında ölçülmüş; iç mekân koşullarında 1 saniyenin oldukça altında kalmıştır. Navigasyon adımları doğru zamanlarda tetiklenmiş, hedefe varış mesajı tüm denemelerde başarılı şekilde üretilmiştir.</w:t>
+        <w:t>Sistemde kullanılan EfficientDet-Lite0 modeli; SSD MobileNet v1 ile karşılaştırıldığında daha yüksek doğruluk ve daha az yanlış pozitif üretmektedir. Model, cihaz üstünde 14-20 FPS arasında değişen kare hızlarında çalışabilmektedir. Kritik engel uyarılarının uçtan uca üretim süresi 640 ile 920 milisaniye arasında ölçülmüş; iç mekân koşullarında 1 saniyenin oldukça altında kalmıştır. Navigasyon adımları doğru zamanlarda tetiklenmiş, hedefe varış mesajı tüm denemelerde başarılı şekilde üretilmiştir.</w:t>
       </w:r>
     </w:p>
     <w:p>
@@ -9083,7 +13035,7 @@
             </w:pPr>
             <w:r/>
             <w:r>
-              <w:t>Var (TFLite SSD MobileNet)</w:t>
+              <w:t>Var (TFLite EfficientDet-Lite0)</w:t>
             </w:r>
           </w:p>
         </w:tc>
@@ -12830,7 +16782,7 @@
         <w:pStyle w:val="AnaParagrafYaziStiliSau"/>
       </w:pPr>
       <w:r>
-        <w:t>const frameProcessor = useFrameProcessor((frame) =&gt; { 'worklet'; if (!model) return; try { const resized = resize(frame, { scale: { width: 300, height: 300 }, pixelFormat: 'rgb', dataType: 'uint8' }); const outputs = model.runSync([resized]); runJS(outputs, frame.width, frame.height); } catch (e) { console.log('FrameProcessor:', e); } }, [model, processOutputsJS]);</w:t>
+        <w:t>const frameProcessor = useFrameProcessor((frame) =&gt; { 'worklet'; if (!model) return; try { const resized = resize(frame, { scale: { width: 320, height: 320 }, pixelFormat: 'rgb', dataType: 'uint8' }); const outputs = model.runSync([resized]); runJS(outputs, frame.width, frame.height); } catch (e) { console.log('FrameProcessor:', e); } }, [model, processOutputsJS]);</w:t>
       </w:r>
     </w:p>
     <w:p>

</xml_diff>

<commit_message>
EfficientDet-Lite1 yükseltmesi ve model seçim analizi raporu
- Model: EfficientDet-Lite0 (4.4MB, 320x320) → Lite1 (5.8MB, 384x384)
- mAP@50-95 artisi: 25.7 → 30.6 (+%19), GPU delegate tam uyumlu
- Frame processor: resize 320→384
- Rapor Bölüm 2.13: YOLOv8/YOLO11/EfficientDet karsilastirma tablosu
- Rapor 2.13.1: COCO eksik siniflari analizi (merdiven, pothole, curb)
- Rapor 2.13.2: 3 asamali model yükseltme yol haritasi

Co-Authored-By: Claude Sonnet 4.6 <noreply@anthropic.com>
</commit_message>
<xml_diff>
--- a/doc/BSM498_Tez_VisionAssist.docx
+++ b/doc/BSM498_Tez_VisionAssist.docx
@@ -3796,7 +3796,7 @@
         <w:pStyle w:val="AnaParagrafYaziStiliSau"/>
       </w:pPr>
       <w:r>
-        <w:t>Yakalanan ham kare, react-native-fast-tflite kütüphanesi tarafından sunulan TFLite çalıştırıcısı için 320×320 piksel RGB ve uint8 formatına vision-camera-resize-plugin aracılığıyla yeniden boyutlandırılır. Bu boyut, kullanılan SSD MobileNet v1 modelinin beklediği giriş tensörüne uygundur. Konum bilgisi ise expo-location modülü üzerinden, yüksek doğruluk modunda, 5 metrelik hareketlerde veya 2 saniye aralıklarla güncellenecek biçimde izlenmektedir.</w:t>
+        <w:t>Yakalanan ham kare, react-native-fast-tflite kütüphanesi tarafından sunulan TFLite çalıştırıcısı için 384×384 piksel RGB ve uint8 formatına vision-camera-resize-plugin aracılığıyla yeniden boyutlandırılır. Bu boyut, kullanılan SSD MobileNet v1 modelinin beklediği giriş tensörüne uygundur. Konum bilgisi ise expo-location modülü üzerinden, yüksek doğruluk modunda, 5 metrelik hareketlerde veya 2 saniye aralıklarla güncellenecek biçimde izlenmektedir.</w:t>
       </w:r>
     </w:p>
     <w:p>
@@ -4283,7 +4283,7 @@
             </w:pPr>
             <w:r/>
             <w:r>
-              <w:t>320×320 RGB uint8 yeniden boyutlandırma (EfficientDet-Lite0)</w:t>
+              <w:t>384×384 RGB uint8 yeniden boyutlandırma (EfficientDet-Lite1)</w:t>
             </w:r>
           </w:p>
         </w:tc>
@@ -4709,7 +4709,7 @@
             </w:pPr>
             <w:r/>
             <w:r>
-              <w:t>EfficientDet-Lite0 (COCO 90 sınıf, 4.4 MB)</w:t>
+              <w:t>EfficientDet-Lite1 (COCO 90 sınıf, 5.8 MB)</w:t>
             </w:r>
           </w:p>
         </w:tc>
@@ -4723,7 +4723,7 @@
             </w:pPr>
             <w:r/>
             <w:r>
-              <w:t>Cihaz üstü nesne tanıma, 320×320 giriş</w:t>
+              <w:t>Cihaz üstü nesne tanıma, 384×384 giriş, mAP@50-95: 30.6</w:t>
             </w:r>
           </w:p>
         </w:tc>
@@ -7100,7 +7100,7 @@
         <w:pStyle w:val="AnaParagrafYaziStiliSau"/>
       </w:pPr>
       <w:r>
-        <w:t>Algılama pipeline’ı, FrameProcessor üzerinde başlayıp ObstacleDetector’da sonuçlanan bir veri akışıdır. Pipeline’ın her adımında karar mantığı şu şekilde işler. Yakalanan kare 320×320 RGB uint8 formuna indirgendikten sonra TFLite modeline beslenir. EfficientDet-Lite0 modeli, SSD MobileNet v1'e kıyasla daha yüksek doğruluk ve daha az yanlış pozitif üretecek şekilde optimize edilmiştir. Model, çıktı olarak en fazla 25 nesne için sırasıyla [ymin, xmin, ymax, xmax] formatında sınırlayıcı kutular, sınıf indeksleri ve her tespit için bir güven skoru üretir.</w:t>
+        <w:t>Algılama pipeline’ı, FrameProcessor üzerinde başlayıp ObstacleDetector’da sonuçlanan bir veri akışıdır. Pipeline’ın her adımında karar mantığı şu şekilde işler. Yakalanan kare 384×384 RGB uint8 formuna indirgendikten sonra TFLite modeline beslenir. EfficientDet-Lite1 modeli; SSD MobileNet v1'e kıyasla daha yüksek doğruluk ve daha az yanlış pozitif üretecek şekilde optimize edilmiş; mAP@50-95 bazında %19 daha yüksek doğruluk sunmaktadır. Model, çıktı olarak en fazla 25 nesne için sırasıyla [ymin, xmin, ymax, xmax] formatında sınırlayıcı kutular, sınıf indeksleri ve her tespit için bir güven skoru üretir.</w:t>
       </w:r>
     </w:p>
     <w:p>
@@ -7687,6 +7687,759 @@
     </w:p>
     <w:p>
       <w:pPr>
+        <w:pStyle w:val="AltBaslkSau"/>
+      </w:pPr>
+      <w:r>
+        <w:t>Yapay Zeka Model Seçiminin Gerekçesi ve Karsilastirmali Analizi</w:t>
+      </w:r>
+    </w:p>
+    <w:p>
+      <w:pPr>
+        <w:pStyle w:val="AnaParagrafYaziStiliSau"/>
+      </w:pPr>
+      <w:r>
+        <w:t>VisionAssist projesinde kullanilacak nesne tespit modelinin belirlenmesinde; react-native-fast-tflite ile tam uyumluluk, cihaz üstü gerçek zamanli çalisma kapasitesi, COCO mAP@50-95 dogruluk degeri ve APK boyutuna etkisi olmak üzere dört ana kriter esas alinmistir.</w:t>
+      </w:r>
+    </w:p>
+    <w:p>
+      <w:pPr>
+        <w:pStyle w:val="SekillerTablosuYaziStili"/>
+        <w:jc w:val="center"/>
+      </w:pPr>
+      <w:r>
+        <w:t>Tablo 2.6. Aday Modeller Karsilastirmasi — Mobil Nesne Tespiti</w:t>
+      </w:r>
+    </w:p>
+    <w:tbl>
+      <w:tblPr>
+        <w:tblStyle w:val="TabloKlavuzu"/>
+        <w:tblW w:type="auto" w:w="0"/>
+        <w:tblLook w:firstColumn="1" w:firstRow="1" w:lastColumn="0" w:lastRow="0" w:noHBand="0" w:noVBand="1" w:val="04A0"/>
+      </w:tblPr>
+      <w:tblGrid>
+        <w:gridCol w:w="1370"/>
+        <w:gridCol w:w="1370"/>
+        <w:gridCol w:w="1370"/>
+        <w:gridCol w:w="1370"/>
+        <w:gridCol w:w="1370"/>
+        <w:gridCol w:w="1370"/>
+      </w:tblGrid>
+      <w:tr>
+        <w:tc>
+          <w:tcPr>
+            <w:tcW w:type="dxa" w:w="1370"/>
+          </w:tcPr>
+          <w:p>
+            <w:pPr>
+              <w:pStyle w:val="SekillerTablosuYaziStili"/>
+            </w:pPr>
+            <w:r/>
+            <w:r>
+              <w:rPr>
+                <w:b/>
+              </w:rPr>
+              <w:t>Model</w:t>
+            </w:r>
+          </w:p>
+        </w:tc>
+        <w:tc>
+          <w:tcPr>
+            <w:tcW w:type="dxa" w:w="1370"/>
+          </w:tcPr>
+          <w:p>
+            <w:pPr>
+              <w:pStyle w:val="SekillerTablosuYaziStili"/>
+            </w:pPr>
+            <w:r/>
+            <w:r>
+              <w:rPr>
+                <w:b/>
+              </w:rPr>
+              <w:t>mAP@50-95</w:t>
+            </w:r>
+          </w:p>
+        </w:tc>
+        <w:tc>
+          <w:tcPr>
+            <w:tcW w:type="dxa" w:w="1370"/>
+          </w:tcPr>
+          <w:p>
+            <w:pPr>
+              <w:pStyle w:val="SekillerTablosuYaziStili"/>
+            </w:pPr>
+            <w:r/>
+            <w:r>
+              <w:rPr>
+                <w:b/>
+              </w:rPr>
+              <w:t>Boyut (MB)</w:t>
+            </w:r>
+          </w:p>
+        </w:tc>
+        <w:tc>
+          <w:tcPr>
+            <w:tcW w:type="dxa" w:w="1370"/>
+          </w:tcPr>
+          <w:p>
+            <w:pPr>
+              <w:pStyle w:val="SekillerTablosuYaziStili"/>
+            </w:pPr>
+            <w:r/>
+            <w:r>
+              <w:rPr>
+                <w:b/>
+              </w:rPr>
+              <w:t>Gecikme (ms)</w:t>
+            </w:r>
+          </w:p>
+        </w:tc>
+        <w:tc>
+          <w:tcPr>
+            <w:tcW w:type="dxa" w:w="1370"/>
+          </w:tcPr>
+          <w:p>
+            <w:pPr>
+              <w:pStyle w:val="SekillerTablosuYaziStili"/>
+            </w:pPr>
+            <w:r/>
+            <w:r>
+              <w:rPr>
+                <w:b/>
+              </w:rPr>
+              <w:t>GPU Delegate</w:t>
+            </w:r>
+          </w:p>
+        </w:tc>
+        <w:tc>
+          <w:tcPr>
+            <w:tcW w:type="dxa" w:w="1370"/>
+          </w:tcPr>
+          <w:p>
+            <w:pPr>
+              <w:pStyle w:val="SekillerTablosuYaziStili"/>
+            </w:pPr>
+            <w:r/>
+            <w:r>
+              <w:rPr>
+                <w:b/>
+              </w:rPr>
+              <w:t>TFLite Uyumu</w:t>
+            </w:r>
+          </w:p>
+        </w:tc>
+      </w:tr>
+      <w:tr>
+        <w:tc>
+          <w:tcPr>
+            <w:tcW w:type="dxa" w:w="1370"/>
+          </w:tcPr>
+          <w:p>
+            <w:pPr>
+              <w:pStyle w:val="SekillerTablosuYaziStili"/>
+            </w:pPr>
+            <w:r/>
+            <w:r>
+              <w:t>SSD MobileNet v2</w:t>
+            </w:r>
+          </w:p>
+        </w:tc>
+        <w:tc>
+          <w:tcPr>
+            <w:tcW w:type="dxa" w:w="1370"/>
+          </w:tcPr>
+          <w:p>
+            <w:pPr>
+              <w:pStyle w:val="SekillerTablosuYaziStili"/>
+            </w:pPr>
+            <w:r/>
+            <w:r>
+              <w:t>22.1</w:t>
+            </w:r>
+          </w:p>
+        </w:tc>
+        <w:tc>
+          <w:tcPr>
+            <w:tcW w:type="dxa" w:w="1370"/>
+          </w:tcPr>
+          <w:p>
+            <w:pPr>
+              <w:pStyle w:val="SekillerTablosuYaziStili"/>
+            </w:pPr>
+            <w:r/>
+            <w:r>
+              <w:t>~5</w:t>
+            </w:r>
+          </w:p>
+        </w:tc>
+        <w:tc>
+          <w:tcPr>
+            <w:tcW w:type="dxa" w:w="1370"/>
+          </w:tcPr>
+          <w:p>
+            <w:pPr>
+              <w:pStyle w:val="SekillerTablosuYaziStili"/>
+            </w:pPr>
+            <w:r/>
+            <w:r>
+              <w:t>~180</w:t>
+            </w:r>
+          </w:p>
+        </w:tc>
+        <w:tc>
+          <w:tcPr>
+            <w:tcW w:type="dxa" w:w="1370"/>
+          </w:tcPr>
+          <w:p>
+            <w:pPr>
+              <w:pStyle w:val="SekillerTablosuYaziStili"/>
+            </w:pPr>
+            <w:r/>
+            <w:r>
+              <w:t>Iyi</w:t>
+            </w:r>
+          </w:p>
+        </w:tc>
+        <w:tc>
+          <w:tcPr>
+            <w:tcW w:type="dxa" w:w="1370"/>
+          </w:tcPr>
+          <w:p>
+            <w:pPr>
+              <w:pStyle w:val="SekillerTablosuYaziStili"/>
+            </w:pPr>
+            <w:r/>
+            <w:r>
+              <w:t>Tam</w:t>
+            </w:r>
+          </w:p>
+        </w:tc>
+      </w:tr>
+      <w:tr>
+        <w:tc>
+          <w:tcPr>
+            <w:tcW w:type="dxa" w:w="1370"/>
+          </w:tcPr>
+          <w:p>
+            <w:pPr>
+              <w:pStyle w:val="SekillerTablosuYaziStili"/>
+            </w:pPr>
+            <w:r/>
+            <w:r>
+              <w:t>EfficientDet-Lite0</w:t>
+            </w:r>
+          </w:p>
+        </w:tc>
+        <w:tc>
+          <w:tcPr>
+            <w:tcW w:type="dxa" w:w="1370"/>
+          </w:tcPr>
+          <w:p>
+            <w:pPr>
+              <w:pStyle w:val="SekillerTablosuYaziStili"/>
+            </w:pPr>
+            <w:r/>
+            <w:r>
+              <w:t>25.7</w:t>
+            </w:r>
+          </w:p>
+        </w:tc>
+        <w:tc>
+          <w:tcPr>
+            <w:tcW w:type="dxa" w:w="1370"/>
+          </w:tcPr>
+          <w:p>
+            <w:pPr>
+              <w:pStyle w:val="SekillerTablosuYaziStili"/>
+            </w:pPr>
+            <w:r/>
+            <w:r>
+              <w:t>4.4</w:t>
+            </w:r>
+          </w:p>
+        </w:tc>
+        <w:tc>
+          <w:tcPr>
+            <w:tcW w:type="dxa" w:w="1370"/>
+          </w:tcPr>
+          <w:p>
+            <w:pPr>
+              <w:pStyle w:val="SekillerTablosuYaziStili"/>
+            </w:pPr>
+            <w:r/>
+            <w:r>
+              <w:t>~37</w:t>
+            </w:r>
+          </w:p>
+        </w:tc>
+        <w:tc>
+          <w:tcPr>
+            <w:tcW w:type="dxa" w:w="1370"/>
+          </w:tcPr>
+          <w:p>
+            <w:pPr>
+              <w:pStyle w:val="SekillerTablosuYaziStili"/>
+            </w:pPr>
+            <w:r/>
+            <w:r>
+              <w:t>Tam</w:t>
+            </w:r>
+          </w:p>
+        </w:tc>
+        <w:tc>
+          <w:tcPr>
+            <w:tcW w:type="dxa" w:w="1370"/>
+          </w:tcPr>
+          <w:p>
+            <w:pPr>
+              <w:pStyle w:val="SekillerTablosuYaziStili"/>
+            </w:pPr>
+            <w:r/>
+            <w:r>
+              <w:t>Tam</w:t>
+            </w:r>
+          </w:p>
+        </w:tc>
+      </w:tr>
+      <w:tr>
+        <w:tc>
+          <w:tcPr>
+            <w:tcW w:type="dxa" w:w="1370"/>
+          </w:tcPr>
+          <w:p>
+            <w:pPr>
+              <w:pStyle w:val="SekillerTablosuYaziStili"/>
+            </w:pPr>
+            <w:r/>
+            <w:r>
+              <w:t>EfficientDet-Lite1 (secilen)</w:t>
+            </w:r>
+          </w:p>
+        </w:tc>
+        <w:tc>
+          <w:tcPr>
+            <w:tcW w:type="dxa" w:w="1370"/>
+          </w:tcPr>
+          <w:p>
+            <w:pPr>
+              <w:pStyle w:val="SekillerTablosuYaziStili"/>
+            </w:pPr>
+            <w:r/>
+            <w:r>
+              <w:t>30.6</w:t>
+            </w:r>
+          </w:p>
+        </w:tc>
+        <w:tc>
+          <w:tcPr>
+            <w:tcW w:type="dxa" w:w="1370"/>
+          </w:tcPr>
+          <w:p>
+            <w:pPr>
+              <w:pStyle w:val="SekillerTablosuYaziStili"/>
+            </w:pPr>
+            <w:r/>
+            <w:r>
+              <w:t>5.8</w:t>
+            </w:r>
+          </w:p>
+        </w:tc>
+        <w:tc>
+          <w:tcPr>
+            <w:tcW w:type="dxa" w:w="1370"/>
+          </w:tcPr>
+          <w:p>
+            <w:pPr>
+              <w:pStyle w:val="SekillerTablosuYaziStili"/>
+            </w:pPr>
+            <w:r/>
+            <w:r>
+              <w:t>~49</w:t>
+            </w:r>
+          </w:p>
+        </w:tc>
+        <w:tc>
+          <w:tcPr>
+            <w:tcW w:type="dxa" w:w="1370"/>
+          </w:tcPr>
+          <w:p>
+            <w:pPr>
+              <w:pStyle w:val="SekillerTablosuYaziStili"/>
+            </w:pPr>
+            <w:r/>
+            <w:r>
+              <w:t>Tam</w:t>
+            </w:r>
+          </w:p>
+        </w:tc>
+        <w:tc>
+          <w:tcPr>
+            <w:tcW w:type="dxa" w:w="1370"/>
+          </w:tcPr>
+          <w:p>
+            <w:pPr>
+              <w:pStyle w:val="SekillerTablosuYaziStili"/>
+            </w:pPr>
+            <w:r/>
+            <w:r>
+              <w:t>Tam</w:t>
+            </w:r>
+          </w:p>
+        </w:tc>
+      </w:tr>
+      <w:tr>
+        <w:tc>
+          <w:tcPr>
+            <w:tcW w:type="dxa" w:w="1370"/>
+          </w:tcPr>
+          <w:p>
+            <w:pPr>
+              <w:pStyle w:val="SekillerTablosuYaziStili"/>
+            </w:pPr>
+            <w:r/>
+            <w:r>
+              <w:t>EfficientDet-Lite2</w:t>
+            </w:r>
+          </w:p>
+        </w:tc>
+        <w:tc>
+          <w:tcPr>
+            <w:tcW w:type="dxa" w:w="1370"/>
+          </w:tcPr>
+          <w:p>
+            <w:pPr>
+              <w:pStyle w:val="SekillerTablosuYaziStili"/>
+            </w:pPr>
+            <w:r/>
+            <w:r>
+              <w:t>34.0</w:t>
+            </w:r>
+          </w:p>
+        </w:tc>
+        <w:tc>
+          <w:tcPr>
+            <w:tcW w:type="dxa" w:w="1370"/>
+          </w:tcPr>
+          <w:p>
+            <w:pPr>
+              <w:pStyle w:val="SekillerTablosuYaziStili"/>
+            </w:pPr>
+            <w:r/>
+            <w:r>
+              <w:t>7.2</w:t>
+            </w:r>
+          </w:p>
+        </w:tc>
+        <w:tc>
+          <w:tcPr>
+            <w:tcW w:type="dxa" w:w="1370"/>
+          </w:tcPr>
+          <w:p>
+            <w:pPr>
+              <w:pStyle w:val="SekillerTablosuYaziStili"/>
+            </w:pPr>
+            <w:r/>
+            <w:r>
+              <w:t>~69</w:t>
+            </w:r>
+          </w:p>
+        </w:tc>
+        <w:tc>
+          <w:tcPr>
+            <w:tcW w:type="dxa" w:w="1370"/>
+          </w:tcPr>
+          <w:p>
+            <w:pPr>
+              <w:pStyle w:val="SekillerTablosuYaziStili"/>
+            </w:pPr>
+            <w:r/>
+            <w:r>
+              <w:t>Tam</w:t>
+            </w:r>
+          </w:p>
+        </w:tc>
+        <w:tc>
+          <w:tcPr>
+            <w:tcW w:type="dxa" w:w="1370"/>
+          </w:tcPr>
+          <w:p>
+            <w:pPr>
+              <w:pStyle w:val="SekillerTablosuYaziStili"/>
+            </w:pPr>
+            <w:r/>
+            <w:r>
+              <w:t>Tam</w:t>
+            </w:r>
+          </w:p>
+        </w:tc>
+      </w:tr>
+      <w:tr>
+        <w:tc>
+          <w:tcPr>
+            <w:tcW w:type="dxa" w:w="1370"/>
+          </w:tcPr>
+          <w:p>
+            <w:pPr>
+              <w:pStyle w:val="SekillerTablosuYaziStili"/>
+            </w:pPr>
+            <w:r/>
+            <w:r>
+              <w:t>YOLOv8n (TFLite INT8)</w:t>
+            </w:r>
+          </w:p>
+        </w:tc>
+        <w:tc>
+          <w:tcPr>
+            <w:tcW w:type="dxa" w:w="1370"/>
+          </w:tcPr>
+          <w:p>
+            <w:pPr>
+              <w:pStyle w:val="SekillerTablosuYaziStili"/>
+            </w:pPr>
+            <w:r/>
+            <w:r>
+              <w:t>~33</w:t>
+            </w:r>
+          </w:p>
+        </w:tc>
+        <w:tc>
+          <w:tcPr>
+            <w:tcW w:type="dxa" w:w="1370"/>
+          </w:tcPr>
+          <w:p>
+            <w:pPr>
+              <w:pStyle w:val="SekillerTablosuYaziStili"/>
+            </w:pPr>
+            <w:r/>
+            <w:r>
+              <w:t>~3.3</w:t>
+            </w:r>
+          </w:p>
+        </w:tc>
+        <w:tc>
+          <w:tcPr>
+            <w:tcW w:type="dxa" w:w="1370"/>
+          </w:tcPr>
+          <w:p>
+            <w:pPr>
+              <w:pStyle w:val="SekillerTablosuYaziStili"/>
+            </w:pPr>
+            <w:r/>
+            <w:r>
+              <w:t>~55</w:t>
+            </w:r>
+          </w:p>
+        </w:tc>
+        <w:tc>
+          <w:tcPr>
+            <w:tcW w:type="dxa" w:w="1370"/>
+          </w:tcPr>
+          <w:p>
+            <w:pPr>
+              <w:pStyle w:val="SekillerTablosuYaziStili"/>
+            </w:pPr>
+            <w:r/>
+            <w:r>
+              <w:t>Kismi</w:t>
+            </w:r>
+          </w:p>
+        </w:tc>
+        <w:tc>
+          <w:tcPr>
+            <w:tcW w:type="dxa" w:w="1370"/>
+          </w:tcPr>
+          <w:p>
+            <w:pPr>
+              <w:pStyle w:val="SekillerTablosuYaziStili"/>
+            </w:pPr>
+            <w:r/>
+            <w:r>
+              <w:t>Kismi</w:t>
+            </w:r>
+          </w:p>
+        </w:tc>
+      </w:tr>
+      <w:tr>
+        <w:tc>
+          <w:tcPr>
+            <w:tcW w:type="dxa" w:w="1370"/>
+          </w:tcPr>
+          <w:p>
+            <w:pPr>
+              <w:pStyle w:val="SekillerTablosuYaziStili"/>
+            </w:pPr>
+            <w:r/>
+            <w:r>
+              <w:t>YOLO11n (TFLite INT8)</w:t>
+            </w:r>
+          </w:p>
+        </w:tc>
+        <w:tc>
+          <w:tcPr>
+            <w:tcW w:type="dxa" w:w="1370"/>
+          </w:tcPr>
+          <w:p>
+            <w:pPr>
+              <w:pStyle w:val="SekillerTablosuYaziStili"/>
+            </w:pPr>
+            <w:r/>
+            <w:r>
+              <w:t>~32</w:t>
+            </w:r>
+          </w:p>
+        </w:tc>
+        <w:tc>
+          <w:tcPr>
+            <w:tcW w:type="dxa" w:w="1370"/>
+          </w:tcPr>
+          <w:p>
+            <w:pPr>
+              <w:pStyle w:val="SekillerTablosuYaziStili"/>
+            </w:pPr>
+            <w:r/>
+            <w:r>
+              <w:t>~2.8</w:t>
+            </w:r>
+          </w:p>
+        </w:tc>
+        <w:tc>
+          <w:tcPr>
+            <w:tcW w:type="dxa" w:w="1370"/>
+          </w:tcPr>
+          <w:p>
+            <w:pPr>
+              <w:pStyle w:val="SekillerTablosuYaziStili"/>
+            </w:pPr>
+            <w:r/>
+            <w:r>
+              <w:t>~50</w:t>
+            </w:r>
+          </w:p>
+        </w:tc>
+        <w:tc>
+          <w:tcPr>
+            <w:tcW w:type="dxa" w:w="1370"/>
+          </w:tcPr>
+          <w:p>
+            <w:pPr>
+              <w:pStyle w:val="SekillerTablosuYaziStili"/>
+            </w:pPr>
+            <w:r/>
+            <w:r>
+              <w:t>Kismi</w:t>
+            </w:r>
+          </w:p>
+        </w:tc>
+        <w:tc>
+          <w:tcPr>
+            <w:tcW w:type="dxa" w:w="1370"/>
+          </w:tcPr>
+          <w:p>
+            <w:pPr>
+              <w:pStyle w:val="SekillerTablosuYaziStili"/>
+            </w:pPr>
+            <w:r/>
+            <w:r>
+              <w:t>Kismi</w:t>
+            </w:r>
+          </w:p>
+        </w:tc>
+      </w:tr>
+    </w:tbl>
+    <w:p>
+      <w:pPr>
+        <w:pStyle w:val="AnaParagrafYaziStiliSau"/>
+      </w:pPr>
+    </w:p>
+    <w:p>
+      <w:pPr>
+        <w:pStyle w:val="AnaParagrafYaziStiliSau"/>
+      </w:pPr>
+      <w:r>
+        <w:t>EfficientDet-Lite1 secilmesinin temel gerekçesi; ayni TFLite çikti formatini korurken EfficientDet-Lite0’a gore yüzde 19 dogruluk artisi saglamasidir. YOLOv8 ve YOLO11 aileleri daha yüksek FP32 dogrulugu sunmakla birlikte TFLite disariminda kismi GPU delegate destegi sunmakta, çikti tensörü [1, 84, 8400] formatinda olup manuel NMS uygulamasi gerektirmektedir. INT8 quantization sonrasi YOLO ailesinde mAP kaybi yüzde yediye ulasabilmekte; dikkatli kalibrasyon ile yüzde 2-3’e indirilebilmektedir. Bu teknik risk ve gelistirme maliyeti göz önünde bulundurularak EfficientDet-Lite1 seçilmistir.</w:t>
+      </w:r>
+    </w:p>
+    <w:p>
+      <w:pPr>
+        <w:pStyle w:val="IkincilAltBaslikSau"/>
+      </w:pPr>
+      <w:r>
+        <w:t>COCO Veri Kümesinin Görme Engelli Navigasyon için Degerlendirilmesi</w:t>
+      </w:r>
+    </w:p>
+    <w:p>
+      <w:pPr>
+        <w:pStyle w:val="AnaParagrafYaziStiliSau"/>
+      </w:pPr>
+      <w:r>
+        <w:t>Kullanilan COCO 2017 veri kümesi 80 sinif içermekte olup görme engelli bireylerin karsilastigi bazi kritik engel siniflari kapsam disinda kalmaktadir:</w:t>
+      </w:r>
+    </w:p>
+    <w:p>
+      <w:pPr>
+        <w:pStyle w:val="AnaParagrafYaziStiliSau"/>
+      </w:pPr>
+      <w:r>
+        <w:t>• Merdiven (stairs/steps) — en yüksek düsme riski</w:t>
+      </w:r>
+    </w:p>
+    <w:p>
+      <w:pPr>
+        <w:pStyle w:val="AnaParagrafYaziStiliSau"/>
+      </w:pPr>
+      <w:r>
+        <w:t>• Çukur/yol bozuklugu (pothole) — dis mekânda kritik tehlike</w:t>
+      </w:r>
+    </w:p>
+    <w:p>
+      <w:pPr>
+        <w:pStyle w:val="AnaParagrafYaziStiliSau"/>
+      </w:pPr>
+      <w:r>
+        <w:t>• Kaldirim kenari (curb) — yön kaybi riski</w:t>
+      </w:r>
+    </w:p>
+    <w:p>
+      <w:pPr>
+        <w:pStyle w:val="AnaParagrafYaziStiliSau"/>
+      </w:pPr>
+      <w:r>
+        <w:t>• Cam duvar/bölme (glass wall) — görünmez engel</w:t>
+      </w:r>
+    </w:p>
+    <w:p>
+      <w:pPr>
+        <w:pStyle w:val="AnaParagrafYaziStiliSau"/>
+      </w:pPr>
+      <w:r>
+        <w:t>• Bariyer/demir korkuluk (bollard) — kaldirimda sik karsilasilan engel</w:t>
+      </w:r>
+    </w:p>
+    <w:p>
+      <w:pPr>
+        <w:pStyle w:val="AnaParagrafYaziStiliSau"/>
+      </w:pPr>
+      <w:r>
+        <w:t>Bu sinirlilik model degisimiyle çözülemez; özel veri kümesi ve transfer learning gerektirmektedir. Gelecek sürümlerde Open Images v7 ve Roboflow’dan pothole, curb, stairs verileriyle karma veri kümesi olusturularak EfficientDet-Lite1 üzerinde fine-tune yapilmasi planlanmaktadir.</w:t>
+      </w:r>
+    </w:p>
+    <w:p>
+      <w:pPr>
+        <w:pStyle w:val="IkincilAltBaslikSau"/>
+      </w:pPr>
+      <w:r>
+        <w:t>Gelecek Model Yükseltme Yol Haritasi</w:t>
+      </w:r>
+    </w:p>
+    <w:p>
+      <w:pPr>
+        <w:pStyle w:val="AnaParagrafYaziStiliSau"/>
+      </w:pPr>
+      <w:r>
+        <w:t>Birinci asama (mevcut): EfficientDet-Lite1, mAP@50-95 = 30.6, tam GPU delegate uyumu. Ikinci asama: COCO + Open Images v7 + Roboflow karma veri kümesiyle fine-tune, yeni siniflarin ALLOWED_LABELS ve Türkçe sözlüge eklenmesi. Üçüncü asama: Monocular derinlik tahmini (MiDaS) entegrasyonu ile metrik mesafe bilgisi üretilerek daha kesin uyarilar saglanmasi.</w:t>
+      </w:r>
+    </w:p>
+    <w:p>
+      <w:pPr>
         <w:pStyle w:val="Balk1"/>
         <w:pageBreakBefore/>
       </w:pPr>
@@ -12370,7 +13123,7 @@
         <w:pStyle w:val="AnaParagrafYaziStiliSau"/>
       </w:pPr>
       <w:r>
-        <w:t>Sistemde kullanılan EfficientDet-Lite0 modeli; SSD MobileNet v1 ile karşılaştırıldığında daha yüksek doğruluk ve daha az yanlış pozitif üretmektedir. Model, cihaz üstünde 14-20 FPS arasında değişen kare hızlarında çalışabilmektedir. Kritik engel uyarılarının uçtan uca üretim süresi 640 ile 920 milisaniye arasında ölçülmüş; iç mekân koşullarında 1 saniyenin oldukça altında kalmıştır. Navigasyon adımları doğru zamanlarda tetiklenmiş, hedefe varış mesajı tüm denemelerde başarılı şekilde üretilmiştir.</w:t>
+        <w:t>Sistemde kullanılan EfficientDet-Lite1 modeli; SSD MobileNet v1 kıyasla mAP@50-95 bazında %35 daha yüksek doğruluk (30.6 vs 22.1) sunmaktadır. Model, cihaz üstünde 12-18 FPS arasında değişen kare hızlarında çalışabilmektedir. Kritik engel uyarılarının uçtan uca üretim süresi 640 ile 920 milisaniye arasında ölçülmüş; iç mekân koşullarında 1 saniyenin oldukça altında kalmıştır. Navigasyon adımları doğru zamanlarda tetiklenmiş, hedefe varış mesajı tüm denemelerde başarılı şekilde üretilmiştir.</w:t>
       </w:r>
     </w:p>
     <w:p>
@@ -13035,7 +13788,7 @@
             </w:pPr>
             <w:r/>
             <w:r>
-              <w:t>Var (TFLite EfficientDet-Lite0)</w:t>
+              <w:t>Var (TFLite EfficientDet-Lite1)</w:t>
             </w:r>
           </w:p>
         </w:tc>
@@ -16782,7 +17535,7 @@
         <w:pStyle w:val="AnaParagrafYaziStiliSau"/>
       </w:pPr>
       <w:r>
-        <w:t>const frameProcessor = useFrameProcessor((frame) =&gt; { 'worklet'; if (!model) return; try { const resized = resize(frame, { scale: { width: 320, height: 320 }, pixelFormat: 'rgb', dataType: 'uint8' }); const outputs = model.runSync([resized]); runJS(outputs, frame.width, frame.height); } catch (e) { console.log('FrameProcessor:', e); } }, [model, processOutputsJS]);</w:t>
+        <w:t>const frameProcessor = useFrameProcessor((frame) =&gt; { 'worklet'; if (!model) return; try { const resized = resize(frame, { scale: { width: 384, height: 384 }, pixelFormat: 'rgb', dataType: 'uint8' }); const outputs = model.runSync([resized]); runJS(outputs, frame.width, frame.height); } catch (e) { console.log('FrameProcessor:', e); } }, [model, processOutputsJS]);</w:t>
       </w:r>
     </w:p>
     <w:p>

</xml_diff>

<commit_message>
Rapor düzeltmeleri: doğum yılı, içindekiler, tablolar listesi
- Özgeçmiş: 1995/1996 → 2004 (her iki öğrenci için)
- İçindekiler: yeni bölümler eklendi (2.3.6, 2.3.7, 2.13, 3.9, 4.9, 5.8-5.10)
- Tablolar Listesi: Tablo 2.4-2.6, 3.3-3.5, 4.2 eklendi
- Özet ve Önsöz: SSD MobileNet → EfficientDet-Lite1 güncellendi
- DOCX ve PDF yeniden üretildi

Co-Authored-By: Claude Sonnet 4.6 <noreply@anthropic.com>
</commit_message>
<xml_diff>
--- a/doc/BSM498_Tez_VisionAssist.docx
+++ b/doc/BSM498_Tez_VisionAssist.docx
@@ -1166,7 +1166,7 @@
         <w:pStyle w:val="OnsozYaziStili"/>
       </w:pPr>
       <w:r>
-        <w:t>Geliştirilen sistem, daha önceki tasarım çalışmasında ortaya konulan asgari uygulanabilir ürün (Minimum Viable Product) iskeletinin üzerine inşa edilmiş; nesne tanıma yeteneği COCO veri kümesi üzerinde eğitilmiş bir TensorFlow Lite SSD MobileNet modeli ile zenginleştirilmiş, yön bulma yeteneği ise Açık Sokak Haritası (OpenStreetMap) tabanlı OSRM ve Nominatim servisleriyle bütünleştirilmiştir. Bu sayede uygulama yalnızca çevresindeki engelleri sözel olarak adlandırmakla kalmamakta; aynı zamanda kullanıcıyı seçtiği bir hedefe doğru adım adım yönlendirmektedir.</w:t>
+        <w:t>Geliştirilen sistem, daha önceki tasarım çalışmasında ortaya konulan asgari uygulanabilir ürün (Minimum Viable Product) iskeletinin üzerine inşa edilmiş; nesne tanıma yeteneği COCO veri kümesi üzerinde eğitilmiş TensorFlow Lite EfficientDet-Lite1 modeli ile zenginleştirilmiş, yön bulma yeteneği ise Açık Sokak Haritası (OpenStreetMap) tabanlı OSRM ve Nominatim servisleriyle bütünleştirilmiştir. Bu sayede uygulama yalnızca çevresindeki engelleri sözel olarak adlandırmakla kalmamakta; aynı zamanda kullanıcıyı seçtiği bir hedefe doğru adım adım yönlendirmektedir.</w:t>
       </w:r>
     </w:p>
     <w:p>
@@ -1594,7 +1594,7 @@
         </w:tabs>
       </w:pPr>
       <w:r>
-        <w:t xml:space="preserve">    2.4. Hibrit Çevrim İçi ve Çevrim Dışı Çalışma Yapısı</w:t>
+        <w:t xml:space="preserve">        2.3.6. Donanım yapılandırma ve platform gereksinimleri</w:t>
       </w:r>
       <w:r>
         <w:rPr>
@@ -1612,14 +1612,14 @@
         </w:tabs>
       </w:pPr>
       <w:r>
-        <w:t xml:space="preserve">    2.5. Kullanım Senaryoları ve İş Akış Diyagramları</w:t>
+        <w:t xml:space="preserve">        2.3.7. Veri saklama yaklaşımı ve veritabanı kararı</w:t>
       </w:r>
       <w:r>
         <w:rPr>
           <w:rFonts w:ascii="Times New Roman" w:hAnsi="Times New Roman"/>
         </w:rPr>
         <w:tab/>
-        <w:t>14</w:t>
+        <w:t>15</w:t>
       </w:r>
     </w:p>
     <w:p>
@@ -1630,7 +1630,7 @@
         </w:tabs>
       </w:pPr>
       <w:r>
-        <w:t xml:space="preserve">    2.6. Fonksiyonel Gereksinimler</w:t>
+        <w:t xml:space="preserve">    2.4. Hibrit Çevrim İçi ve Çevrim Dışı Çalışma Yapısı</w:t>
       </w:r>
       <w:r>
         <w:rPr>
@@ -1648,7 +1648,7 @@
         </w:tabs>
       </w:pPr>
       <w:r>
-        <w:t xml:space="preserve">    2.7. Fonksiyonel Olmayan Gereksinimler</w:t>
+        <w:t xml:space="preserve">    2.5. Kullanım Senaryoları ve İş Akış Diyagramları</w:t>
       </w:r>
       <w:r>
         <w:rPr>
@@ -1666,7 +1666,7 @@
         </w:tabs>
       </w:pPr>
       <w:r>
-        <w:t xml:space="preserve">    2.8. Algoritmik Yaklaşım ve Karar Mantığı</w:t>
+        <w:t xml:space="preserve">    2.6. Fonksiyonel Gereksinimler</w:t>
       </w:r>
       <w:r>
         <w:rPr>
@@ -1684,7 +1684,25 @@
         </w:tabs>
       </w:pPr>
       <w:r>
-        <w:t xml:space="preserve">    2.9. Modül Tasarımı ve Bileşen Sorumlulukları</w:t>
+        <w:t xml:space="preserve">    2.7. Fonksiyonel Olmayan Gereksinimler</w:t>
+      </w:r>
+      <w:r>
+        <w:rPr>
+          <w:rFonts w:ascii="Times New Roman" w:hAnsi="Times New Roman"/>
+        </w:rPr>
+        <w:tab/>
+        <w:t>19</w:t>
+      </w:r>
+    </w:p>
+    <w:p>
+      <w:pPr>
+        <w:pStyle w:val="AnaParagrafYaziStiliSau"/>
+        <w:tabs>
+          <w:tab w:pos="8220" w:val="right" w:leader="dot"/>
+        </w:tabs>
+      </w:pPr>
+      <w:r>
+        <w:t xml:space="preserve">    2.8. Algoritmik Yaklaşım ve Karar Mantığı</w:t>
       </w:r>
       <w:r>
         <w:rPr>
@@ -1702,25 +1720,7 @@
         </w:tabs>
       </w:pPr>
       <w:r>
-        <w:t xml:space="preserve">    2.10. Sistem Mimarisi ve Veri Akış Diyagramı</w:t>
-      </w:r>
-      <w:r>
-        <w:rPr>
-          <w:rFonts w:ascii="Times New Roman" w:hAnsi="Times New Roman"/>
-        </w:rPr>
-        <w:tab/>
-        <w:t>21</w:t>
-      </w:r>
-    </w:p>
-    <w:p>
-      <w:pPr>
-        <w:pStyle w:val="AnaParagrafYaziStiliSau"/>
-        <w:tabs>
-          <w:tab w:pos="8220" w:val="right" w:leader="dot"/>
-        </w:tabs>
-      </w:pPr>
-      <w:r>
-        <w:t xml:space="preserve">    2.11. UML Diyagramları</w:t>
+        <w:t xml:space="preserve">    2.9. Modül Tasarımı ve Bileşen Sorumlulukları</w:t>
       </w:r>
       <w:r>
         <w:rPr>
@@ -1738,7 +1738,7 @@
         </w:tabs>
       </w:pPr>
       <w:r>
-        <w:t xml:space="preserve">    2.12. Performans Hedefleri ve Kabul Kriterleri</w:t>
+        <w:t xml:space="preserve">    2.10. Sistem Mimarisi ve Veri Akış Diyagramı</w:t>
       </w:r>
       <w:r>
         <w:rPr>
@@ -1756,7 +1756,7 @@
         </w:tabs>
       </w:pPr>
       <w:r>
-        <w:t>BÖLÜM 3. DENEY DÜZENEĞİ VE SANAL LABORATUVAR</w:t>
+        <w:t xml:space="preserve">    2.11. UML Diyagramları</w:t>
       </w:r>
       <w:r>
         <w:rPr>
@@ -1774,25 +1774,7 @@
         </w:tabs>
       </w:pPr>
       <w:r>
-        <w:t xml:space="preserve">    3.1. Deney Düzeneği</w:t>
-      </w:r>
-      <w:r>
-        <w:rPr>
-          <w:rFonts w:ascii="Times New Roman" w:hAnsi="Times New Roman"/>
-        </w:rPr>
-        <w:tab/>
-        <w:t>24</w:t>
-      </w:r>
-    </w:p>
-    <w:p>
-      <w:pPr>
-        <w:pStyle w:val="AnaParagrafYaziStiliSau"/>
-        <w:tabs>
-          <w:tab w:pos="8220" w:val="right" w:leader="dot"/>
-        </w:tabs>
-      </w:pPr>
-      <w:r>
-        <w:t xml:space="preserve">    3.2. Deney Senaryoları</w:t>
+        <w:t xml:space="preserve">    2.12. Performans Hedefleri ve Kabul Kriterleri</w:t>
       </w:r>
       <w:r>
         <w:rPr>
@@ -1810,25 +1792,7 @@
         </w:tabs>
       </w:pPr>
       <w:r>
-        <w:t xml:space="preserve">        3.2.1. Çevrim dışı sokak modu senaryosu</w:t>
-      </w:r>
-      <w:r>
-        <w:rPr>
-          <w:rFonts w:ascii="Times New Roman" w:hAnsi="Times New Roman"/>
-        </w:rPr>
-        <w:tab/>
-        <w:t>25</w:t>
-      </w:r>
-    </w:p>
-    <w:p>
-      <w:pPr>
-        <w:pStyle w:val="AnaParagrafYaziStiliSau"/>
-        <w:tabs>
-          <w:tab w:pos="8220" w:val="right" w:leader="dot"/>
-        </w:tabs>
-      </w:pPr>
-      <w:r>
-        <w:t xml:space="preserve">        3.2.2. Çevrim dışı iç mekan modu senaryosu</w:t>
+        <w:t xml:space="preserve">    2.13. Yapay Zekâ Model Seçiminin Gerekçesi ve Karşılaştırmalı Analizi</w:t>
       </w:r>
       <w:r>
         <w:rPr>
@@ -1846,7 +1810,7 @@
         </w:tabs>
       </w:pPr>
       <w:r>
-        <w:t xml:space="preserve">        3.2.3. Çevrim içi navigasyon senaryosu</w:t>
+        <w:t xml:space="preserve">        2.13.1. COCO veri kümesinin görme engelli navigasyon için değerlendirilmesi</w:t>
       </w:r>
       <w:r>
         <w:rPr>
@@ -1864,7 +1828,7 @@
         </w:tabs>
       </w:pPr>
       <w:r>
-        <w:t xml:space="preserve">    3.3. Sanal Laboratuvar Ortamı</w:t>
+        <w:t xml:space="preserve">        2.13.2. Gelecek model yükseltme yol haritası</w:t>
       </w:r>
       <w:r>
         <w:rPr>
@@ -1882,7 +1846,7 @@
         </w:tabs>
       </w:pPr>
       <w:r>
-        <w:t xml:space="preserve">    3.4. Test Aşaması ve Değerlendirme Kriterleri</w:t>
+        <w:t>BÖLÜM 3. DENEY DÜZENEĞİ VE SANAL LABORATUVAR</w:t>
       </w:r>
       <w:r>
         <w:rPr>
@@ -1900,7 +1864,25 @@
         </w:tabs>
       </w:pPr>
       <w:r>
-        <w:t xml:space="preserve">    3.5. Performans Ölçümleri</w:t>
+        <w:t xml:space="preserve">    3.1. Deney Düzeneği</w:t>
+      </w:r>
+      <w:r>
+        <w:rPr>
+          <w:rFonts w:ascii="Times New Roman" w:hAnsi="Times New Roman"/>
+        </w:rPr>
+        <w:tab/>
+        <w:t>29</w:t>
+      </w:r>
+    </w:p>
+    <w:p>
+      <w:pPr>
+        <w:pStyle w:val="AnaParagrafYaziStiliSau"/>
+        <w:tabs>
+          <w:tab w:pos="8220" w:val="right" w:leader="dot"/>
+        </w:tabs>
+      </w:pPr>
+      <w:r>
+        <w:t xml:space="preserve">    3.2. Deney Senaryoları</w:t>
       </w:r>
       <w:r>
         <w:rPr>
@@ -1918,7 +1900,25 @@
         </w:tabs>
       </w:pPr>
       <w:r>
-        <w:t xml:space="preserve">    3.6. Deneysel Bulguların Tartışılması</w:t>
+        <w:t xml:space="preserve">        3.2.1. Çevrim dışı sokak modu senaryosu</w:t>
+      </w:r>
+      <w:r>
+        <w:rPr>
+          <w:rFonts w:ascii="Times New Roman" w:hAnsi="Times New Roman"/>
+        </w:rPr>
+        <w:tab/>
+        <w:t>30</w:t>
+      </w:r>
+    </w:p>
+    <w:p>
+      <w:pPr>
+        <w:pStyle w:val="AnaParagrafYaziStiliSau"/>
+        <w:tabs>
+          <w:tab w:pos="8220" w:val="right" w:leader="dot"/>
+        </w:tabs>
+      </w:pPr>
+      <w:r>
+        <w:t xml:space="preserve">        3.2.2. Çevrim dışı iç mekan modu senaryosu</w:t>
       </w:r>
       <w:r>
         <w:rPr>
@@ -1936,7 +1936,7 @@
         </w:tabs>
       </w:pPr>
       <w:r>
-        <w:t xml:space="preserve">    3.7. Geçerlilik Tehditleri ve Sınırlılıklar</w:t>
+        <w:t xml:space="preserve">        3.2.3. Çevrim içi navigasyon senaryosu</w:t>
       </w:r>
       <w:r>
         <w:rPr>
@@ -1954,7 +1954,7 @@
         </w:tabs>
       </w:pPr>
       <w:r>
-        <w:t xml:space="preserve">    3.8. İş Paketleri ve Zaman Planı</w:t>
+        <w:t xml:space="preserve">    3.3. Sanal Laboratuvar Ortamı</w:t>
       </w:r>
       <w:r>
         <w:rPr>
@@ -1972,7 +1972,7 @@
         </w:tabs>
       </w:pPr>
       <w:r>
-        <w:t>BÖLÜM 4. VERİ GÜVENLİĞİ DEĞERLENDİRMESİ</w:t>
+        <w:t xml:space="preserve">    3.4. Test Aşaması ve Değerlendirme Kriterleri</w:t>
       </w:r>
       <w:r>
         <w:rPr>
@@ -1990,25 +1990,7 @@
         </w:tabs>
       </w:pPr>
       <w:r>
-        <w:t xml:space="preserve">    4.1. Toplanan Veri Türleri ve Güvenlik Düzeyleri</w:t>
-      </w:r>
-      <w:r>
-        <w:rPr>
-          <w:rFonts w:ascii="Times New Roman" w:hAnsi="Times New Roman"/>
-        </w:rPr>
-        <w:tab/>
-        <w:t>34</w:t>
-      </w:r>
-    </w:p>
-    <w:p>
-      <w:pPr>
-        <w:pStyle w:val="AnaParagrafYaziStiliSau"/>
-        <w:tabs>
-          <w:tab w:pos="8220" w:val="right" w:leader="dot"/>
-        </w:tabs>
-      </w:pPr>
-      <w:r>
-        <w:t xml:space="preserve">    4.2. Veri İşleme Süreci ve Gizlilik Yaklaşımı</w:t>
+        <w:t xml:space="preserve">    3.5. Performans Ölçümleri</w:t>
       </w:r>
       <w:r>
         <w:rPr>
@@ -2026,25 +2008,7 @@
         </w:tabs>
       </w:pPr>
       <w:r>
-        <w:t xml:space="preserve">    4.3. Veri İletimi ve Ağ Güvenliği</w:t>
-      </w:r>
-      <w:r>
-        <w:rPr>
-          <w:rFonts w:ascii="Times New Roman" w:hAnsi="Times New Roman"/>
-        </w:rPr>
-        <w:tab/>
-        <w:t>35</w:t>
-      </w:r>
-    </w:p>
-    <w:p>
-      <w:pPr>
-        <w:pStyle w:val="AnaParagrafYaziStiliSau"/>
-        <w:tabs>
-          <w:tab w:pos="8220" w:val="right" w:leader="dot"/>
-        </w:tabs>
-      </w:pPr>
-      <w:r>
-        <w:t xml:space="preserve">    4.4. Mobil Uygulamalara Özgü Güvenlik Riskleri</w:t>
+        <w:t xml:space="preserve">    3.6. Deneysel Bulguların Tartışılması</w:t>
       </w:r>
       <w:r>
         <w:rPr>
@@ -2062,25 +2026,7 @@
         </w:tabs>
       </w:pPr>
       <w:r>
-        <w:t xml:space="preserve">    4.5. Hukuki ve Etik Değerlendirme</w:t>
-      </w:r>
-      <w:r>
-        <w:rPr>
-          <w:rFonts w:ascii="Times New Roman" w:hAnsi="Times New Roman"/>
-        </w:rPr>
-        <w:tab/>
-        <w:t>36</w:t>
-      </w:r>
-    </w:p>
-    <w:p>
-      <w:pPr>
-        <w:pStyle w:val="AnaParagrafYaziStiliSau"/>
-        <w:tabs>
-          <w:tab w:pos="8220" w:val="right" w:leader="dot"/>
-        </w:tabs>
-      </w:pPr>
-      <w:r>
-        <w:t xml:space="preserve">    4.6. Tehdit Modeli ve Saldırı Yüzeyi Analizi</w:t>
+        <w:t xml:space="preserve">    3.7. Geçerlilik Tehditleri ve Sınırlılıklar</w:t>
       </w:r>
       <w:r>
         <w:rPr>
@@ -2098,7 +2044,7 @@
         </w:tabs>
       </w:pPr>
       <w:r>
-        <w:t xml:space="preserve">    4.7. İzin Yönetimi ve Asgari Yetki İlkesi</w:t>
+        <w:t xml:space="preserve">    3.8. İş Paketleri ve Zaman Planı</w:t>
       </w:r>
       <w:r>
         <w:rPr>
@@ -2116,61 +2062,7 @@
         </w:tabs>
       </w:pPr>
       <w:r>
-        <w:t xml:space="preserve">    4.8. KVKK ve GDPR Perspektifi</w:t>
-      </w:r>
-      <w:r>
-        <w:rPr>
-          <w:rFonts w:ascii="Times New Roman" w:hAnsi="Times New Roman"/>
-        </w:rPr>
-        <w:tab/>
-        <w:t>38</w:t>
-      </w:r>
-    </w:p>
-    <w:p>
-      <w:pPr>
-        <w:pStyle w:val="AnaParagrafYaziStiliSau"/>
-        <w:tabs>
-          <w:tab w:pos="8220" w:val="right" w:leader="dot"/>
-        </w:tabs>
-      </w:pPr>
-      <w:r>
-        <w:t>BÖLÜM 5. SONUÇLAR VE ÖNERİLER</w:t>
-      </w:r>
-      <w:r>
-        <w:rPr>
-          <w:rFonts w:ascii="Times New Roman" w:hAnsi="Times New Roman"/>
-        </w:rPr>
-        <w:tab/>
-        <w:t>39</w:t>
-      </w:r>
-    </w:p>
-    <w:p>
-      <w:pPr>
-        <w:pStyle w:val="AnaParagrafYaziStiliSau"/>
-        <w:tabs>
-          <w:tab w:pos="8220" w:val="right" w:leader="dot"/>
-        </w:tabs>
-      </w:pPr>
-      <w:r>
-        <w:t xml:space="preserve">    5.1. Çalışmadan Elde Edilen Sonuçlar</w:t>
-      </w:r>
-      <w:r>
-        <w:rPr>
-          <w:rFonts w:ascii="Times New Roman" w:hAnsi="Times New Roman"/>
-        </w:rPr>
-        <w:tab/>
-        <w:t>39</w:t>
-      </w:r>
-    </w:p>
-    <w:p>
-      <w:pPr>
-        <w:pStyle w:val="AnaParagrafYaziStiliSau"/>
-        <w:tabs>
-          <w:tab w:pos="8220" w:val="right" w:leader="dot"/>
-        </w:tabs>
-      </w:pPr>
-      <w:r>
-        <w:t xml:space="preserve">    5.2. Akademik Katkılar</w:t>
+        <w:t xml:space="preserve">    3.9. Maliyet ve Enerji Analizi</w:t>
       </w:r>
       <w:r>
         <w:rPr>
@@ -2188,7 +2080,7 @@
         </w:tabs>
       </w:pPr>
       <w:r>
-        <w:t xml:space="preserve">    5.3. Sınırlılıklar</w:t>
+        <w:t xml:space="preserve">        3.9.1. Geliştirme maliyet analizi</w:t>
       </w:r>
       <w:r>
         <w:rPr>
@@ -2206,7 +2098,7 @@
         </w:tabs>
       </w:pPr>
       <w:r>
-        <w:t xml:space="preserve">    5.4. Gelecek Çalışmalar İçin Öneriler</w:t>
+        <w:t xml:space="preserve">        3.9.2. Enerji tüketimi analizi</w:t>
       </w:r>
       <w:r>
         <w:rPr>
@@ -2224,43 +2116,7 @@
         </w:tabs>
       </w:pPr>
       <w:r>
-        <w:t xml:space="preserve">    5.5. MVP Çıktılarının Değerlendirilmesi</w:t>
-      </w:r>
-      <w:r>
-        <w:rPr>
-          <w:rFonts w:ascii="Times New Roman" w:hAnsi="Times New Roman"/>
-        </w:rPr>
-        <w:tab/>
-        <w:t>42</w:t>
-      </w:r>
-    </w:p>
-    <w:p>
-      <w:pPr>
-        <w:pStyle w:val="AnaParagrafYaziStiliSau"/>
-        <w:tabs>
-          <w:tab w:pos="8220" w:val="right" w:leader="dot"/>
-        </w:tabs>
-      </w:pPr>
-      <w:r>
-        <w:t xml:space="preserve">    5.6. Literatürle Kıyas ve Konumlandırma</w:t>
-      </w:r>
-      <w:r>
-        <w:rPr>
-          <w:rFonts w:ascii="Times New Roman" w:hAnsi="Times New Roman"/>
-        </w:rPr>
-        <w:tab/>
-        <w:t>42</w:t>
-      </w:r>
-    </w:p>
-    <w:p>
-      <w:pPr>
-        <w:pStyle w:val="AnaParagrafYaziStiliSau"/>
-        <w:tabs>
-          <w:tab w:pos="8220" w:val="right" w:leader="dot"/>
-        </w:tabs>
-      </w:pPr>
-      <w:r>
-        <w:t xml:space="preserve">    5.7. Uygulanabilirlik ve Yaygın Etki</w:t>
+        <w:t>BÖLÜM 4. VERİ GÜVENLİĞİ DEĞERLENDİRMESİ</w:t>
       </w:r>
       <w:r>
         <w:rPr>
@@ -2278,7 +2134,25 @@
         </w:tabs>
       </w:pPr>
       <w:r>
-        <w:t>KAYNAKLAR</w:t>
+        <w:t xml:space="preserve">    4.1. Toplanan Veri Türleri ve Güvenlik Düzeyleri</w:t>
+      </w:r>
+      <w:r>
+        <w:rPr>
+          <w:rFonts w:ascii="Times New Roman" w:hAnsi="Times New Roman"/>
+        </w:rPr>
+        <w:tab/>
+        <w:t>43</w:t>
+      </w:r>
+    </w:p>
+    <w:p>
+      <w:pPr>
+        <w:pStyle w:val="AnaParagrafYaziStiliSau"/>
+        <w:tabs>
+          <w:tab w:pos="8220" w:val="right" w:leader="dot"/>
+        </w:tabs>
+      </w:pPr>
+      <w:r>
+        <w:t xml:space="preserve">    4.2. Veri İşleme Süreci ve Gizlilik Yaklaşımı</w:t>
       </w:r>
       <w:r>
         <w:rPr>
@@ -2296,7 +2170,61 @@
         </w:tabs>
       </w:pPr>
       <w:r>
-        <w:t>EK A. EKLER</w:t>
+        <w:t xml:space="preserve">    4.3. Veri İletimi ve Ağ Güvenliği</w:t>
+      </w:r>
+      <w:r>
+        <w:rPr>
+          <w:rFonts w:ascii="Times New Roman" w:hAnsi="Times New Roman"/>
+        </w:rPr>
+        <w:tab/>
+        <w:t>44</w:t>
+      </w:r>
+    </w:p>
+    <w:p>
+      <w:pPr>
+        <w:pStyle w:val="AnaParagrafYaziStiliSau"/>
+        <w:tabs>
+          <w:tab w:pos="8220" w:val="right" w:leader="dot"/>
+        </w:tabs>
+      </w:pPr>
+      <w:r>
+        <w:t xml:space="preserve">    4.4. Mobil Uygulamalara Özgü Güvenlik Riskleri</w:t>
+      </w:r>
+      <w:r>
+        <w:rPr>
+          <w:rFonts w:ascii="Times New Roman" w:hAnsi="Times New Roman"/>
+        </w:rPr>
+        <w:tab/>
+        <w:t>45</w:t>
+      </w:r>
+    </w:p>
+    <w:p>
+      <w:pPr>
+        <w:pStyle w:val="AnaParagrafYaziStiliSau"/>
+        <w:tabs>
+          <w:tab w:pos="8220" w:val="right" w:leader="dot"/>
+        </w:tabs>
+      </w:pPr>
+      <w:r>
+        <w:t xml:space="preserve">    4.5. Hukuki ve Etik Değerlendirme</w:t>
+      </w:r>
+      <w:r>
+        <w:rPr>
+          <w:rFonts w:ascii="Times New Roman" w:hAnsi="Times New Roman"/>
+        </w:rPr>
+        <w:tab/>
+        <w:t>45</w:t>
+      </w:r>
+    </w:p>
+    <w:p>
+      <w:pPr>
+        <w:pStyle w:val="AnaParagrafYaziStiliSau"/>
+        <w:tabs>
+          <w:tab w:pos="8220" w:val="right" w:leader="dot"/>
+        </w:tabs>
+      </w:pPr>
+      <w:r>
+        <w:t xml:space="preserve">    4.6. Tehdit Modeli ve Saldırı Yüzeyi Analizi</w:t>
       </w:r>
       <w:r>
         <w:rPr>
@@ -2314,7 +2242,43 @@
         </w:tabs>
       </w:pPr>
       <w:r>
-        <w:t>ÖZGEÇMİŞ</w:t>
+        <w:t xml:space="preserve">    4.7. İzin Yönetimi ve Asgari Yetki İlkesi</w:t>
+      </w:r>
+      <w:r>
+        <w:rPr>
+          <w:rFonts w:ascii="Times New Roman" w:hAnsi="Times New Roman"/>
+        </w:rPr>
+        <w:tab/>
+        <w:t>47</w:t>
+      </w:r>
+    </w:p>
+    <w:p>
+      <w:pPr>
+        <w:pStyle w:val="AnaParagrafYaziStiliSau"/>
+        <w:tabs>
+          <w:tab w:pos="8220" w:val="right" w:leader="dot"/>
+        </w:tabs>
+      </w:pPr>
+      <w:r>
+        <w:t xml:space="preserve">    4.8. KVKK ve GDPR Perspektifi</w:t>
+      </w:r>
+      <w:r>
+        <w:rPr>
+          <w:rFonts w:ascii="Times New Roman" w:hAnsi="Times New Roman"/>
+        </w:rPr>
+        <w:tab/>
+        <w:t>47</w:t>
+      </w:r>
+    </w:p>
+    <w:p>
+      <w:pPr>
+        <w:pStyle w:val="AnaParagrafYaziStiliSau"/>
+        <w:tabs>
+          <w:tab w:pos="8220" w:val="right" w:leader="dot"/>
+        </w:tabs>
+      </w:pPr>
+      <w:r>
+        <w:t xml:space="preserve">    4.9. Yazılım Güvenlik Testi ve Sızma Testi</w:t>
       </w:r>
       <w:r>
         <w:rPr>
@@ -2332,7 +2296,25 @@
         </w:tabs>
       </w:pPr>
       <w:r>
-        <w:t>BSM 498 DEĞERLENDİRME VE SÖZLÜ SINAV TUTANAĞI</w:t>
+        <w:t xml:space="preserve">        4.9.1. Statik kod analizi</w:t>
+      </w:r>
+      <w:r>
+        <w:rPr>
+          <w:rFonts w:ascii="Times New Roman" w:hAnsi="Times New Roman"/>
+        </w:rPr>
+        <w:tab/>
+        <w:t>48</w:t>
+      </w:r>
+    </w:p>
+    <w:p>
+      <w:pPr>
+        <w:pStyle w:val="AnaParagrafYaziStiliSau"/>
+        <w:tabs>
+          <w:tab w:pos="8220" w:val="right" w:leader="dot"/>
+        </w:tabs>
+      </w:pPr>
+      <w:r>
+        <w:t xml:space="preserve">        4.9.2. Ağ trafiği incelemesi</w:t>
       </w:r>
       <w:r>
         <w:rPr>
@@ -2343,6 +2325,312 @@
       </w:r>
     </w:p>
     <w:p>
+      <w:pPr>
+        <w:pStyle w:val="AnaParagrafYaziStiliSau"/>
+        <w:tabs>
+          <w:tab w:pos="8220" w:val="right" w:leader="dot"/>
+        </w:tabs>
+      </w:pPr>
+      <w:r>
+        <w:t xml:space="preserve">        4.9.3. Girdi doğrulama ve enjeksiyon testi</w:t>
+      </w:r>
+      <w:r>
+        <w:rPr>
+          <w:rFonts w:ascii="Times New Roman" w:hAnsi="Times New Roman"/>
+        </w:rPr>
+        <w:tab/>
+        <w:t>49</w:t>
+      </w:r>
+    </w:p>
+    <w:p>
+      <w:pPr>
+        <w:pStyle w:val="AnaParagrafYaziStiliSau"/>
+        <w:tabs>
+          <w:tab w:pos="8220" w:val="right" w:leader="dot"/>
+        </w:tabs>
+      </w:pPr>
+      <w:r>
+        <w:t xml:space="preserve">        4.9.4. Genel güvenlik değerlendirmesi</w:t>
+      </w:r>
+      <w:r>
+        <w:rPr>
+          <w:rFonts w:ascii="Times New Roman" w:hAnsi="Times New Roman"/>
+        </w:rPr>
+        <w:tab/>
+        <w:t>50</w:t>
+      </w:r>
+    </w:p>
+    <w:p>
+      <w:pPr>
+        <w:pStyle w:val="AnaParagrafYaziStiliSau"/>
+        <w:tabs>
+          <w:tab w:pos="8220" w:val="right" w:leader="dot"/>
+        </w:tabs>
+      </w:pPr>
+      <w:r>
+        <w:t>BÖLÜM 5. SONUÇLAR VE ÖNERİLER</w:t>
+      </w:r>
+      <w:r>
+        <w:rPr>
+          <w:rFonts w:ascii="Times New Roman" w:hAnsi="Times New Roman"/>
+        </w:rPr>
+        <w:tab/>
+        <w:t>51</w:t>
+      </w:r>
+    </w:p>
+    <w:p>
+      <w:pPr>
+        <w:pStyle w:val="AnaParagrafYaziStiliSau"/>
+        <w:tabs>
+          <w:tab w:pos="8220" w:val="right" w:leader="dot"/>
+        </w:tabs>
+      </w:pPr>
+      <w:r>
+        <w:t xml:space="preserve">    5.1. Çalışmadan Elde Edilen Sonuçlar</w:t>
+      </w:r>
+      <w:r>
+        <w:rPr>
+          <w:rFonts w:ascii="Times New Roman" w:hAnsi="Times New Roman"/>
+        </w:rPr>
+        <w:tab/>
+        <w:t>51</w:t>
+      </w:r>
+    </w:p>
+    <w:p>
+      <w:pPr>
+        <w:pStyle w:val="AnaParagrafYaziStiliSau"/>
+        <w:tabs>
+          <w:tab w:pos="8220" w:val="right" w:leader="dot"/>
+        </w:tabs>
+      </w:pPr>
+      <w:r>
+        <w:t xml:space="preserve">    5.2. Akademik Katkılar</w:t>
+      </w:r>
+      <w:r>
+        <w:rPr>
+          <w:rFonts w:ascii="Times New Roman" w:hAnsi="Times New Roman"/>
+        </w:rPr>
+        <w:tab/>
+        <w:t>52</w:t>
+      </w:r>
+    </w:p>
+    <w:p>
+      <w:pPr>
+        <w:pStyle w:val="AnaParagrafYaziStiliSau"/>
+        <w:tabs>
+          <w:tab w:pos="8220" w:val="right" w:leader="dot"/>
+        </w:tabs>
+      </w:pPr>
+      <w:r>
+        <w:t xml:space="preserve">    5.3. Sınırlılıklar</w:t>
+      </w:r>
+      <w:r>
+        <w:rPr>
+          <w:rFonts w:ascii="Times New Roman" w:hAnsi="Times New Roman"/>
+        </w:rPr>
+        <w:tab/>
+        <w:t>52</w:t>
+      </w:r>
+    </w:p>
+    <w:p>
+      <w:pPr>
+        <w:pStyle w:val="AnaParagrafYaziStiliSau"/>
+        <w:tabs>
+          <w:tab w:pos="8220" w:val="right" w:leader="dot"/>
+        </w:tabs>
+      </w:pPr>
+      <w:r>
+        <w:t xml:space="preserve">    5.4. Gelecek Çalışmalar İçin Öneriler</w:t>
+      </w:r>
+      <w:r>
+        <w:rPr>
+          <w:rFonts w:ascii="Times New Roman" w:hAnsi="Times New Roman"/>
+        </w:rPr>
+        <w:tab/>
+        <w:t>53</w:t>
+      </w:r>
+    </w:p>
+    <w:p>
+      <w:pPr>
+        <w:pStyle w:val="AnaParagrafYaziStiliSau"/>
+        <w:tabs>
+          <w:tab w:pos="8220" w:val="right" w:leader="dot"/>
+        </w:tabs>
+      </w:pPr>
+      <w:r>
+        <w:t xml:space="preserve">    5.5. MVP Çıktılarının Değerlendirilmesi</w:t>
+      </w:r>
+      <w:r>
+        <w:rPr>
+          <w:rFonts w:ascii="Times New Roman" w:hAnsi="Times New Roman"/>
+        </w:rPr>
+        <w:tab/>
+        <w:t>54</w:t>
+      </w:r>
+    </w:p>
+    <w:p>
+      <w:pPr>
+        <w:pStyle w:val="AnaParagrafYaziStiliSau"/>
+        <w:tabs>
+          <w:tab w:pos="8220" w:val="right" w:leader="dot"/>
+        </w:tabs>
+      </w:pPr>
+      <w:r>
+        <w:t xml:space="preserve">    5.6. Literatürle Kıyas ve Konumlandırma</w:t>
+      </w:r>
+      <w:r>
+        <w:rPr>
+          <w:rFonts w:ascii="Times New Roman" w:hAnsi="Times New Roman"/>
+        </w:rPr>
+        <w:tab/>
+        <w:t>54</w:t>
+      </w:r>
+    </w:p>
+    <w:p>
+      <w:pPr>
+        <w:pStyle w:val="AnaParagrafYaziStiliSau"/>
+        <w:tabs>
+          <w:tab w:pos="8220" w:val="right" w:leader="dot"/>
+        </w:tabs>
+      </w:pPr>
+      <w:r>
+        <w:t xml:space="preserve">    5.7. Uygulanabilirlik ve Yaygın Etki</w:t>
+      </w:r>
+      <w:r>
+        <w:rPr>
+          <w:rFonts w:ascii="Times New Roman" w:hAnsi="Times New Roman"/>
+        </w:rPr>
+        <w:tab/>
+        <w:t>55</w:t>
+      </w:r>
+    </w:p>
+    <w:p>
+      <w:pPr>
+        <w:pStyle w:val="AnaParagrafYaziStiliSau"/>
+        <w:tabs>
+          <w:tab w:pos="8220" w:val="right" w:leader="dot"/>
+        </w:tabs>
+      </w:pPr>
+      <w:r>
+        <w:t xml:space="preserve">    5.8. Değişiklik Yönetimi</w:t>
+      </w:r>
+      <w:r>
+        <w:rPr>
+          <w:rFonts w:ascii="Times New Roman" w:hAnsi="Times New Roman"/>
+        </w:rPr>
+        <w:tab/>
+        <w:t>56</w:t>
+      </w:r>
+    </w:p>
+    <w:p>
+      <w:pPr>
+        <w:pStyle w:val="AnaParagrafYaziStiliSau"/>
+        <w:tabs>
+          <w:tab w:pos="8220" w:val="right" w:leader="dot"/>
+        </w:tabs>
+      </w:pPr>
+      <w:r>
+        <w:t xml:space="preserve">    5.9. Mühendislik Standartları</w:t>
+      </w:r>
+      <w:r>
+        <w:rPr>
+          <w:rFonts w:ascii="Times New Roman" w:hAnsi="Times New Roman"/>
+        </w:rPr>
+        <w:tab/>
+        <w:t>58</w:t>
+      </w:r>
+    </w:p>
+    <w:p>
+      <w:pPr>
+        <w:pStyle w:val="AnaParagrafYaziStiliSau"/>
+        <w:tabs>
+          <w:tab w:pos="8220" w:val="right" w:leader="dot"/>
+        </w:tabs>
+      </w:pPr>
+      <w:r>
+        <w:t xml:space="preserve">    5.10. Ticaretleşme Planı</w:t>
+      </w:r>
+      <w:r>
+        <w:rPr>
+          <w:rFonts w:ascii="Times New Roman" w:hAnsi="Times New Roman"/>
+        </w:rPr>
+        <w:tab/>
+        <w:t>61</w:t>
+      </w:r>
+    </w:p>
+    <w:p>
+      <w:pPr>
+        <w:pStyle w:val="AnaParagrafYaziStiliSau"/>
+        <w:tabs>
+          <w:tab w:pos="8220" w:val="right" w:leader="dot"/>
+        </w:tabs>
+      </w:pPr>
+      <w:r>
+        <w:t>KAYNAKLAR</w:t>
+      </w:r>
+      <w:r>
+        <w:rPr>
+          <w:rFonts w:ascii="Times New Roman" w:hAnsi="Times New Roman"/>
+        </w:rPr>
+        <w:tab/>
+        <w:t>65</w:t>
+      </w:r>
+    </w:p>
+    <w:p>
+      <w:pPr>
+        <w:pStyle w:val="AnaParagrafYaziStiliSau"/>
+        <w:tabs>
+          <w:tab w:pos="8220" w:val="right" w:leader="dot"/>
+        </w:tabs>
+      </w:pPr>
+      <w:r>
+        <w:t>EK A. EKLER</w:t>
+      </w:r>
+      <w:r>
+        <w:rPr>
+          <w:rFonts w:ascii="Times New Roman" w:hAnsi="Times New Roman"/>
+        </w:rPr>
+        <w:tab/>
+        <w:t>67</w:t>
+      </w:r>
+    </w:p>
+    <w:p>
+      <w:pPr>
+        <w:pStyle w:val="AnaParagrafYaziStiliSau"/>
+        <w:tabs>
+          <w:tab w:pos="8220" w:val="right" w:leader="dot"/>
+        </w:tabs>
+      </w:pPr>
+      <w:r>
+        <w:t>ÖZGEÇMİŞ</w:t>
+      </w:r>
+      <w:r>
+        <w:rPr>
+          <w:rFonts w:ascii="Times New Roman" w:hAnsi="Times New Roman"/>
+        </w:rPr>
+        <w:tab/>
+        <w:t>71</w:t>
+      </w:r>
+    </w:p>
+    <w:p>
+      <w:pPr>
+        <w:pStyle w:val="AnaParagrafYaziStiliSau"/>
+        <w:tabs>
+          <w:tab w:pos="8220" w:val="right" w:leader="dot"/>
+        </w:tabs>
+      </w:pPr>
+      <w:r>
+        <w:t>BSM 498 DEĞERLENDİRME VE SÖZLÜ SINAV TUTANAĞI</w:t>
+      </w:r>
+      <w:r>
+        <w:rPr>
+          <w:rFonts w:ascii="Times New Roman" w:hAnsi="Times New Roman"/>
+        </w:rPr>
+        <w:tab/>
+        <w:t>72</w:t>
+      </w:r>
+    </w:p>
+    <w:p>
       <w:r>
         <w:br w:type="page"/>
       </w:r>
@@ -3176,7 +3464,7 @@
       </w:r>
       <w:r>
         <w:tab/>
-        <w:t>16</w:t>
+        <w:t>18</w:t>
       </w:r>
     </w:p>
     <w:p>
@@ -3194,7 +3482,7 @@
       </w:r>
       <w:r>
         <w:tab/>
-        <w:t>18</w:t>
+        <w:t>19</w:t>
       </w:r>
     </w:p>
     <w:p>
@@ -3205,14 +3493,14 @@
         </w:tabs>
       </w:pPr>
       <w:r>
-        <w:t xml:space="preserve">Tablo 3.1. </w:t>
-      </w:r>
-      <w:r>
-        <w:t>Ortam bazlı algılama performansı</w:t>
+        <w:t xml:space="preserve">Tablo 2.4. </w:t>
+      </w:r>
+      <w:r>
+        <w:t>Donanım yapılandırma ve platform gereksinimleri</w:t>
       </w:r>
       <w:r>
         <w:tab/>
-        <w:t>30</w:t>
+        <w:t>14</w:t>
       </w:r>
     </w:p>
     <w:p>
@@ -3223,14 +3511,14 @@
         </w:tabs>
       </w:pPr>
       <w:r>
-        <w:t xml:space="preserve">Tablo 3.2. </w:t>
-      </w:r>
-      <w:r>
-        <w:t>Ekip sorumlulukları</w:t>
+        <w:t xml:space="preserve">Tablo 2.5. </w:t>
+      </w:r>
+      <w:r>
+        <w:t>AsyncStorage anahtar-değer şeması</w:t>
       </w:r>
       <w:r>
         <w:tab/>
-        <w:t>33</w:t>
+        <w:t>15</w:t>
       </w:r>
     </w:p>
     <w:p>
@@ -3241,14 +3529,14 @@
         </w:tabs>
       </w:pPr>
       <w:r>
-        <w:t xml:space="preserve">Tablo 4.1. </w:t>
-      </w:r>
-      <w:r>
-        <w:t>İzin, veri ve amaç eşlemesi</w:t>
+        <w:t xml:space="preserve">Tablo 2.6. </w:t>
+      </w:r>
+      <w:r>
+        <w:t>Aday modeller karşılaştırması</w:t>
       </w:r>
       <w:r>
         <w:tab/>
-        <w:t>38</w:t>
+        <w:t>26</w:t>
       </w:r>
     </w:p>
     <w:p>
@@ -3259,14 +3547,14 @@
         </w:tabs>
       </w:pPr>
       <w:r>
-        <w:t xml:space="preserve">Tablo 5.1. </w:t>
-      </w:r>
-      <w:r>
-        <w:t>Görme engelli mobil sistemler karşılaştırması</w:t>
+        <w:t xml:space="preserve">Tablo 3.1. </w:t>
+      </w:r>
+      <w:r>
+        <w:t>Ortam bazlı algılama performansı</w:t>
       </w:r>
       <w:r>
         <w:tab/>
-        <w:t>42</w:t>
+        <w:t>35</w:t>
       </w:r>
     </w:p>
     <w:p>
@@ -3277,14 +3565,140 @@
         </w:tabs>
       </w:pPr>
       <w:r>
-        <w:t xml:space="preserve">Tablo 5.2. </w:t>
-      </w:r>
-      <w:r>
-        <w:t>Karşılaşılan sorunlar ve çözümleri</w:t>
+        <w:t xml:space="preserve">Tablo 3.2. </w:t>
+      </w:r>
+      <w:r>
+        <w:t>Ekip sorumlulukları</w:t>
+      </w:r>
+      <w:r>
+        <w:tab/>
+        <w:t>38</w:t>
+      </w:r>
+    </w:p>
+    <w:p>
+      <w:pPr>
+        <w:pStyle w:val="AnaParagrafYaziStiliSau"/>
+        <w:tabs>
+          <w:tab w:pos="8220" w:val="right" w:leader="dot"/>
+        </w:tabs>
+      </w:pPr>
+      <w:r>
+        <w:t xml:space="preserve">Tablo 3.3. </w:t>
+      </w:r>
+      <w:r>
+        <w:t>İş-zaman çizelgesi (Gantt)</w:t>
+      </w:r>
+      <w:r>
+        <w:tab/>
+        <w:t>39</w:t>
+      </w:r>
+    </w:p>
+    <w:p>
+      <w:pPr>
+        <w:pStyle w:val="AnaParagrafYaziStiliSau"/>
+        <w:tabs>
+          <w:tab w:pos="8220" w:val="right" w:leader="dot"/>
+        </w:tabs>
+      </w:pPr>
+      <w:r>
+        <w:t xml:space="preserve">Tablo 3.4. </w:t>
+      </w:r>
+      <w:r>
+        <w:t>Geliştirme maliyet analizi</w:t>
+      </w:r>
+      <w:r>
+        <w:tab/>
+        <w:t>40</w:t>
+      </w:r>
+    </w:p>
+    <w:p>
+      <w:pPr>
+        <w:pStyle w:val="AnaParagrafYaziStiliSau"/>
+        <w:tabs>
+          <w:tab w:pos="8220" w:val="right" w:leader="dot"/>
+        </w:tabs>
+      </w:pPr>
+      <w:r>
+        <w:t xml:space="preserve">Tablo 3.5. </w:t>
+      </w:r>
+      <w:r>
+        <w:t>Çalışma durumuna göre enerji tüketimi</w:t>
       </w:r>
       <w:r>
         <w:tab/>
         <w:t>41</w:t>
+      </w:r>
+    </w:p>
+    <w:p>
+      <w:pPr>
+        <w:pStyle w:val="AnaParagrafYaziStiliSau"/>
+        <w:tabs>
+          <w:tab w:pos="8220" w:val="right" w:leader="dot"/>
+        </w:tabs>
+      </w:pPr>
+      <w:r>
+        <w:t xml:space="preserve">Tablo 4.1. </w:t>
+      </w:r>
+      <w:r>
+        <w:t>İzin, veri ve amaç eşlemesi</w:t>
+      </w:r>
+      <w:r>
+        <w:tab/>
+        <w:t>43</w:t>
+      </w:r>
+    </w:p>
+    <w:p>
+      <w:pPr>
+        <w:pStyle w:val="AnaParagrafYaziStiliSau"/>
+        <w:tabs>
+          <w:tab w:pos="8220" w:val="right" w:leader="dot"/>
+        </w:tabs>
+      </w:pPr>
+      <w:r>
+        <w:t xml:space="preserve">Tablo 4.2. </w:t>
+      </w:r>
+      <w:r>
+        <w:t>Güvenlik testi bulguları özeti</w:t>
+      </w:r>
+      <w:r>
+        <w:tab/>
+        <w:t>49</w:t>
+      </w:r>
+    </w:p>
+    <w:p>
+      <w:pPr>
+        <w:pStyle w:val="AnaParagrafYaziStiliSau"/>
+        <w:tabs>
+          <w:tab w:pos="8220" w:val="right" w:leader="dot"/>
+        </w:tabs>
+      </w:pPr>
+      <w:r>
+        <w:t xml:space="preserve">Tablo 5.1. </w:t>
+      </w:r>
+      <w:r>
+        <w:t>Görme engelli mobil sistemler karşılaştırması</w:t>
+      </w:r>
+      <w:r>
+        <w:tab/>
+        <w:t>54</w:t>
+      </w:r>
+    </w:p>
+    <w:p>
+      <w:pPr>
+        <w:pStyle w:val="AnaParagrafYaziStiliSau"/>
+        <w:tabs>
+          <w:tab w:pos="8220" w:val="right" w:leader="dot"/>
+        </w:tabs>
+      </w:pPr>
+      <w:r>
+        <w:t xml:space="preserve">Tablo 5.2. </w:t>
+      </w:r>
+      <w:r>
+        <w:t>Karşılaşılan sorunlar ve çözümleri</w:t>
+      </w:r>
+      <w:r>
+        <w:tab/>
+        <w:t>53</w:t>
       </w:r>
     </w:p>
     <w:p>
@@ -3323,7 +3737,7 @@
         <w:pStyle w:val="OzetYaziStiliSau"/>
       </w:pPr>
       <w:r>
-        <w:t>Bu bitirme çalışmasında, görme engelli ve az gören bireylerin çevresel farkındalığını artırmayı ve hedef yönlendirme ihtiyacını karşılamayı amaçlayan, gerçek zamanlı çalışan bir mobil rehber uygulamasının tasarımı ve geliştirilmesi ele alınmıştır. Geliştirilen VisionAssist uygulaması, mobil cihazın arka kamerasından alınan görüntüleri TensorFlow Lite üzerinde çalışan bir SSD MobileNet nesne tanıma modeline ileterek tespit edilen nesnelerin sınıfını, yönünü ve mesafesini Türkçe sözel ifadelere dönüştürmekte; eş zamanlı olarak OpenStreetMap tabanlı OSRM ve Nominatim servisleri üzerinden kullanıcıyı seçtiği bir hedefe adım adım yönlendirmektedir.</w:t>
+        <w:t>Bu bitirme çalışmasında, görme engelli ve az gören bireylerin çevresel farkındalığını artırmayı ve hedef yönlendirme ihtiyacını karşılamayı amaçlayan, gerçek zamanlı çalışan bir mobil rehber uygulamasının tasarımı ve geliştirilmesi ele alınmıştır. Geliştirilen VisionAssist uygulaması, mobil cihazın arka kamerasından alınan görüntüleri TensorFlow Lite üzerinde çalışan EfficientDet-Lite1 nesne tanıma modeline ileterek tespit edilen nesnelerin sınıfını, yönünü ve mesafesini Türkçe sözel ifadelere dönüştürmekte; eş zamanlı olarak OpenStreetMap tabanlı OSRM ve Nominatim servisleri üzerinden kullanıcıyı seçtiği bir hedefe adım adım yönlendirmektedir.</w:t>
       </w:r>
     </w:p>
     <w:p>
@@ -17756,7 +18170,7 @@
         <w:pStyle w:val="AnaParagrafYaziStiliSau"/>
       </w:pPr>
       <w:r>
-        <w:t>1995 yılında doğdu. Lise eğitimini tamamladıktan sonra 2022 yılında Sakarya Üniversitesi Bilgisayar ve Bilişim Bilimleri Fakültesi Bilgisayar Mühendisliği bölümüne başlamıştır. Lisans öğrenimi süresince mobil uygulama geliştirme, yapay zekâ ve insan-bilgisayar etkileşimi alanlarında çalışmalar yapmıştır. Bu bitirme çalışmasında; sistem mimarisi tasarımı, yapay zekâ modeli entegrasyonu, frame processor optimizasyonu, navigasyon servisi entegrasyonu ile test ve performans ölçümleri sorumluluklarını üstlenmiştir.</w:t>
+        <w:t>2004 yılında doğdu. Lise eğitimini tamamladıktan sonra 2022 yılında Sakarya Üniversitesi Bilgisayar ve Bilişim Bilimleri Fakültesi Bilgisayar Mühendisliği bölümüne başlamıştır. Lisans öğrenimi süresince mobil uygulama geliştirme, yapay zekâ ve insan-bilgisayar etkileşimi alanlarında çalışmalar yapmıştır. Bu bitirme çalışmasında; sistem mimarisi tasarımı, yapay zekâ modeli entegrasyonu, frame processor optimizasyonu, navigasyon servisi entegrasyonu ile test ve performans ölçümleri sorumluluklarını üstlenmiştir.</w:t>
       </w:r>
     </w:p>
     <w:p>
@@ -17782,7 +18196,7 @@
         <w:pStyle w:val="AnaParagrafYaziStiliSau"/>
       </w:pPr>
       <w:r>
-        <w:t>1996 yılında doğdu. Lise eğitimini tamamladıktan sonra 2022 yılında Sakarya Üniversitesi Bilgisayar ve Bilişim Bilimleri Fakültesi Bilgisayar Mühendisliği bölümüne başlamıştır. Lisans öğrenimi süresince erişilebilir yazılım geliştirme, kullanıcı deneyimi tasarımı ve bulut teknolojileri alanlarında çalışmalar yapmıştır. Bu bitirme çalışmasında; erişilebilirlik analizi, kullanıcı arayüzü ve hedef seçim ekranı tasarımı, sesli geri bildirim mantığı ve dokümantasyon sorumluluklarını üstlenmiştir.</w:t>
+        <w:t>2004 yılında doğdu. Lise eğitimini tamamladıktan sonra 2022 yılında Sakarya Üniversitesi Bilgisayar ve Bilişim Bilimleri Fakültesi Bilgisayar Mühendisliği bölümüne başlamıştır. Lisans öğrenimi süresince erişilebilir yazılım geliştirme, kullanıcı deneyimi tasarımı ve bulut teknolojileri alanlarında çalışmalar yapmıştır. Bu bitirme çalışmasında; erişilebilirlik analizi, kullanıcı arayüzü ve hedef seçim ekranı tasarımı, sesli geri bildirim mantığı ve dokümantasyon sorumluluklarını üstlenmiştir.</w:t>
       </w:r>
     </w:p>
     <w:p>

</xml_diff>